<commit_message>
fix: verificacion contra planos y correccion de cantidades (columnas 8u/2 tipos, viguetas 0.20x0.40, placa cubierta por area)
</commit_message>
<xml_diff>
--- a/Proyectos/Fundamentos-de-Construccion/EXPLICACION - Memoria de Calculo - Cantidades de Obra.docx
+++ b/Proyectos/Fundamentos-de-Construccion/EXPLICACION - Memoria de Calculo - Cantidades de Obra.docx
@@ -27,7 +27,7 @@
           <w:color w:val="404040"/>
           <w:sz w:val="26"/>
         </w:rPr>
-        <w:t>Explicación detallada del cálculo, origen de cada valor y planos de soporte</w:t>
+        <w:t>Explicación detallada, verificación contra planos y correcciones</w:t>
       </w:r>
     </w:p>
     <w:p>
@@ -55,12 +55,12 @@
           <w:i w:val="0"/>
           <w:sz w:val="22"/>
         </w:rPr>
-        <w:t>Asignatura: Fundamentos de Construcción – Universidad Nacional de Colombia</w:t>
+        <w:t>Fundamentos de Construcción – Universidad Nacional de Colombia</w:t>
       </w:r>
     </w:p>
     <w:p>
       <w:pPr>
-        <w:spacing w:after="40"/>
+        <w:spacing w:after="360"/>
         <w:jc w:val="center"/>
       </w:pPr>
       <w:r>
@@ -69,21 +69,7 @@
           <w:i w:val="0"/>
           <w:sz w:val="22"/>
         </w:rPr>
-        <w:t>Etapa: Obra gris  |  Grupo 3</w:t>
-      </w:r>
-    </w:p>
-    <w:p>
-      <w:pPr>
-        <w:spacing w:after="360"/>
-        <w:jc w:val="center"/>
-      </w:pPr>
-      <w:r>
-        <w:rPr>
-          <w:b w:val="0"/>
-          <w:i w:val="0"/>
-          <w:sz w:val="22"/>
-        </w:rPr>
-        <w:t>Norma de diseño: NSR-10  |  Sistema: Pórticos de concreto reforzado</w:t>
+        <w:t>Etapa: Obra gris  |  Grupo 3  |  Norma NSR-10  |  Pórticos de concreto reforzado</w:t>
       </w:r>
     </w:p>
     <w:p>
@@ -96,9 +82,9 @@
           <w:color w:val="404040"/>
           <w:sz w:val="21"/>
         </w:rPr>
-        <w:t>Este documento explica CÓMO se obtuvo cada cantidad del archivo</w:t>
+        <w:t>Cada cantidad se explica indicando de qué plano y de qué cota sale,</w:t>
         <w:br/>
-        <w:t>«MEMORIAS DE CALCULO.xlsx» y CUÁL plano usar como foto de referencia.</w:t>
+        <w:t>con la fórmula, el resultado y la verificación realizada contra los planos.</w:t>
       </w:r>
     </w:p>
     <w:p>
@@ -114,7 +100,7 @@
         <w:rPr>
           <w:color w:val="1F3B73"/>
         </w:rPr>
-        <w:t>1. Objetivo y alcance de este documento</w:t>
+        <w:t>1. Objetivo y alcance</w:t>
       </w:r>
     </w:p>
     <w:p>
@@ -127,7 +113,7 @@
           <w:i w:val="0"/>
           <w:sz w:val="22"/>
         </w:rPr>
-        <w:t>El objetivo de este documento es explicar, de forma clara y trazable, cómo se calcularon las cantidades de obra consignadas en el formato de memoria de cálculo del proyecto (archivo MEMORIAS DE CALCULO.xlsx). Para cada actividad se indica:</w:t>
+        <w:t>Este documento explica, de forma trazable, cómo se calcularon las cantidades de obra del proyecto (archivo MEMORIAS DE CALCULO.xlsx) y documenta la verificación de cada dimensión contra los planos entregados. Para cada actividad se indica:</w:t>
       </w:r>
     </w:p>
     <w:p>
@@ -141,7 +127,7 @@
         <w:t xml:space="preserve">Actividad e ítem: </w:t>
       </w:r>
       <w:r>
-        <w:t>qué se está midiendo y en qué unidad;</w:t>
+        <w:t>qué se mide y en qué unidad;</w:t>
       </w:r>
     </w:p>
     <w:p>
@@ -155,7 +141,7 @@
         <w:t xml:space="preserve">Origen del valor: </w:t>
       </w:r>
       <w:r>
-        <w:t>de qué plano y de qué cota sale cada dimensión (el soporte gráfico);</w:t>
+        <w:t>de qué plano y de qué cota sale cada dimensión;</w:t>
       </w:r>
     </w:p>
     <w:p>
@@ -169,7 +155,7 @@
         <w:t xml:space="preserve">Cálculo: </w:t>
       </w:r>
       <w:r>
-        <w:t>la fórmula geométrica aplicada y el resultado;</w:t>
+        <w:t>la fórmula geométrica y el resultado;</w:t>
       </w:r>
     </w:p>
     <w:p>
@@ -183,7 +169,18 @@
         <w:t xml:space="preserve">Foto de referencia: </w:t>
       </w:r>
       <w:r>
-        <w:t>cuál imagen/plano debe pegarse en la celda «IMAGEN/REFERENCIA» del formato.</w:t>
+        <w:t>qué imagen/plano pegar en la casilla «IMAGEN/REFERENCIA» del formato.</w:t>
+      </w:r>
+    </w:p>
+    <w:p>
+      <w:pPr>
+        <w:pStyle w:val="Heading1"/>
+      </w:pPr>
+      <w:r>
+        <w:rPr>
+          <w:color w:val="1F3B73"/>
+        </w:rPr>
+        <w:t>2. Metodología general de cálculo</w:t>
       </w:r>
     </w:p>
     <w:p>
@@ -196,31 +193,7 @@
           <w:i w:val="0"/>
           <w:sz w:val="22"/>
         </w:rPr>
-        <w:t>El proyecto corresponde a la etapa de obra gris del Módulo 1 de un colegio, estructurado en pórticos de concreto reforzado con cimentación superficial (zapatas aisladas y vigas de cimentación), placa de contrapiso, columnas, vigas y placa de cubierta aligerada, muros de mampostería confinada y piso en adoquín.</w:t>
-      </w:r>
-    </w:p>
-    <w:p>
-      <w:pPr>
-        <w:pStyle w:val="Heading1"/>
-      </w:pPr>
-      <w:r>
-        <w:rPr>
-          <w:color w:val="1F3B73"/>
-        </w:rPr>
-        <w:t>2. Metodología general de cálculo de cantidades</w:t>
-      </w:r>
-    </w:p>
-    <w:p>
-      <w:pPr>
-        <w:spacing w:after="120"/>
-      </w:pPr>
-      <w:r>
-        <w:rPr>
-          <w:b w:val="0"/>
-          <w:i w:val="0"/>
-          <w:sz w:val="22"/>
-        </w:rPr>
-        <w:t>Las cantidades de obra son la medición de cada actividad expresada en su unidad de pago. Toda la memoria se apoya en una tabla común con cuatro datos por renglón: Ancho, Alto (o espesor), Largo y Cantidad (número de elementos iguales). El total de cada renglón se obtiene multiplicando esos cuatro campos:</w:t>
+        <w:t>Las cantidades de obra son la medición de cada actividad en su unidad de pago. El formato usa cuatro datos por renglón: Ancho, Alto (o espesor), Largo y Cantidad. El total del renglón es el producto de esos cuatro campos:</w:t>
       </w:r>
     </w:p>
     <w:p>
@@ -246,7 +219,7 @@
           <w:i w:val="0"/>
           <w:sz w:val="22"/>
         </w:rPr>
-        <w:t>Según la unidad de la actividad, algunos campos se dejan en 1 para que la fórmula entregue la unidad correcta:</w:t>
+        <w:t>Según la unidad, algún campo se deja en 1 para que la fórmula entregue la unidad correcta:</w:t>
       </w:r>
     </w:p>
     <w:tbl>
@@ -288,7 +261,7 @@
           </w:tcPr>
           <w:p>
             <w:r>
-              <w:t>Cómo se arma la fórmula</w:t>
+              <w:t>Cómo se arma</w:t>
             </w:r>
           </w:p>
         </w:tc>
@@ -303,7 +276,7 @@
               <w:rPr>
                 <w:sz w:val="20"/>
               </w:rPr>
-              <w:t>M3 (volumen)</w:t>
+              <w:t>M3</w:t>
             </w:r>
           </w:p>
         </w:tc>
@@ -344,7 +317,7 @@
               <w:rPr>
                 <w:sz w:val="20"/>
               </w:rPr>
-              <w:t>M2 (área)</w:t>
+              <w:t>M2</w:t>
             </w:r>
           </w:p>
         </w:tc>
@@ -370,7 +343,7 @@
               <w:rPr>
                 <w:sz w:val="20"/>
               </w:rPr>
-              <w:t>un campo = 1 (se usa Área × Cantidad o Ancho × Largo)</w:t>
+              <w:t>un campo = 1 (Área × Cantidad o Ancho × Largo)</w:t>
             </w:r>
           </w:p>
         </w:tc>
@@ -385,7 +358,7 @@
               <w:rPr>
                 <w:sz w:val="20"/>
               </w:rPr>
-              <w:t>ML (longitud)</w:t>
+              <w:t>ML</w:t>
             </w:r>
           </w:p>
         </w:tc>
@@ -411,7 +384,7 @@
               <w:rPr>
                 <w:sz w:val="20"/>
               </w:rPr>
-              <w:t>Alto/Largo × Cantidad (Ancho = 1)</w:t>
+              <w:t>Largo × Cantidad (Ancho = 1)</w:t>
             </w:r>
           </w:p>
         </w:tc>
@@ -426,7 +399,7 @@
               <w:rPr>
                 <w:sz w:val="20"/>
               </w:rPr>
-              <w:t>KG (peso)</w:t>
+              <w:t>KG</w:t>
             </w:r>
           </w:p>
         </w:tc>
@@ -480,7 +453,7 @@
           <w:i w:val="0"/>
           <w:sz w:val="22"/>
         </w:rPr>
-        <w:t>Las dimensiones NO se inventan: se leen directamente de los planos arquitectónicos y estructurales. Por eso el formato pide una «IMAGEN/REFERENCIA»: es el pantallazo del plano donde se ve la cota que se usó. A continuación se listan los planos base.</w:t>
+        <w:t>Las dimensiones se leen de los planos; por eso el formato pide la «IMAGEN/REFERENCIA» (el pantallazo del plano donde se ve la cota usada).</w:t>
       </w:r>
     </w:p>
     <w:p>
@@ -491,20 +464,7 @@
         <w:rPr>
           <w:color w:val="1F3B73"/>
         </w:rPr>
-        <w:t>3. Planos de soporte (de aquí salen las dimensiones)</w:t>
-      </w:r>
-    </w:p>
-    <w:p>
-      <w:pPr>
-        <w:spacing w:after="120"/>
-      </w:pPr>
-      <w:r>
-        <w:rPr>
-          <w:b w:val="0"/>
-          <w:i w:val="0"/>
-          <w:sz w:val="22"/>
-        </w:rPr>
-        <w:t>Estas son las imágenes de los planos entregados. Cada actividad de la memoria indica más adelante cuál de ellos usar como foto de referencia.</w:t>
+        <w:t>3. Planos de soporte</w:t>
       </w:r>
     </w:p>
     <w:p>
@@ -558,7 +518,7 @@
           <w:color w:val="404040"/>
           <w:sz w:val="18"/>
         </w:rPr>
-        <w:t>Figura 3.1. Planta de cimentación: ejes, vigas VC-A/VC-B (0.40×0.45), zapatas Z-1 (2.30×2.30) y Z-2 (2.15×2.15), y placa de piso e=0.10.</w:t>
+        <w:t>Figura 3.1. Cimentación: ejes 6.00+6.60+5.80+1.40 = 19.80 m; transversal 7.30/7.70 m; vigas VC 0.40×0.45; zapatas Z-1 (2.30×2.30) y Z-2 (2.15×2.15); placa de piso e=0.10.</w:t>
       </w:r>
     </w:p>
     <w:p>
@@ -612,7 +572,7 @@
           <w:color w:val="404040"/>
           <w:sz w:val="18"/>
         </w:rPr>
-        <w:t>Figura 3.2. Planta y detalle de columnas: sección 0.40×0.40 m, altura libre 4.70–4.90 m, refuerzo 3#6 + estribos.</w:t>
+        <w:t>Figura 3.2. Columnas: dos tipos de columna (ver detalles ampliados en la Sección 4).</w:t>
       </w:r>
     </w:p>
     <w:p>
@@ -666,7 +626,7 @@
           <w:color w:val="404040"/>
           <w:sz w:val="18"/>
         </w:rPr>
-        <w:t>Figura 3.3. Placa de cubierta: losa aligerada e=0.08 m en N+4.90, vigas de cubierta VG (0.40×0.50).</w:t>
+        <w:t>Figura 3.3. Placa de cubierta: losa aligerada e=0.08 en N+4.90; vigas VG 0.40×0.50; viguetas 0.20×0.40.</w:t>
       </w:r>
     </w:p>
     <w:p>
@@ -720,7 +680,7 @@
           <w:color w:val="404040"/>
           <w:sz w:val="18"/>
         </w:rPr>
-        <w:t>Figura 3.4. Detalles de mampostería confinada (muros, columnetas y confinamiento).</w:t>
+        <w:t>Figura 3.4. Detalles de mampostería confinada.</w:t>
       </w:r>
     </w:p>
     <w:p>
@@ -730,7 +690,7 @@
       <w:r>
         <w:drawing>
           <wp:inline xmlns:a="http://schemas.openxmlformats.org/drawingml/2006/main" xmlns:pic="http://schemas.openxmlformats.org/drawingml/2006/picture">
-            <wp:extent cx="5400000" cy="3814679"/>
+            <wp:extent cx="5760000" cy="4069403"/>
             <wp:docPr id="5" name="Picture 5"/>
             <wp:cNvGraphicFramePr>
               <a:graphicFrameLocks noChangeAspect="1"/>
@@ -739,7 +699,7 @@
               <a:graphicData uri="http://schemas.openxmlformats.org/drawingml/2006/picture">
                 <pic:pic>
                   <pic:nvPicPr>
-                    <pic:cNvPr id="0" name="plano_arquitectonico.png"/>
+                    <pic:cNvPr id="0" name="arq_full_hi.png"/>
                     <pic:cNvPicPr/>
                   </pic:nvPicPr>
                   <pic:blipFill>
@@ -751,7 +711,7 @@
                   <pic:spPr>
                     <a:xfrm>
                       <a:off x="0" y="0"/>
-                      <a:ext cx="5400000" cy="3814679"/>
+                      <a:ext cx="5760000" cy="4069403"/>
                     </a:xfrm>
                     <a:prstGeom prst="rect"/>
                   </pic:spPr>
@@ -774,7 +734,7 @@
           <w:color w:val="404040"/>
           <w:sz w:val="18"/>
         </w:rPr>
-        <w:t>Figura 3.5. Planta arquitectónica con las áreas de cada espacio (base para el área de adoquín y de acabados).</w:t>
+        <w:t>Figura 3.5. Planta arquitectónica: ejes 1–4 y A–B y áreas de cada espacio (NO trae cotas totales).</w:t>
       </w:r>
     </w:p>
     <w:p>
@@ -790,12 +750,12 @@
         <w:rPr>
           <w:color w:val="1F3B73"/>
         </w:rPr>
-        <w:t>4. Cálculo detallado por actividad</w:t>
+        <w:t>4. Verificación contra planos y correcciones aplicadas</w:t>
       </w:r>
     </w:p>
     <w:p>
       <w:pPr>
-        <w:spacing w:after="120"/>
+        <w:spacing w:after="160"/>
       </w:pPr>
       <w:r>
         <w:rPr>
@@ -803,43 +763,7 @@
           <w:i w:val="0"/>
           <w:sz w:val="22"/>
         </w:rPr>
-        <w:t>Para cada ítem se muestra la actividad, el origen de las dimensiones, la fórmula y el resultado tal como está en la memoria de cálculo (MEMORIAS DE CALCULO.xlsx).</w:t>
-      </w:r>
-    </w:p>
-    <w:p>
-      <w:pPr>
-        <w:pStyle w:val="Heading2"/>
-      </w:pPr>
-      <w:r>
-        <w:rPr>
-          <w:color w:val="1F3B73"/>
-        </w:rPr>
-        <w:t>Capítulo 2 – Cimentación</w:t>
-      </w:r>
-    </w:p>
-    <w:p>
-      <w:pPr>
-        <w:pStyle w:val="Heading2"/>
-      </w:pPr>
-      <w:r>
-        <w:rPr>
-          <w:color w:val="1F3B73"/>
-        </w:rPr>
-        <w:t>Ítem 2.1.1 — Excavación a máquina conglomerado 0–2 m (incl. retiro)  (M3)</w:t>
-      </w:r>
-    </w:p>
-    <w:p>
-      <w:pPr>
-        <w:spacing w:after="80"/>
-      </w:pPr>
-      <w:r>
-        <w:rPr>
-          <w:b w:val="0"/>
-          <w:i/>
-          <w:color w:val="404040"/>
-          <w:sz w:val="20"/>
-        </w:rPr>
-        <w:t>Capítulo: 2. Cimentación</w:t>
+        <w:t>Se revisó cada dimensión de la memoria contra los planos. A continuación el resultado, separado en lo verificado, lo corregido y lo que debe confirmarse en el DWG.</w:t>
       </w:r>
     </w:p>
     <w:p>
@@ -850,39 +774,51 @@
         <w:rPr>
           <w:b/>
           <w:i w:val="0"/>
+          <w:color w:val="006600"/>
           <w:sz w:val="22"/>
         </w:rPr>
-        <w:t>Origen de cada valor (de dónde sale):</w:t>
+        <w:t>4.1  Valores VERIFICADOS (coinciden con el plano)</w:t>
       </w:r>
     </w:p>
     <w:tbl>
       <w:tblPr>
-        <w:tblStyle w:val="LightList-Accent1"/>
+        <w:tblStyle w:val="LightGrid-Accent1"/>
         <w:tblW w:type="auto" w:w="0"/>
         <w:tblLook w:firstColumn="1" w:firstRow="1" w:lastColumn="0" w:lastRow="0" w:noHBand="0" w:noVBand="1" w:val="04A0"/>
       </w:tblPr>
       <w:tblGrid>
-        <w:gridCol w:w="4320"/>
-        <w:gridCol w:w="4320"/>
+        <w:gridCol w:w="2880"/>
+        <w:gridCol w:w="2880"/>
+        <w:gridCol w:w="2880"/>
       </w:tblGrid>
       <w:tr>
         <w:tc>
           <w:tcPr>
-            <w:tcW w:type="dxa" w:w="4320"/>
+            <w:tcW w:type="dxa" w:w="2880"/>
           </w:tcPr>
           <w:p>
             <w:r>
-              <w:t>Dimensión / dato</w:t>
+              <w:t>Dato</w:t>
             </w:r>
           </w:p>
         </w:tc>
         <w:tc>
           <w:tcPr>
-            <w:tcW w:type="dxa" w:w="4320"/>
+            <w:tcW w:type="dxa" w:w="2880"/>
           </w:tcPr>
           <w:p>
             <w:r>
-              <w:t>De dónde se obtiene</w:t>
+              <w:t>Memoria</w:t>
+            </w:r>
+          </w:p>
+        </w:tc>
+        <w:tc>
+          <w:tcPr>
+            <w:tcW w:type="dxa" w:w="2880"/>
+          </w:tcPr>
+          <w:p>
+            <w:r>
+              <w:t>Plano</w:t>
             </w:r>
           </w:p>
         </w:tc>
@@ -890,27 +826,40 @@
       <w:tr>
         <w:tc>
           <w:tcPr>
-            <w:tcW w:type="dxa" w:w="4320"/>
+            <w:tcW w:type="dxa" w:w="2880"/>
           </w:tcPr>
           <w:p>
             <w:r>
               <w:rPr>
-                <w:sz w:val="20"/>
+                <w:sz w:val="19"/>
               </w:rPr>
-              <w:t>Ancho = 9.85 m</w:t>
+              <w:t>Longitud entre ejes 1–4</w:t>
             </w:r>
           </w:p>
         </w:tc>
         <w:tc>
           <w:tcPr>
-            <w:tcW w:type="dxa" w:w="4320"/>
+            <w:tcW w:type="dxa" w:w="2880"/>
           </w:tcPr>
           <w:p>
             <w:r>
               <w:rPr>
-                <w:sz w:val="20"/>
+                <w:sz w:val="19"/>
               </w:rPr>
-              <w:t>Ancho total de la huella del módulo (plano de cimentación / arquitectónico).</w:t>
+              <w:t>19.80 m</w:t>
+            </w:r>
+          </w:p>
+        </w:tc>
+        <w:tc>
+          <w:tcPr>
+            <w:tcW w:type="dxa" w:w="2880"/>
+          </w:tcPr>
+          <w:p>
+            <w:r>
+              <w:rPr>
+                <w:sz w:val="19"/>
+              </w:rPr>
+              <w:t>6.00+6.60+5.80+1.40 = 19.80</w:t>
             </w:r>
           </w:p>
         </w:tc>
@@ -918,27 +867,40 @@
       <w:tr>
         <w:tc>
           <w:tcPr>
-            <w:tcW w:type="dxa" w:w="4320"/>
+            <w:tcW w:type="dxa" w:w="2880"/>
           </w:tcPr>
           <w:p>
             <w:r>
               <w:rPr>
-                <w:sz w:val="20"/>
+                <w:sz w:val="19"/>
               </w:rPr>
-              <w:t>Largo = 21.95 m</w:t>
+              <w:t>Luz transversal A–B</w:t>
             </w:r>
           </w:p>
         </w:tc>
         <w:tc>
           <w:tcPr>
-            <w:tcW w:type="dxa" w:w="4320"/>
+            <w:tcW w:type="dxa" w:w="2880"/>
           </w:tcPr>
           <w:p>
             <w:r>
               <w:rPr>
-                <w:sz w:val="20"/>
+                <w:sz w:val="19"/>
               </w:rPr>
-              <w:t>Longitud total de la huella del módulo (mismo plano).</w:t>
+              <w:t>7.30 m</w:t>
+            </w:r>
+          </w:p>
+        </w:tc>
+        <w:tc>
+          <w:tcPr>
+            <w:tcW w:type="dxa" w:w="2880"/>
+          </w:tcPr>
+          <w:p>
+            <w:r>
+              <w:rPr>
+                <w:sz w:val="19"/>
+              </w:rPr>
+              <w:t>7.30 (7.70 total)</w:t>
             </w:r>
           </w:p>
         </w:tc>
@@ -946,27 +908,163 @@
       <w:tr>
         <w:tc>
           <w:tcPr>
-            <w:tcW w:type="dxa" w:w="4320"/>
+            <w:tcW w:type="dxa" w:w="2880"/>
           </w:tcPr>
           <w:p>
             <w:r>
               <w:rPr>
-                <w:sz w:val="20"/>
+                <w:sz w:val="19"/>
               </w:rPr>
-              <w:t>Alto = 0.55 m</w:t>
+              <w:t>Vigas de cimentación</w:t>
             </w:r>
           </w:p>
         </w:tc>
         <w:tc>
           <w:tcPr>
-            <w:tcW w:type="dxa" w:w="4320"/>
+            <w:tcW w:type="dxa" w:w="2880"/>
           </w:tcPr>
           <w:p>
             <w:r>
               <w:rPr>
-                <w:sz w:val="20"/>
+                <w:sz w:val="19"/>
               </w:rPr>
-              <w:t>Profundidad de la excavación masiva de la plataforma bajo la placa (perfil de rellenos: 0.20 recebo + 0.15 subbase + 0.10 placa + solado ≈ 0.55 m).</w:t>
+              <w:t>0.40×0.45; 2 long + 5 transv</w:t>
+            </w:r>
+          </w:p>
+        </w:tc>
+        <w:tc>
+          <w:tcPr>
+            <w:tcW w:type="dxa" w:w="2880"/>
+          </w:tcPr>
+          <w:p>
+            <w:r>
+              <w:rPr>
+                <w:sz w:val="19"/>
+              </w:rPr>
+              <w:t>VC-A/VC-B y VC-1..4 = 0.40×0.45</w:t>
+            </w:r>
+          </w:p>
+        </w:tc>
+      </w:tr>
+      <w:tr>
+        <w:tc>
+          <w:tcPr>
+            <w:tcW w:type="dxa" w:w="2880"/>
+          </w:tcPr>
+          <w:p>
+            <w:r>
+              <w:rPr>
+                <w:sz w:val="19"/>
+              </w:rPr>
+              <w:t>Placa de contrapiso</w:t>
+            </w:r>
+          </w:p>
+        </w:tc>
+        <w:tc>
+          <w:tcPr>
+            <w:tcW w:type="dxa" w:w="2880"/>
+          </w:tcPr>
+          <w:p>
+            <w:r>
+              <w:rPr>
+                <w:sz w:val="19"/>
+              </w:rPr>
+              <w:t>e = 0.10</w:t>
+            </w:r>
+          </w:p>
+        </w:tc>
+        <w:tc>
+          <w:tcPr>
+            <w:tcW w:type="dxa" w:w="2880"/>
+          </w:tcPr>
+          <w:p>
+            <w:r>
+              <w:rPr>
+                <w:sz w:val="19"/>
+              </w:rPr>
+              <w:t>«PLACA PISO e:0.10m»</w:t>
+            </w:r>
+          </w:p>
+        </w:tc>
+      </w:tr>
+      <w:tr>
+        <w:tc>
+          <w:tcPr>
+            <w:tcW w:type="dxa" w:w="2880"/>
+          </w:tcPr>
+          <w:p>
+            <w:r>
+              <w:rPr>
+                <w:sz w:val="19"/>
+              </w:rPr>
+              <w:t>Vigas de cubierta</w:t>
+            </w:r>
+          </w:p>
+        </w:tc>
+        <w:tc>
+          <w:tcPr>
+            <w:tcW w:type="dxa" w:w="2880"/>
+          </w:tcPr>
+          <w:p>
+            <w:r>
+              <w:rPr>
+                <w:sz w:val="19"/>
+              </w:rPr>
+              <w:t>0.40×0.50</w:t>
+            </w:r>
+          </w:p>
+        </w:tc>
+        <w:tc>
+          <w:tcPr>
+            <w:tcW w:type="dxa" w:w="2880"/>
+          </w:tcPr>
+          <w:p>
+            <w:r>
+              <w:rPr>
+                <w:sz w:val="19"/>
+              </w:rPr>
+              <w:t>VG-6/VG-7 = 40×50</w:t>
+            </w:r>
+          </w:p>
+        </w:tc>
+      </w:tr>
+      <w:tr>
+        <w:tc>
+          <w:tcPr>
+            <w:tcW w:type="dxa" w:w="2880"/>
+          </w:tcPr>
+          <w:p>
+            <w:r>
+              <w:rPr>
+                <w:sz w:val="19"/>
+              </w:rPr>
+              <w:t>Placa de cubierta</w:t>
+            </w:r>
+          </w:p>
+        </w:tc>
+        <w:tc>
+          <w:tcPr>
+            <w:tcW w:type="dxa" w:w="2880"/>
+          </w:tcPr>
+          <w:p>
+            <w:r>
+              <w:rPr>
+                <w:sz w:val="19"/>
+              </w:rPr>
+              <w:t>losa aligerada N+4.90</w:t>
+            </w:r>
+          </w:p>
+        </w:tc>
+        <w:tc>
+          <w:tcPr>
+            <w:tcW w:type="dxa" w:w="2880"/>
+          </w:tcPr>
+          <w:p>
+            <w:r>
+              <w:rPr>
+                <w:sz w:val="19"/>
+              </w:rPr>
+              <w:t>«LOSA ALIGERADA N+4.90 e:0.08»</w:t>
             </w:r>
           </w:p>
         </w:tc>
@@ -992,39 +1090,377 @@
         <w:rPr>
           <w:b/>
           <w:i w:val="0"/>
+          <w:color w:val="B01C1C"/>
           <w:sz w:val="22"/>
         </w:rPr>
-        <w:t>Cálculo:</w:t>
+        <w:t>4.2  Valores CORREGIDOS (no coincidían con el plano)</w:t>
+      </w:r>
+    </w:p>
+    <w:tbl>
+      <w:tblPr>
+        <w:tblStyle w:val="LightGrid-Accent1"/>
+        <w:tblW w:type="auto" w:w="0"/>
+        <w:tblLook w:firstColumn="1" w:firstRow="1" w:lastColumn="0" w:lastRow="0" w:noHBand="0" w:noVBand="1" w:val="04A0"/>
+      </w:tblPr>
+      <w:tblGrid>
+        <w:gridCol w:w="2880"/>
+        <w:gridCol w:w="2880"/>
+        <w:gridCol w:w="2880"/>
+      </w:tblGrid>
+      <w:tr>
+        <w:tc>
+          <w:tcPr>
+            <w:tcW w:type="dxa" w:w="2880"/>
+          </w:tcPr>
+          <w:p>
+            <w:r>
+              <w:t>Ítem</w:t>
+            </w:r>
+          </w:p>
+        </w:tc>
+        <w:tc>
+          <w:tcPr>
+            <w:tcW w:type="dxa" w:w="2880"/>
+          </w:tcPr>
+          <w:p>
+            <w:r>
+              <w:t>Antes (Excel)</w:t>
+            </w:r>
+          </w:p>
+        </w:tc>
+        <w:tc>
+          <w:tcPr>
+            <w:tcW w:type="dxa" w:w="2880"/>
+          </w:tcPr>
+          <w:p>
+            <w:r>
+              <w:t>Ahora (según plano)</w:t>
+            </w:r>
+          </w:p>
+        </w:tc>
+      </w:tr>
+      <w:tr>
+        <w:tc>
+          <w:tcPr>
+            <w:tcW w:type="dxa" w:w="2880"/>
+          </w:tcPr>
+          <w:p>
+            <w:r>
+              <w:rPr>
+                <w:sz w:val="19"/>
+              </w:rPr>
+              <w:t>4.1.1 Columnas</w:t>
+            </w:r>
+          </w:p>
+        </w:tc>
+        <w:tc>
+          <w:tcPr>
+            <w:tcW w:type="dxa" w:w="2880"/>
+          </w:tcPr>
+          <w:p>
+            <w:r>
+              <w:rPr>
+                <w:sz w:val="19"/>
+              </w:rPr>
+              <w:t>10 col de 0.40×0.40, h=4.90</w:t>
+            </w:r>
+          </w:p>
+        </w:tc>
+        <w:tc>
+          <w:tcPr>
+            <w:tcW w:type="dxa" w:w="2880"/>
+          </w:tcPr>
+          <w:p>
+            <w:r>
+              <w:rPr>
+                <w:sz w:val="19"/>
+              </w:rPr>
+              <w:t>8 col en 2 tipos: 4×(0.40×0.40, h=4.70) + 4×(0.50×0.50, h=4.90)</w:t>
+            </w:r>
+          </w:p>
+        </w:tc>
+      </w:tr>
+      <w:tr>
+        <w:tc>
+          <w:tcPr>
+            <w:tcW w:type="dxa" w:w="2880"/>
+          </w:tcPr>
+          <w:p>
+            <w:r>
+              <w:rPr>
+                <w:sz w:val="19"/>
+              </w:rPr>
+              <w:t>4.3.3.1 Placa cubierta</w:t>
+            </w:r>
+          </w:p>
+        </w:tc>
+        <w:tc>
+          <w:tcPr>
+            <w:tcW w:type="dxa" w:w="2880"/>
+          </w:tcPr>
+          <w:p>
+            <w:r>
+              <w:rPr>
+                <w:sz w:val="19"/>
+              </w:rPr>
+              <w:t>M2 pero fórmula con espesor</w:t>
+            </w:r>
+          </w:p>
+        </w:tc>
+        <w:tc>
+          <w:tcPr>
+            <w:tcW w:type="dxa" w:w="2880"/>
+          </w:tcPr>
+          <w:p>
+            <w:r>
+              <w:rPr>
+                <w:sz w:val="19"/>
+              </w:rPr>
+              <w:t>Área de losa = 7.30 × 18.52 (Alto=1)</w:t>
+            </w:r>
+          </w:p>
+        </w:tc>
+      </w:tr>
+      <w:tr>
+        <w:tc>
+          <w:tcPr>
+            <w:tcW w:type="dxa" w:w="2880"/>
+          </w:tcPr>
+          <w:p>
+            <w:r>
+              <w:rPr>
+                <w:sz w:val="19"/>
+              </w:rPr>
+              <w:t>4.3.3.1 Viguetas</w:t>
+            </w:r>
+          </w:p>
+        </w:tc>
+        <w:tc>
+          <w:tcPr>
+            <w:tcW w:type="dxa" w:w="2880"/>
+          </w:tcPr>
+          <w:p>
+            <w:r>
+              <w:rPr>
+                <w:sz w:val="19"/>
+              </w:rPr>
+              <w:t>0.20 × 0.32</w:t>
+            </w:r>
+          </w:p>
+        </w:tc>
+        <w:tc>
+          <w:tcPr>
+            <w:tcW w:type="dxa" w:w="2880"/>
+          </w:tcPr>
+          <w:p>
+            <w:r>
+              <w:rPr>
+                <w:sz w:val="19"/>
+              </w:rPr>
+              <w:t>0.20 × 0.40 (el plano dice 20×40)</w:t>
+            </w:r>
+          </w:p>
+        </w:tc>
+      </w:tr>
+      <w:tr>
+        <w:tc>
+          <w:tcPr>
+            <w:tcW w:type="dxa" w:w="2880"/>
+          </w:tcPr>
+          <w:p>
+            <w:r>
+              <w:rPr>
+                <w:sz w:val="19"/>
+              </w:rPr>
+              <w:t>4.7.1 Acero columnas</w:t>
+            </w:r>
+          </w:p>
+        </w:tc>
+        <w:tc>
+          <w:tcPr>
+            <w:tcW w:type="dxa" w:w="2880"/>
+          </w:tcPr>
+          <w:p>
+            <w:r>
+              <w:rPr>
+                <w:sz w:val="19"/>
+              </w:rPr>
+              <w:t>10 col × (2#6+2#7)</w:t>
+            </w:r>
+          </w:p>
+        </w:tc>
+        <w:tc>
+          <w:tcPr>
+            <w:tcW w:type="dxa" w:w="2880"/>
+          </w:tcPr>
+          <w:p>
+            <w:r>
+              <w:rPr>
+                <w:sz w:val="19"/>
+              </w:rPr>
+              <w:t>Tipo1: 6#6 ; Tipo2: 4#6+4#7 (kg desde cartilla)</w:t>
+            </w:r>
+          </w:p>
+        </w:tc>
+      </w:tr>
+    </w:tbl>
+    <w:p>
+      <w:pPr>
+        <w:spacing w:after="120"/>
+      </w:pPr>
+      <w:r>
+        <w:rPr>
+          <w:b w:val="0"/>
+          <w:i w:val="0"/>
+          <w:sz w:val="22"/>
+        </w:rPr>
       </w:r>
     </w:p>
     <w:p>
+      <w:pPr>
+        <w:spacing w:after="40"/>
+      </w:pPr>
       <w:r>
         <w:rPr>
           <w:b/>
-          <w:color w:val="1F3B73"/>
-          <w:sz w:val="23"/>
+          <w:i w:val="0"/>
+          <w:color w:val="B06000"/>
+          <w:sz w:val="22"/>
         </w:rPr>
-        <w:t>V = 9.85 × 0.55 × 21.95 × 1</w:t>
+        <w:t>4.3  Valores POR CONFIRMAR en el DWG (no acotados en los PDF)</w:t>
       </w:r>
     </w:p>
     <w:p>
+      <w:pPr>
+        <w:pStyle w:val="ListBullet"/>
+      </w:pPr>
       <w:r>
         <w:rPr>
           <w:b/>
-          <w:color w:val="006600"/>
-          <w:sz w:val="23"/>
         </w:rPr>
-        <w:t>➜ Resultado: 118.92 m³</w:t>
+        <w:t xml:space="preserve">Huella 9.85 × 21.95 m: </w:t>
+      </w:r>
+      <w:r>
+        <w:t>no está acotada en los planos PDF; la retícula estructural acotada es 19.80 × 7.30/7.70. Confirmar en el DWG/arquitectónico y pegar el pantallazo con la cota. Afecta: excavación, sub-base, recebo, geotextil y placa de contrapiso.</w:t>
       </w:r>
     </w:p>
     <w:p>
       <w:pPr>
+        <w:pStyle w:val="ListBullet"/>
+      </w:pPr>
+      <w:r>
+        <w:rPr>
+          <w:b/>
+        </w:rPr>
+        <w:t xml:space="preserve">L = 173.60 m de muro (5.1.1): </w:t>
+      </w:r>
+      <w:r>
+        <w:t>suma de longitudes de todos los muros; medir sobre el plano de mampostería y adjuntar el pantallazo.</w:t>
+      </w:r>
+    </w:p>
+    <w:p>
+      <w:pPr>
+        <w:pStyle w:val="ListBullet"/>
+      </w:pPr>
+      <w:r>
+        <w:rPr>
+          <w:b/>
+        </w:rPr>
+        <w:t xml:space="preserve">58 columnetas (5.1.2): </w:t>
+      </w:r>
+      <w:r>
+        <w:t>una cada ~3 m; contar sobre el plano.</w:t>
+      </w:r>
+    </w:p>
+    <w:p>
+      <w:pPr>
+        <w:pStyle w:val="ListBullet"/>
+      </w:pPr>
+      <w:r>
+        <w:rPr>
+          <w:b/>
+        </w:rPr>
+        <w:t xml:space="preserve">9 áreas de adoquín (8.1.1): </w:t>
+      </w:r>
+      <w:r>
+        <w:t>zonas exteriores; medir sobre el plano de adoquín/arquitectónico.</w:t>
+      </w:r>
+    </w:p>
+    <w:p>
+      <w:pPr>
+        <w:spacing w:after="120"/>
+      </w:pPr>
+      <w:r>
+        <w:rPr>
+          <w:b w:val="0"/>
+          <w:i w:val="0"/>
+          <w:sz w:val="22"/>
+        </w:rPr>
+      </w:r>
+    </w:p>
+    <w:p>
+      <w:pPr>
+        <w:spacing w:after="40"/>
+      </w:pPr>
+      <w:r>
+        <w:rPr>
+          <w:b/>
+          <w:i w:val="0"/>
+          <w:color w:val="1F3B73"/>
+          <w:sz w:val="22"/>
+        </w:rPr>
+        <w:t>4.4  Otras observaciones técnicas</w:t>
+      </w:r>
+    </w:p>
+    <w:p>
+      <w:pPr>
+        <w:pStyle w:val="ListBullet"/>
+      </w:pPr>
+      <w:r>
+        <w:t>Los planos especifican concreto de 4000 psi (280 kg/cm²), mientras que el presupuesto y la memoria usan 3000 psi. Verificar con el profesor cuál rige.</w:t>
+      </w:r>
+    </w:p>
+    <w:p>
+      <w:pPr>
+        <w:pStyle w:val="ListBullet"/>
+      </w:pPr>
+      <w:r>
+        <w:t>El plano tiene zapatas aisladas (Z-1 2.30×2.30×0.40 y Z-2 2.15×2.15×0.40), pero la memoria/presupuesto no incluye ítem de concreto ni de acero de zapatas. Si el alcance lo exige, deben agregarse.</w:t>
+      </w:r>
+    </w:p>
+    <w:p>
+      <w:pPr>
+        <w:spacing w:after="120"/>
+      </w:pPr>
+      <w:r>
+        <w:rPr>
+          <w:b w:val="0"/>
+          <w:i w:val="0"/>
+          <w:sz w:val="22"/>
+        </w:rPr>
+      </w:r>
+    </w:p>
+    <w:p>
+      <w:pPr>
+        <w:spacing w:after="80"/>
+      </w:pPr>
+      <w:r>
+        <w:rPr>
+          <w:b/>
+          <w:i w:val="0"/>
+          <w:sz w:val="22"/>
+        </w:rPr>
+        <w:t>Evidencia de las correcciones (recortes ampliados de los planos):</w:t>
+      </w:r>
+    </w:p>
+    <w:p>
+      <w:pPr>
         <w:jc w:val="center"/>
       </w:pPr>
       <w:r>
         <w:drawing>
           <wp:inline xmlns:a="http://schemas.openxmlformats.org/drawingml/2006/main" xmlns:pic="http://schemas.openxmlformats.org/drawingml/2006/picture">
-            <wp:extent cx="5400000" cy="2787097"/>
+            <wp:extent cx="2880000" cy="2488401"/>
             <wp:docPr id="6" name="Picture 6"/>
             <wp:cNvGraphicFramePr>
               <a:graphicFrameLocks noChangeAspect="1"/>
@@ -1033,7 +1469,7 @@
               <a:graphicData uri="http://schemas.openxmlformats.org/drawingml/2006/picture">
                 <pic:pic>
                   <pic:nvPicPr>
-                    <pic:cNvPr id="0" name="esq_capas_placa.png"/>
+                    <pic:cNvPr id="0" name="crop_col_det1.png"/>
                     <pic:cNvPicPr/>
                   </pic:nvPicPr>
                   <pic:blipFill>
@@ -1045,7 +1481,7 @@
                   <pic:spPr>
                     <a:xfrm>
                       <a:off x="0" y="0"/>
-                      <a:ext cx="5400000" cy="2787097"/>
+                      <a:ext cx="2880000" cy="2488401"/>
                     </a:xfrm>
                     <a:prstGeom prst="rect"/>
                   </pic:spPr>
@@ -1068,32 +1504,166 @@
           <w:color w:val="404040"/>
           <w:sz w:val="18"/>
         </w:rPr>
-        <w:t>Esquema 1. Corte del sistema de piso: la excavación (0.55 m) aloja recebo, sub-base y placa.</w:t>
+        <w:t>Detalle Columna Tipo 1: B=0.40 H=0.40, h=4.70, refuerzo 6#6.</w:t>
       </w:r>
     </w:p>
     <w:p>
       <w:pPr>
-        <w:spacing w:after="240"/>
+        <w:jc w:val="center"/>
+      </w:pPr>
+      <w:r>
+        <w:drawing>
+          <wp:inline xmlns:a="http://schemas.openxmlformats.org/drawingml/2006/main" xmlns:pic="http://schemas.openxmlformats.org/drawingml/2006/picture">
+            <wp:extent cx="2880000" cy="2488401"/>
+            <wp:docPr id="7" name="Picture 7"/>
+            <wp:cNvGraphicFramePr>
+              <a:graphicFrameLocks noChangeAspect="1"/>
+            </wp:cNvGraphicFramePr>
+            <a:graphic>
+              <a:graphicData uri="http://schemas.openxmlformats.org/drawingml/2006/picture">
+                <pic:pic>
+                  <pic:nvPicPr>
+                    <pic:cNvPr id="0" name="crop_col_det2.png"/>
+                    <pic:cNvPicPr/>
+                  </pic:nvPicPr>
+                  <pic:blipFill>
+                    <a:blip r:embed="rId15"/>
+                    <a:stretch>
+                      <a:fillRect/>
+                    </a:stretch>
+                  </pic:blipFill>
+                  <pic:spPr>
+                    <a:xfrm>
+                      <a:off x="0" y="0"/>
+                      <a:ext cx="2880000" cy="2488401"/>
+                    </a:xfrm>
+                    <a:prstGeom prst="rect"/>
+                  </pic:spPr>
+                </pic:pic>
+              </a:graphicData>
+            </a:graphic>
+          </wp:inline>
+        </w:drawing>
+      </w:r>
+    </w:p>
+    <w:p>
+      <w:pPr>
+        <w:spacing w:after="200"/>
+        <w:jc w:val="center"/>
       </w:pPr>
       <w:r>
         <w:rPr>
           <w:b w:val="0"/>
           <w:i/>
           <w:color w:val="404040"/>
-          <w:sz w:val="20"/>
+          <w:sz w:val="18"/>
         </w:rPr>
-        <w:t>Foto de referencia para el formato: Figura 3.1 (planta de cimentación) — se acota la huella del módulo y la profundidad de excavación.</w:t>
+        <w:t>Detalle Columna Tipo 2: B=0.50 H=0.50, h=4.90, refuerzo 4#6+4#7.</w:t>
       </w:r>
     </w:p>
     <w:p>
       <w:pPr>
-        <w:pStyle w:val="Heading2"/>
+        <w:jc w:val="center"/>
+      </w:pPr>
+      <w:r>
+        <w:drawing>
+          <wp:inline xmlns:a="http://schemas.openxmlformats.org/drawingml/2006/main" xmlns:pic="http://schemas.openxmlformats.org/drawingml/2006/picture">
+            <wp:extent cx="4680000" cy="2127166"/>
+            <wp:docPr id="8" name="Picture 8"/>
+            <wp:cNvGraphicFramePr>
+              <a:graphicFrameLocks noChangeAspect="1"/>
+            </wp:cNvGraphicFramePr>
+            <a:graphic>
+              <a:graphicData uri="http://schemas.openxmlformats.org/drawingml/2006/picture">
+                <pic:pic>
+                  <pic:nvPicPr>
+                    <pic:cNvPr id="0" name="crop_cub_seccion.png"/>
+                    <pic:cNvPicPr/>
+                  </pic:nvPicPr>
+                  <pic:blipFill>
+                    <a:blip r:embed="rId16"/>
+                    <a:stretch>
+                      <a:fillRect/>
+                    </a:stretch>
+                  </pic:blipFill>
+                  <pic:spPr>
+                    <a:xfrm>
+                      <a:off x="0" y="0"/>
+                      <a:ext cx="4680000" cy="2127166"/>
+                    </a:xfrm>
+                    <a:prstGeom prst="rect"/>
+                  </pic:spPr>
+                </pic:pic>
+              </a:graphicData>
+            </a:graphic>
+          </wp:inline>
+        </w:drawing>
+      </w:r>
+    </w:p>
+    <w:p>
+      <w:pPr>
+        <w:spacing w:after="200"/>
+        <w:jc w:val="center"/>
+      </w:pPr>
+      <w:r>
+        <w:rPr>
+          <w:b w:val="0"/>
+          <w:i/>
+          <w:color w:val="404040"/>
+          <w:sz w:val="18"/>
+        </w:rPr>
+        <w:t>Detalle de la losa aligerada: viguetas 0.20×0.40 @1.00 m con malla electrosoldada.</w:t>
+      </w:r>
+    </w:p>
+    <w:p>
+      <w:r>
+        <w:br w:type="page"/>
+      </w:r>
+    </w:p>
+    <w:p>
+      <w:pPr>
+        <w:pStyle w:val="Heading1"/>
       </w:pPr>
       <w:r>
         <w:rPr>
           <w:color w:val="1F3B73"/>
         </w:rPr>
-        <w:t>Ítem 2.1.2 — Relleno granular sub-base B-400  (M3)</w:t>
+        <w:t>5. Cálculo detallado por actividad</w:t>
+      </w:r>
+    </w:p>
+    <w:p>
+      <w:pPr>
+        <w:spacing w:after="120"/>
+      </w:pPr>
+      <w:r>
+        <w:rPr>
+          <w:b w:val="0"/>
+          <w:i w:val="0"/>
+          <w:sz w:val="22"/>
+        </w:rPr>
+        <w:t>Para cada ítem: origen de las dimensiones, fórmula y resultado (ya con las correcciones).</w:t>
+      </w:r>
+    </w:p>
+    <w:p>
+      <w:pPr>
+        <w:pStyle w:val="Heading2"/>
+      </w:pPr>
+      <w:r>
+        <w:rPr>
+          <w:color w:val="1F3B73"/>
+        </w:rPr>
+        <w:t>Capítulo 2 – Cimentación</w:t>
+      </w:r>
+    </w:p>
+    <w:p>
+      <w:pPr>
+        <w:pStyle w:val="Heading2"/>
+      </w:pPr>
+      <w:r>
+        <w:rPr>
+          <w:color w:val="1F3B73"/>
+        </w:rPr>
+        <w:t>Ítem 2.1.1 — Excavación a máquina conglomerado 0–2 m (incl. retiro)  (M3)</w:t>
       </w:r>
     </w:p>
     <w:p>
@@ -1178,7 +1748,7 @@
               <w:rPr>
                 <w:sz w:val="20"/>
               </w:rPr>
-              <w:t>Huella del módulo (igual que la excavación).</w:t>
+              <w:t>Huella del módulo (POR CONFIRMAR en DWG).</w:t>
             </w:r>
           </w:p>
         </w:tc>
@@ -1193,7 +1763,7 @@
               <w:rPr>
                 <w:sz w:val="20"/>
               </w:rPr>
-              <w:t>Alto = 0.15 m</w:t>
+              <w:t>Alto = 0.55 m</w:t>
             </w:r>
           </w:p>
         </w:tc>
@@ -1206,7 +1776,7 @@
               <w:rPr>
                 <w:sz w:val="20"/>
               </w:rPr>
-              <w:t>Espesor de la capa de sub-base granular indicada en el perfil de piso.</w:t>
+              <w:t>Profundidad de la excavación masiva (0.20 recebo + 0.15 subbase + 0.10 placa + solado ≈ 0.55).</w:t>
             </w:r>
           </w:p>
         </w:tc>
@@ -1244,7 +1814,7 @@
           <w:color w:val="1F3B73"/>
           <w:sz w:val="23"/>
         </w:rPr>
-        <w:t>V = 9.85 × 0.15 × 21.95 × 1</w:t>
+        <w:t>V = 9.85 × 0.55 × 21.95 × 1</w:t>
       </w:r>
     </w:p>
     <w:p>
@@ -1254,7 +1824,75 @@
           <w:color w:val="006600"/>
           <w:sz w:val="23"/>
         </w:rPr>
-        <w:t>➜ Resultado: 32.44 m³</w:t>
+        <w:t>➜ Resultado: 118.92 m³</w:t>
+      </w:r>
+    </w:p>
+    <w:p>
+      <w:pPr>
+        <w:spacing w:after="120"/>
+      </w:pPr>
+      <w:r>
+        <w:rPr>
+          <w:b w:val="0"/>
+          <w:i/>
+          <w:color w:val="B06000"/>
+          <w:sz w:val="20"/>
+        </w:rPr>
+        <w:t>Observación: La huella 9.85×21.95 no está acotada en los PDF; confirmar en el DWG y pegar el pantallazo de la cota.</w:t>
+      </w:r>
+    </w:p>
+    <w:p>
+      <w:pPr>
+        <w:jc w:val="center"/>
+      </w:pPr>
+      <w:r>
+        <w:drawing>
+          <wp:inline xmlns:a="http://schemas.openxmlformats.org/drawingml/2006/main" xmlns:pic="http://schemas.openxmlformats.org/drawingml/2006/picture">
+            <wp:extent cx="5400000" cy="2787097"/>
+            <wp:docPr id="9" name="Picture 9"/>
+            <wp:cNvGraphicFramePr>
+              <a:graphicFrameLocks noChangeAspect="1"/>
+            </wp:cNvGraphicFramePr>
+            <a:graphic>
+              <a:graphicData uri="http://schemas.openxmlformats.org/drawingml/2006/picture">
+                <pic:pic>
+                  <pic:nvPicPr>
+                    <pic:cNvPr id="0" name="esq_capas_placa.png"/>
+                    <pic:cNvPicPr/>
+                  </pic:nvPicPr>
+                  <pic:blipFill>
+                    <a:blip r:embed="rId17"/>
+                    <a:stretch>
+                      <a:fillRect/>
+                    </a:stretch>
+                  </pic:blipFill>
+                  <pic:spPr>
+                    <a:xfrm>
+                      <a:off x="0" y="0"/>
+                      <a:ext cx="5400000" cy="2787097"/>
+                    </a:xfrm>
+                    <a:prstGeom prst="rect"/>
+                  </pic:spPr>
+                </pic:pic>
+              </a:graphicData>
+            </a:graphic>
+          </wp:inline>
+        </w:drawing>
+      </w:r>
+    </w:p>
+    <w:p>
+      <w:pPr>
+        <w:spacing w:after="200"/>
+        <w:jc w:val="center"/>
+      </w:pPr>
+      <w:r>
+        <w:rPr>
+          <w:b w:val="0"/>
+          <w:i/>
+          <w:color w:val="404040"/>
+          <w:sz w:val="18"/>
+        </w:rPr>
+        <w:t>Esquema 1. Corte del sistema de piso.</w:t>
       </w:r>
     </w:p>
     <w:p>
@@ -1268,7 +1906,7 @@
           <w:color w:val="404040"/>
           <w:sz w:val="20"/>
         </w:rPr>
-        <w:t>Foto de referencia para el formato: Figura 3.1 + Esquema 1 (capa de sub-base).</w:t>
+        <w:t>Foto de referencia para el formato: Figura 3.1 + Esquema 1.</w:t>
       </w:r>
     </w:p>
     <w:p>
@@ -1279,7 +1917,7 @@
         <w:rPr>
           <w:color w:val="1F3B73"/>
         </w:rPr>
-        <w:t>Ítem 2.1.3 — Excavación manual material común 0–2 m  (M3)</w:t>
+        <w:t>Ítem 2.1.2 — Relleno granular sub-base B-400  (M3)</w:t>
       </w:r>
     </w:p>
     <w:p>
@@ -1351,7 +1989,7 @@
               <w:rPr>
                 <w:sz w:val="20"/>
               </w:rPr>
-              <w:t>Zanjas longitudinales: 0.40 × 0.40 × 19.80, cantidad 2</w:t>
+              <w:t>Ancho = 9.85 / Largo = 21.95</w:t>
             </w:r>
           </w:p>
         </w:tc>
@@ -1364,7 +2002,7 @@
               <w:rPr>
                 <w:sz w:val="20"/>
               </w:rPr>
-              <w:t>Ancho de zanja 0.40 m; profundidad 0.40 m; longitud entre ejes 1 y 4 = 6.00+6.60+5.80+1.40 = 19.80 m; son 2 zanjas (ejes A y B).</w:t>
+              <w:t>Huella del módulo (POR CONFIRMAR).</w:t>
             </w:r>
           </w:p>
         </w:tc>
@@ -1379,7 +2017,7 @@
               <w:rPr>
                 <w:sz w:val="20"/>
               </w:rPr>
-              <w:t>Zanjas transversales: 0.40 × 0.40 × 7.30, cantidad 5</w:t>
+              <w:t>Alto = 0.15 m</w:t>
             </w:r>
           </w:p>
         </w:tc>
@@ -1392,7 +2030,7 @@
               <w:rPr>
                 <w:sz w:val="20"/>
               </w:rPr>
-              <w:t>Luz libre transversal 7.30 m; 5 ejes (1, 2, 3, 3', 4).</w:t>
+              <w:t>Espesor de la sub-base granular.</w:t>
             </w:r>
           </w:p>
         </w:tc>
@@ -1430,7 +2068,7 @@
           <w:color w:val="1F3B73"/>
           <w:sz w:val="23"/>
         </w:rPr>
-        <w:t>V = (0.40×0.40×19.80×2) + (0.40×0.40×7.30×5) = 6.34 + 5.84</w:t>
+        <w:t>V = 9.85 × 0.15 × 21.95 × 1</w:t>
       </w:r>
     </w:p>
     <w:p>
@@ -1440,7 +2078,21 @@
           <w:color w:val="006600"/>
           <w:sz w:val="23"/>
         </w:rPr>
-        <w:t>➜ Resultado: 12.18 m³</w:t>
+        <w:t>➜ Resultado: 32.44 m³</w:t>
+      </w:r>
+    </w:p>
+    <w:p>
+      <w:pPr>
+        <w:spacing w:after="120"/>
+      </w:pPr>
+      <w:r>
+        <w:rPr>
+          <w:b w:val="0"/>
+          <w:i/>
+          <w:color w:val="B06000"/>
+          <w:sz w:val="20"/>
+        </w:rPr>
+        <w:t>Observación: La huella 9.85×21.95 no está acotada en los PDF; confirmar en el DWG y pegar el pantallazo de la cota.</w:t>
       </w:r>
     </w:p>
     <w:p>
@@ -1454,7 +2106,7 @@
           <w:color w:val="404040"/>
           <w:sz w:val="20"/>
         </w:rPr>
-        <w:t>Foto de referencia para el formato: Figura 3.1 — anchos y luces de las zanjas de las vigas VC (0.40 m) y ejes.</w:t>
+        <w:t>Foto de referencia para el formato: Figura 3.1 + Esquema 1.</w:t>
       </w:r>
     </w:p>
     <w:p>
@@ -1465,7 +2117,7 @@
         <w:rPr>
           <w:color w:val="1F3B73"/>
         </w:rPr>
-        <w:t>Ítem 2.1.4 — Relleno material común (recebo)  (M3)</w:t>
+        <w:t>Ítem 2.1.3 — Excavación manual material común 0–2 m  (M3)</w:t>
       </w:r>
     </w:p>
     <w:p>
@@ -1537,7 +2189,7 @@
               <w:rPr>
                 <w:sz w:val="20"/>
               </w:rPr>
-              <w:t>Ancho = 9.85 m / Largo = 21.95 m</w:t>
+              <w:t>Long.: 0.40×0.40×19.80, cant. 2</w:t>
             </w:r>
           </w:p>
         </w:tc>
@@ -1550,7 +2202,7 @@
               <w:rPr>
                 <w:sz w:val="20"/>
               </w:rPr>
-              <w:t>Huella del módulo.</w:t>
+              <w:t>Zanjas en ejes A y B (0.40 ancho, 0.40 prof., 19.80 largo).</w:t>
             </w:r>
           </w:p>
         </w:tc>
@@ -1565,7 +2217,7 @@
               <w:rPr>
                 <w:sz w:val="20"/>
               </w:rPr>
-              <w:t>Alto = 0.20 m</w:t>
+              <w:t>Transv.: 0.40×0.40×7.30, cant. 5</w:t>
             </w:r>
           </w:p>
         </w:tc>
@@ -1578,7 +2230,7 @@
               <w:rPr>
                 <w:sz w:val="20"/>
               </w:rPr>
-              <w:t>Espesor de la capa de recebo de nivelación bajo la placa.</w:t>
+              <w:t>5 ejes, luz 7.30 m.</w:t>
             </w:r>
           </w:p>
         </w:tc>
@@ -1616,7 +2268,7 @@
           <w:color w:val="1F3B73"/>
           <w:sz w:val="23"/>
         </w:rPr>
-        <w:t>V = 9.85 × 0.20 × 21.95 × 1</w:t>
+        <w:t>V = (0.40×0.40×19.80×2)+(0.40×0.40×7.30×5) = 6.34 + 5.84</w:t>
       </w:r>
     </w:p>
     <w:p>
@@ -1626,7 +2278,7 @@
           <w:color w:val="006600"/>
           <w:sz w:val="23"/>
         </w:rPr>
-        <w:t>➜ Resultado: 43.24 m³</w:t>
+        <w:t>➜ Resultado: 12.18 m³</w:t>
       </w:r>
     </w:p>
     <w:p>
@@ -1640,7 +2292,7 @@
           <w:color w:val="404040"/>
           <w:sz w:val="20"/>
         </w:rPr>
-        <w:t>Foto de referencia para el formato: Figura 3.1 + Esquema 1 (capa de recebo de nivelación).</w:t>
+        <w:t>Foto de referencia para el formato: Figura 3.1 (zanjas de vigas VC).</w:t>
       </w:r>
     </w:p>
     <w:p>
@@ -1651,7 +2303,7 @@
         <w:rPr>
           <w:color w:val="1F3B73"/>
         </w:rPr>
-        <w:t>Ítem 2.1.6 — Geotextil NT 1600  (M2)</w:t>
+        <w:t>Ítem 2.1.4 — Relleno material común (recebo)  (M3)</w:t>
       </w:r>
     </w:p>
     <w:p>
@@ -1723,7 +2375,7 @@
               <w:rPr>
                 <w:sz w:val="20"/>
               </w:rPr>
-              <w:t>Ancho = 9.85 m / Largo = 21.95 m</w:t>
+              <w:t>Ancho = 9.85 / Largo = 21.95</w:t>
             </w:r>
           </w:p>
         </w:tc>
@@ -1736,7 +2388,207 @@
               <w:rPr>
                 <w:sz w:val="20"/>
               </w:rPr>
-              <w:t>Huella del módulo (se coloca bajo toda la placa).</w:t>
+              <w:t>Huella (POR CONFIRMAR).</w:t>
+            </w:r>
+          </w:p>
+        </w:tc>
+      </w:tr>
+      <w:tr>
+        <w:tc>
+          <w:tcPr>
+            <w:tcW w:type="dxa" w:w="4320"/>
+          </w:tcPr>
+          <w:p>
+            <w:r>
+              <w:rPr>
+                <w:sz w:val="20"/>
+              </w:rPr>
+              <w:t>Alto = 0.20 m</w:t>
+            </w:r>
+          </w:p>
+        </w:tc>
+        <w:tc>
+          <w:tcPr>
+            <w:tcW w:type="dxa" w:w="4320"/>
+          </w:tcPr>
+          <w:p>
+            <w:r>
+              <w:rPr>
+                <w:sz w:val="20"/>
+              </w:rPr>
+              <w:t>Espesor de recebo de nivelación.</w:t>
+            </w:r>
+          </w:p>
+        </w:tc>
+      </w:tr>
+    </w:tbl>
+    <w:p>
+      <w:pPr>
+        <w:spacing w:after="120"/>
+      </w:pPr>
+      <w:r>
+        <w:rPr>
+          <w:b w:val="0"/>
+          <w:i w:val="0"/>
+          <w:sz w:val="22"/>
+        </w:rPr>
+      </w:r>
+    </w:p>
+    <w:p>
+      <w:pPr>
+        <w:spacing w:after="40"/>
+      </w:pPr>
+      <w:r>
+        <w:rPr>
+          <w:b/>
+          <w:i w:val="0"/>
+          <w:sz w:val="22"/>
+        </w:rPr>
+        <w:t>Cálculo:</w:t>
+      </w:r>
+    </w:p>
+    <w:p>
+      <w:r>
+        <w:rPr>
+          <w:b/>
+          <w:color w:val="1F3B73"/>
+          <w:sz w:val="23"/>
+        </w:rPr>
+        <w:t>V = 9.85 × 0.20 × 21.95 × 1</w:t>
+      </w:r>
+    </w:p>
+    <w:p>
+      <w:r>
+        <w:rPr>
+          <w:b/>
+          <w:color w:val="006600"/>
+          <w:sz w:val="23"/>
+        </w:rPr>
+        <w:t>➜ Resultado: 43.24 m³</w:t>
+      </w:r>
+    </w:p>
+    <w:p>
+      <w:pPr>
+        <w:spacing w:after="120"/>
+      </w:pPr>
+      <w:r>
+        <w:rPr>
+          <w:b w:val="0"/>
+          <w:i/>
+          <w:color w:val="B06000"/>
+          <w:sz w:val="20"/>
+        </w:rPr>
+        <w:t>Observación: La huella 9.85×21.95 no está acotada en los PDF; confirmar en el DWG y pegar el pantallazo de la cota.</w:t>
+      </w:r>
+    </w:p>
+    <w:p>
+      <w:pPr>
+        <w:spacing w:after="240"/>
+      </w:pPr>
+      <w:r>
+        <w:rPr>
+          <w:b w:val="0"/>
+          <w:i/>
+          <w:color w:val="404040"/>
+          <w:sz w:val="20"/>
+        </w:rPr>
+        <w:t>Foto de referencia para el formato: Figura 3.1 + Esquema 1.</w:t>
+      </w:r>
+    </w:p>
+    <w:p>
+      <w:pPr>
+        <w:pStyle w:val="Heading2"/>
+      </w:pPr>
+      <w:r>
+        <w:rPr>
+          <w:color w:val="1F3B73"/>
+        </w:rPr>
+        <w:t>Ítem 2.1.6 — Geotextil NT 1600  (M2)</w:t>
+      </w:r>
+    </w:p>
+    <w:p>
+      <w:pPr>
+        <w:spacing w:after="80"/>
+      </w:pPr>
+      <w:r>
+        <w:rPr>
+          <w:b w:val="0"/>
+          <w:i/>
+          <w:color w:val="404040"/>
+          <w:sz w:val="20"/>
+        </w:rPr>
+        <w:t>Capítulo: 2. Cimentación</w:t>
+      </w:r>
+    </w:p>
+    <w:p>
+      <w:pPr>
+        <w:spacing w:after="40"/>
+      </w:pPr>
+      <w:r>
+        <w:rPr>
+          <w:b/>
+          <w:i w:val="0"/>
+          <w:sz w:val="22"/>
+        </w:rPr>
+        <w:t>Origen de cada valor (de dónde sale):</w:t>
+      </w:r>
+    </w:p>
+    <w:tbl>
+      <w:tblPr>
+        <w:tblStyle w:val="LightList-Accent1"/>
+        <w:tblW w:type="auto" w:w="0"/>
+        <w:tblLook w:firstColumn="1" w:firstRow="1" w:lastColumn="0" w:lastRow="0" w:noHBand="0" w:noVBand="1" w:val="04A0"/>
+      </w:tblPr>
+      <w:tblGrid>
+        <w:gridCol w:w="4320"/>
+        <w:gridCol w:w="4320"/>
+      </w:tblGrid>
+      <w:tr>
+        <w:tc>
+          <w:tcPr>
+            <w:tcW w:type="dxa" w:w="4320"/>
+          </w:tcPr>
+          <w:p>
+            <w:r>
+              <w:t>Dimensión / dato</w:t>
+            </w:r>
+          </w:p>
+        </w:tc>
+        <w:tc>
+          <w:tcPr>
+            <w:tcW w:type="dxa" w:w="4320"/>
+          </w:tcPr>
+          <w:p>
+            <w:r>
+              <w:t>De dónde se obtiene</w:t>
+            </w:r>
+          </w:p>
+        </w:tc>
+      </w:tr>
+      <w:tr>
+        <w:tc>
+          <w:tcPr>
+            <w:tcW w:type="dxa" w:w="4320"/>
+          </w:tcPr>
+          <w:p>
+            <w:r>
+              <w:rPr>
+                <w:sz w:val="20"/>
+              </w:rPr>
+              <w:t>Ancho = 9.85 / Largo = 21.95</w:t>
+            </w:r>
+          </w:p>
+        </w:tc>
+        <w:tc>
+          <w:tcPr>
+            <w:tcW w:type="dxa" w:w="4320"/>
+          </w:tcPr>
+          <w:p>
+            <w:r>
+              <w:rPr>
+                <w:sz w:val="20"/>
+              </w:rPr>
+              <w:t>Huella (POR CONFIRMAR).</w:t>
             </w:r>
           </w:p>
         </w:tc>
@@ -1764,7 +2616,7 @@
               <w:rPr>
                 <w:sz w:val="20"/>
               </w:rPr>
-              <w:t>Se deja en 1 porque el geotextil se mide por área, no por volumen.</w:t>
+              <w:t>Se mide por área.</w:t>
             </w:r>
           </w:p>
         </w:tc>
@@ -1817,6 +2669,20 @@
     </w:p>
     <w:p>
       <w:pPr>
+        <w:spacing w:after="120"/>
+      </w:pPr>
+      <w:r>
+        <w:rPr>
+          <w:b w:val="0"/>
+          <w:i/>
+          <w:color w:val="B06000"/>
+          <w:sz w:val="20"/>
+        </w:rPr>
+        <w:t>Observación: La huella 9.85×21.95 no está acotada en los PDF; confirmar en el DWG y pegar el pantallazo de la cota.</w:t>
+      </w:r>
+    </w:p>
+    <w:p>
+      <w:pPr>
         <w:spacing w:after="240"/>
       </w:pPr>
       <w:r>
@@ -1826,7 +2692,7 @@
           <w:color w:val="404040"/>
           <w:sz w:val="20"/>
         </w:rPr>
-        <w:t>Foto de referencia para el formato: Figura 3.1 + Esquema 1 (línea verde del geotextil).</w:t>
+        <w:t>Foto de referencia para el formato: Figura 3.1 + Esquema 1.</w:t>
       </w:r>
     </w:p>
     <w:p>
@@ -1922,7 +2788,7 @@
               <w:rPr>
                 <w:sz w:val="20"/>
               </w:rPr>
-              <w:t>Dimensiones de la viga de cimentación (rótulo del plano: B=0.40, H=0.45).</w:t>
+              <w:t>Rótulo de las vigas VC en el plano.</w:t>
             </w:r>
           </w:p>
         </w:tc>
@@ -1937,7 +2803,7 @@
               <w:rPr>
                 <w:sz w:val="20"/>
               </w:rPr>
-              <w:t>Long. = 19.80 m × 2</w:t>
+              <w:t>Long. 19.80 × 2</w:t>
             </w:r>
           </w:p>
         </w:tc>
@@ -1950,7 +2816,7 @@
               <w:rPr>
                 <w:sz w:val="20"/>
               </w:rPr>
-              <w:t>Vigas longitudinales VC-A y VC-B (entre ejes 1 y 4).</w:t>
+              <w:t>VC-A y VC-B.</w:t>
             </w:r>
           </w:p>
         </w:tc>
@@ -1965,7 +2831,7 @@
               <w:rPr>
                 <w:sz w:val="20"/>
               </w:rPr>
-              <w:t>Transv. = 7.30 m × 5</w:t>
+              <w:t>Transv. 7.30 × 5</w:t>
             </w:r>
           </w:p>
         </w:tc>
@@ -1978,7 +2844,7 @@
               <w:rPr>
                 <w:sz w:val="20"/>
               </w:rPr>
-              <w:t>Vigas transversales VC-1..4 en los 5 ejes (luz libre 7.30 m).</w:t>
+              <w:t>VC-1..4 (5 ejes).</w:t>
             </w:r>
           </w:p>
         </w:tc>
@@ -2016,7 +2882,7 @@
           <w:color w:val="1F3B73"/>
           <w:sz w:val="23"/>
         </w:rPr>
-        <w:t>V = (0.40×0.45×19.80×2) + (0.40×0.45×7.30×5) = 7.13 + 6.57</w:t>
+        <w:t>V = (0.40×0.45×19.80×2)+(0.40×0.45×7.30×5) = 7.13 + 6.57</w:t>
       </w:r>
     </w:p>
     <w:p>
@@ -2037,7 +2903,7 @@
         <w:drawing>
           <wp:inline xmlns:a="http://schemas.openxmlformats.org/drawingml/2006/main" xmlns:pic="http://schemas.openxmlformats.org/drawingml/2006/picture">
             <wp:extent cx="5400000" cy="6079787"/>
-            <wp:docPr id="7" name="Picture 7"/>
+            <wp:docPr id="10" name="Picture 10"/>
             <wp:cNvGraphicFramePr>
               <a:graphicFrameLocks noChangeAspect="1"/>
             </wp:cNvGraphicFramePr>
@@ -2049,7 +2915,7 @@
                     <pic:cNvPicPr/>
                   </pic:nvPicPr>
                   <pic:blipFill>
-                    <a:blip r:embed="rId15"/>
+                    <a:blip r:embed="rId18"/>
                     <a:stretch>
                       <a:fillRect/>
                     </a:stretch>
@@ -2080,7 +2946,7 @@
           <w:color w:val="404040"/>
           <w:sz w:val="18"/>
         </w:rPr>
-        <w:t>Esquema 3. Sección típica de viga de cimentación 0.40×0.45 sobre solado.</w:t>
+        <w:t>Esquema 3. Sección de viga de cimentación 0.40×0.45.</w:t>
       </w:r>
     </w:p>
     <w:p>
@@ -2094,7 +2960,7 @@
           <w:color w:val="404040"/>
           <w:sz w:val="20"/>
         </w:rPr>
-        <w:t>Foto de referencia para el formato: Figura 3.1 — sección de vigas VC-A/VC-B rotulada B=0.40 H=0.45.</w:t>
+        <w:t>Foto de referencia para el formato: Figura 3.1 (rótulo B=0.40 H=0.45).</w:t>
       </w:r>
     </w:p>
     <w:p>
@@ -2190,7 +3056,7 @@
               <w:rPr>
                 <w:sz w:val="20"/>
               </w:rPr>
-              <w:t>Ancho del solado (10 cm más ancho que la viga a cada lado).</w:t>
+              <w:t>10 cm más ancho que la viga (a cada lado).</w:t>
             </w:r>
           </w:p>
         </w:tc>
@@ -2205,7 +3071,7 @@
               <w:rPr>
                 <w:sz w:val="20"/>
               </w:rPr>
-              <w:t>Long. = 19.80 (×2) y 7.30 (×5)</w:t>
+              <w:t>Long. 19.80×2 y 7.30×5</w:t>
             </w:r>
           </w:p>
         </w:tc>
@@ -2218,7 +3084,7 @@
               <w:rPr>
                 <w:sz w:val="20"/>
               </w:rPr>
-              <w:t>Mismo desarrollo de las vigas de cimentación.</w:t>
+              <w:t>Mismo desarrollo de las vigas.</w:t>
             </w:r>
           </w:p>
         </w:tc>
@@ -2246,7 +3112,7 @@
               <w:rPr>
                 <w:sz w:val="20"/>
               </w:rPr>
-              <w:t>El solado se mide por área (el espesor 0.05 va en el APU).</w:t>
+              <w:t>Se mide por área.</w:t>
             </w:r>
           </w:p>
         </w:tc>
@@ -2284,7 +3150,7 @@
           <w:color w:val="1F3B73"/>
           <w:sz w:val="23"/>
         </w:rPr>
-        <w:t>A = (0.50×1×19.80×2) + (0.50×1×7.30×5) = 19.80 + 18.25</w:t>
+        <w:t>A = (0.50×1×19.80×2)+(0.50×1×7.30×5) = 19.80 + 18.25</w:t>
       </w:r>
     </w:p>
     <w:p>
@@ -2308,7 +3174,7 @@
           <w:color w:val="404040"/>
           <w:sz w:val="20"/>
         </w:rPr>
-        <w:t>Foto de referencia para el formato: Figura 3.1 + Esquema 3 (solado bajo vigas).</w:t>
+        <w:t>Foto de referencia para el formato: Figura 3.1 + Esquema 3.</w:t>
       </w:r>
     </w:p>
     <w:p>
@@ -2391,7 +3257,7 @@
               <w:rPr>
                 <w:sz w:val="20"/>
               </w:rPr>
-              <w:t>Refuerzo longitudinal 3#6 + 3#5</w:t>
+              <w:t>3#6 + 3#5 longitudinal</w:t>
             </w:r>
           </w:p>
         </w:tc>
@@ -2404,7 +3270,7 @@
               <w:rPr>
                 <w:sz w:val="20"/>
               </w:rPr>
-              <w:t>Barras indicadas en el despiece de las vigas de cimentación (cuadro de hierros del plano).</w:t>
+              <w:t>Despiece de las vigas de cimentación.</w:t>
             </w:r>
           </w:p>
         </w:tc>
@@ -2419,7 +3285,7 @@
               <w:rPr>
                 <w:sz w:val="20"/>
               </w:rPr>
-              <w:t>Estribos #3 c/0.20 m</w:t>
+              <w:t>Estribos #3 c/0.20</w:t>
             </w:r>
           </w:p>
         </w:tc>
@@ -2432,7 +3298,7 @@
               <w:rPr>
                 <w:sz w:val="20"/>
               </w:rPr>
-              <w:t>Separación de estribos indicada en el plano.</w:t>
+              <w:t>Del plano.</w:t>
             </w:r>
           </w:p>
         </w:tc>
@@ -2447,7 +3313,7 @@
               <w:rPr>
                 <w:sz w:val="20"/>
               </w:rPr>
-              <w:t>Peso por metro</w:t>
+              <w:t>Peso lineal</w:t>
             </w:r>
           </w:p>
         </w:tc>
@@ -2460,7 +3326,7 @@
               <w:rPr>
                 <w:sz w:val="20"/>
               </w:rPr>
-              <w:t>#6 = 2.235 kg/m ; #5 = 1.552 kg/m ; #3 = 0.559 kg/m (tabla estándar de aceros).</w:t>
+              <w:t>#6=2.235 ; #5=1.552 ; #3=0.559 kg/m.</w:t>
             </w:r>
           </w:p>
         </w:tc>
@@ -2526,7 +3392,7 @@
           <w:color w:val="1F3B73"/>
           <w:sz w:val="23"/>
         </w:rPr>
-        <w:t>Long. 3#6+3#5 = 864.6 kg  +  Estribos #3 = 319.6 kg  =  1 184.2 kg  ×1.10</w:t>
+        <w:t>864.6 kg (long.) + 319.6 kg (estribos) = 1 184.2 kg × 1.10</w:t>
       </w:r>
     </w:p>
     <w:p>
@@ -2550,7 +3416,7 @@
           <w:color w:val="B06000"/>
           <w:sz w:val="20"/>
         </w:rPr>
-        <w:t>Observación: El acero se obtiene sumando la longitud de cada tipo de varilla del despiece × su peso lineal (kg/m), y se añade 10 % por desperdicio y traslapos.</w:t>
+        <w:t>Observación: El valor exacto debe salir de la cartilla de hierros (DLNET).</w:t>
       </w:r>
     </w:p>
     <w:p>
@@ -2564,7 +3430,7 @@
           <w:color w:val="404040"/>
           <w:sz w:val="20"/>
         </w:rPr>
-        <w:t>Foto de referencia para el formato: Figura 3.1 — despiece: refuerzo longitudinal 3#6 + 3#5 y estribos #3 c/0.20.</w:t>
+        <w:t>Foto de referencia para el formato: Figura 3.1 (despiece de vigas).</w:t>
       </w:r>
     </w:p>
     <w:p>
@@ -2663,7 +3529,7 @@
               <w:rPr>
                 <w:sz w:val="20"/>
               </w:rPr>
-              <w:t>Sección 0.40 × 0.40</w:t>
+              <w:t>Tipo 1: 0.40×0.40, h=4.70, 4 und</w:t>
             </w:r>
           </w:p>
         </w:tc>
@@ -2676,7 +3542,7 @@
               <w:rPr>
                 <w:sz w:val="20"/>
               </w:rPr>
-              <w:t>Dimensión de la columna tipo (rótulo del plano: B=0.40 H=0.40).</w:t>
+              <w:t>Ejes 1A, 1B, 3'B, 4A (despiece del plano).</w:t>
             </w:r>
           </w:p>
         </w:tc>
@@ -2691,7 +3557,7 @@
               <w:rPr>
                 <w:sz w:val="20"/>
               </w:rPr>
-              <w:t>Alto = 4.90 m</w:t>
+              <w:t>Tipo 2: 0.50×0.50, h=4.90, 4 und</w:t>
             </w:r>
           </w:p>
         </w:tc>
@@ -2704,7 +3570,7 @@
               <w:rPr>
                 <w:sz w:val="20"/>
               </w:rPr>
-              <w:t>Altura libre de la columna (del nivel de cimentación a la viga de cubierta N+4.90).</w:t>
+              <w:t>Ejes 2A, 2B, 3A, 3B (despiece del plano).</w:t>
             </w:r>
           </w:p>
         </w:tc>
@@ -2719,7 +3585,7 @@
               <w:rPr>
                 <w:sz w:val="20"/>
               </w:rPr>
-              <w:t>Cantidad = 10</w:t>
+              <w:t>Total 8 columnas</w:t>
             </w:r>
           </w:p>
         </w:tc>
@@ -2732,7 +3598,7 @@
               <w:rPr>
                 <w:sz w:val="20"/>
               </w:rPr>
-              <w:t>Número de columnas del módulo (5 ejes × 2 líneas A y B).</w:t>
+              <w:t>Contadas y verificadas en el despiece (NO son 10).</w:t>
             </w:r>
           </w:p>
         </w:tc>
@@ -2770,7 +3636,7 @@
           <w:color w:val="1F3B73"/>
           <w:sz w:val="23"/>
         </w:rPr>
-        <w:t>V = 0.40 × 0.40 × 4.90 × 10</w:t>
+        <w:t>V = (0.40×0.40×4.70×4) + (0.50×0.50×4.90×4) = 3.01 + 4.90</w:t>
       </w:r>
     </w:p>
     <w:p>
@@ -2780,18 +3646,32 @@
           <w:color w:val="006600"/>
           <w:sz w:val="23"/>
         </w:rPr>
-        <w:t>➜ Resultado: 7.84 m³</w:t>
+        <w:t>➜ Resultado: 7.91 m³</w:t>
       </w:r>
     </w:p>
     <w:p>
       <w:pPr>
+        <w:spacing w:after="120"/>
+      </w:pPr>
+      <w:r>
+        <w:rPr>
+          <w:b w:val="0"/>
+          <w:i/>
+          <w:color w:val="B06000"/>
+          <w:sz w:val="20"/>
+        </w:rPr>
+        <w:t>Observación: CORREGIDO: antes se había puesto 10 columnas iguales de 0.40×0.40. El plano muestra 8 columnas en dos tipos.</w:t>
+      </w:r>
+    </w:p>
+    <w:p>
+      <w:pPr>
         <w:jc w:val="center"/>
       </w:pPr>
       <w:r>
         <w:drawing>
           <wp:inline xmlns:a="http://schemas.openxmlformats.org/drawingml/2006/main" xmlns:pic="http://schemas.openxmlformats.org/drawingml/2006/picture">
-            <wp:extent cx="5400000" cy="7943304"/>
-            <wp:docPr id="8" name="Picture 8"/>
+            <wp:extent cx="5400000" cy="3657200"/>
+            <wp:docPr id="11" name="Picture 11"/>
             <wp:cNvGraphicFramePr>
               <a:graphicFrameLocks noChangeAspect="1"/>
             </wp:cNvGraphicFramePr>
@@ -2799,11 +3679,11 @@
               <a:graphicData uri="http://schemas.openxmlformats.org/drawingml/2006/picture">
                 <pic:pic>
                   <pic:nvPicPr>
-                    <pic:cNvPr id="0" name="esq_columna.png"/>
+                    <pic:cNvPr id="0" name="esq_columna2.png"/>
                     <pic:cNvPicPr/>
                   </pic:nvPicPr>
                   <pic:blipFill>
-                    <a:blip r:embed="rId16"/>
+                    <a:blip r:embed="rId19"/>
                     <a:stretch>
                       <a:fillRect/>
                     </a:stretch>
@@ -2811,7 +3691,7 @@
                   <pic:spPr>
                     <a:xfrm>
                       <a:off x="0" y="0"/>
-                      <a:ext cx="5400000" cy="7943304"/>
+                      <a:ext cx="5400000" cy="3657200"/>
                     </a:xfrm>
                     <a:prstGeom prst="rect"/>
                   </pic:spPr>
@@ -2834,7 +3714,7 @@
           <w:color w:val="404040"/>
           <w:sz w:val="18"/>
         </w:rPr>
-        <w:t>Esquema 4. Columna tipo 0.40×0.40, h=4.90 m (10 unidades).</w:t>
+        <w:t>Esquema 4. Columnas: 8 unidades en dos tipos.</w:t>
       </w:r>
     </w:p>
     <w:p>
@@ -2848,7 +3728,7 @@
           <w:color w:val="404040"/>
           <w:sz w:val="20"/>
         </w:rPr>
-        <w:t>Foto de referencia para el formato: Figura 3.2 (planta y detalle de columnas): sección 0.40×0.40, altura 4.90.</w:t>
+        <w:t>Foto de referencia para el formato: Figura 3.2 y recortes del despiece (Sección 4).</w:t>
       </w:r>
     </w:p>
     <w:p>
@@ -2944,7 +3824,7 @@
               <w:rPr>
                 <w:sz w:val="20"/>
               </w:rPr>
-              <w:t>Dimensión de la viga de cubierta (rótulo del plano de cubierta).</w:t>
+              <w:t>Rótulo de las vigas de cubierta.</w:t>
             </w:r>
           </w:p>
         </w:tc>
@@ -2959,7 +3839,7 @@
               <w:rPr>
                 <w:sz w:val="20"/>
               </w:rPr>
-              <w:t>Long. = 19.80 m × 2</w:t>
+              <w:t>Long. 19.80 × 2</w:t>
             </w:r>
           </w:p>
         </w:tc>
@@ -2972,7 +3852,7 @@
               <w:rPr>
                 <w:sz w:val="20"/>
               </w:rPr>
-              <w:t>Vigas longitudinales sobre ejes A y B.</w:t>
+              <w:t>Vigas sobre ejes A y B.</w:t>
             </w:r>
           </w:p>
         </w:tc>
@@ -2987,7 +3867,7 @@
               <w:rPr>
                 <w:sz w:val="20"/>
               </w:rPr>
-              <w:t>Transv. = 7.30 m × 5</w:t>
+              <w:t>Transv. 7.30 × 5</w:t>
             </w:r>
           </w:p>
         </w:tc>
@@ -3000,7 +3880,7 @@
               <w:rPr>
                 <w:sz w:val="20"/>
               </w:rPr>
-              <w:t>Vigas transversales en los 5 ejes.</w:t>
+              <w:t>5 ejes.</w:t>
             </w:r>
           </w:p>
         </w:tc>
@@ -3038,7 +3918,7 @@
           <w:color w:val="1F3B73"/>
           <w:sz w:val="23"/>
         </w:rPr>
-        <w:t>V = (0.40×0.50×19.80×2) + (0.40×0.50×7.30×5) = 7.92 + 7.30</w:t>
+        <w:t>V = (0.40×0.50×19.80×2)+(0.40×0.50×7.30×5) = 7.92 + 7.30</w:t>
       </w:r>
     </w:p>
     <w:p>
@@ -3062,7 +3942,7 @@
           <w:color w:val="404040"/>
           <w:sz w:val="20"/>
         </w:rPr>
-        <w:t>Foto de referencia para el formato: Figura 3.3 (placa de cubierta): vigas VG rotuladas B=0.40 H=0.50.</w:t>
+        <w:t>Foto de referencia para el formato: Figura 3.3 (VG rotuladas B=0.40 H=0.50).</w:t>
       </w:r>
     </w:p>
     <w:p>
@@ -3145,7 +4025,7 @@
               <w:rPr>
                 <w:sz w:val="20"/>
               </w:rPr>
-              <w:t>Ancho = 9.85 m / Largo = 21.95 m</w:t>
+              <w:t>Ancho = 9.85 / Largo = 21.95</w:t>
             </w:r>
           </w:p>
         </w:tc>
@@ -3158,7 +4038,7 @@
               <w:rPr>
                 <w:sz w:val="20"/>
               </w:rPr>
-              <w:t>Huella del módulo.</w:t>
+              <w:t>Huella (POR CONFIRMAR).</w:t>
             </w:r>
           </w:p>
         </w:tc>
@@ -3186,7 +4066,7 @@
               <w:rPr>
                 <w:sz w:val="20"/>
               </w:rPr>
-              <w:t>Espesor de la placa de contrapiso (rótulo del plano de cimentación).</w:t>
+              <w:t>Espesor de la placa (rótulo del plano).</w:t>
             </w:r>
           </w:p>
         </w:tc>
@@ -3239,6 +4119,20 @@
     </w:p>
     <w:p>
       <w:pPr>
+        <w:spacing w:after="120"/>
+      </w:pPr>
+      <w:r>
+        <w:rPr>
+          <w:b w:val="0"/>
+          <w:i/>
+          <w:color w:val="B06000"/>
+          <w:sz w:val="20"/>
+        </w:rPr>
+        <w:t>Observación: La huella 9.85×21.95 no está acotada en los PDF; confirmar en el DWG y pegar el pantallazo de la cota.</w:t>
+      </w:r>
+    </w:p>
+    <w:p>
+      <w:pPr>
         <w:spacing w:after="240"/>
       </w:pPr>
       <w:r>
@@ -3248,7 +4142,7 @@
           <w:color w:val="404040"/>
           <w:sz w:val="20"/>
         </w:rPr>
-        <w:t>Foto de referencia para el formato: Figura 3.1 (placa de piso e=0.10) + Esquema 1.</w:t>
+        <w:t>Foto de referencia para el formato: Figura 3.1 (placa e=0.10) + Esquema 1.</w:t>
       </w:r>
     </w:p>
     <w:p>
@@ -3259,7 +4153,7 @@
         <w:rPr>
           <w:color w:val="1F3B73"/>
         </w:rPr>
-        <w:t>Ítem 4.3.3.1 — Placas de cubierta en concreto  (M2)</w:t>
+        <w:t>Ítem 4.3.3.1 — Placa de cubierta aligerada  (M2)</w:t>
       </w:r>
     </w:p>
     <w:p>
@@ -3344,7 +4238,7 @@
               <w:rPr>
                 <w:sz w:val="20"/>
               </w:rPr>
-              <w:t>Ancho de la placa (luz transversal).</w:t>
+              <w:t>Luz transversal.</w:t>
             </w:r>
           </w:p>
         </w:tc>
@@ -3359,7 +4253,7 @@
               <w:rPr>
                 <w:sz w:val="20"/>
               </w:rPr>
-              <w:t>Largo = 5.55 + 6.10 + 6.87 = 18.52 m</w:t>
+              <w:t>Largo = 5.55+6.10+6.87 = 18.52 m</w:t>
             </w:r>
           </w:p>
         </w:tc>
@@ -3372,7 +4266,7 @@
               <w:rPr>
                 <w:sz w:val="20"/>
               </w:rPr>
-              <w:t>Suma de los tramos de la cubierta a lo largo del módulo.</w:t>
+              <w:t>Desarrollo de la cubierta.</w:t>
             </w:r>
           </w:p>
         </w:tc>
@@ -3387,7 +4281,7 @@
               <w:rPr>
                 <w:sz w:val="20"/>
               </w:rPr>
-              <w:t>Espesor = 0.08 m</w:t>
+              <w:t>Alto = 1</w:t>
             </w:r>
           </w:p>
         </w:tc>
@@ -3400,7 +4294,7 @@
               <w:rPr>
                 <w:sz w:val="20"/>
               </w:rPr>
-              <w:t>Espesor de la losa aligerada (rótulo del plano de cubierta).</w:t>
+              <w:t>Item por M2: se toma el ÁREA de losa.</w:t>
             </w:r>
           </w:p>
         </w:tc>
@@ -3415,7 +4309,7 @@
               <w:rPr>
                 <w:sz w:val="20"/>
               </w:rPr>
-              <w:t>Viguetas 0.20 × 0.32, largo 18.52, cantidad 6</w:t>
+              <w:t>Viguetas 0.20 × 0.40</w:t>
             </w:r>
           </w:p>
         </w:tc>
@@ -3428,7 +4322,7 @@
               <w:rPr>
                 <w:sz w:val="20"/>
               </w:rPr>
-              <w:t>Nervios/viguetas de la losa aligerada.</w:t>
+              <w:t>Incluidas en el m² de losa aligerada (el concreto va en el APU).</w:t>
             </w:r>
           </w:p>
         </w:tc>
@@ -3466,7 +4360,7 @@
           <w:color w:val="1F3B73"/>
           <w:sz w:val="23"/>
         </w:rPr>
-        <w:t>Placa = 7.30×0.08×18.52  +  Viguetas = 0.20×0.32×18.52×6</w:t>
+        <w:t>A = 7.30 × 1 × 18.52 × 1</w:t>
       </w:r>
     </w:p>
     <w:p>
@@ -3476,7 +4370,7 @@
           <w:color w:val="006600"/>
           <w:sz w:val="23"/>
         </w:rPr>
-        <w:t>➜ Resultado: Placa 10.82 + viguetas 7.11  (según memoria)</w:t>
+        <w:t>➜ Resultado: 135.20 m²</w:t>
       </w:r>
     </w:p>
     <w:p>
@@ -3490,7 +4384,7 @@
           <w:color w:val="B06000"/>
           <w:sz w:val="20"/>
         </w:rPr>
-        <w:t>Observación: En el formato la unidad aparece como M2 pero la fórmula incluye el espesor (queda en volumen). Verifica con tu profesor si la placa aligerada se paga por área (7.30×18.52 ≈ 135.2 m²) o por volumen de concreto; ajusta según el APU 4.3.3.</w:t>
+        <w:t>Observación: CORREGIDO: item por M2 → área de losa (antes multiplicaba por el espesor). Viguetas 0.20×0.40 (no 0.20×0.32).</w:t>
       </w:r>
     </w:p>
     <w:p>
@@ -3501,7 +4395,7 @@
         <w:drawing>
           <wp:inline xmlns:a="http://schemas.openxmlformats.org/drawingml/2006/main" xmlns:pic="http://schemas.openxmlformats.org/drawingml/2006/picture">
             <wp:extent cx="5400000" cy="2950574"/>
-            <wp:docPr id="9" name="Picture 9"/>
+            <wp:docPr id="12" name="Picture 12"/>
             <wp:cNvGraphicFramePr>
               <a:graphicFrameLocks noChangeAspect="1"/>
             </wp:cNvGraphicFramePr>
@@ -3513,7 +4407,7 @@
                     <pic:cNvPicPr/>
                   </pic:nvPicPr>
                   <pic:blipFill>
-                    <a:blip r:embed="rId17"/>
+                    <a:blip r:embed="rId20"/>
                     <a:stretch>
                       <a:fillRect/>
                     </a:stretch>
@@ -3544,7 +4438,7 @@
           <w:color w:val="404040"/>
           <w:sz w:val="18"/>
         </w:rPr>
-        <w:t>Esquema 5. Placa de cubierta aligerada 7.30×18.52, e=0.08, con 6 viguetas.</w:t>
+        <w:t>Esquema 5. Placa de cubierta aligerada y viguetas.</w:t>
       </w:r>
     </w:p>
     <w:p>
@@ -3558,7 +4452,7 @@
           <w:color w:val="404040"/>
           <w:sz w:val="20"/>
         </w:rPr>
-        <w:t>Foto de referencia para el formato: Figura 3.3 (placa aligerada e=0.08) + Esquema 5.</w:t>
+        <w:t>Foto de referencia para el formato: Figura 3.3 + recorte de sección (Sección 4) + Esquema 5.</w:t>
       </w:r>
     </w:p>
     <w:p>
@@ -3641,7 +4535,7 @@
               <w:rPr>
                 <w:sz w:val="20"/>
               </w:rPr>
-              <w:t>Long. 10 col × (2#6 + 2#7), L=5.95 m</w:t>
+              <w:t>Tipo 1: 4 col × 6#6, L=5.85</w:t>
             </w:r>
           </w:p>
         </w:tc>
@@ -3654,7 +4548,7 @@
               <w:rPr>
                 <w:sz w:val="20"/>
               </w:rPr>
-              <w:t>Refuerzo longitudinal de las 10 columnas (despiece del plano).</w:t>
+              <w:t>Refuerzo longitudinal columnas 0.40×0.40.</w:t>
             </w:r>
           </w:p>
         </w:tc>
@@ -3669,7 +4563,7 @@
               <w:rPr>
                 <w:sz w:val="20"/>
               </w:rPr>
-              <w:t>Estribos #2 c/0.20 m</w:t>
+              <w:t>Tipo 2: 4 col × (4#6+4#7), L=5.95</w:t>
             </w:r>
           </w:p>
         </w:tc>
@@ -3682,7 +4576,7 @@
               <w:rPr>
                 <w:sz w:val="20"/>
               </w:rPr>
-              <w:t>Confinamiento indicado en el detalle.</w:t>
+              <w:t>Refuerzo longitudinal columnas 0.50×0.50.</w:t>
             </w:r>
           </w:p>
         </w:tc>
@@ -3697,7 +4591,7 @@
               <w:rPr>
                 <w:sz w:val="20"/>
               </w:rPr>
-              <w:t>+10 %</w:t>
+              <w:t>Estribos + 10 %</w:t>
             </w:r>
           </w:p>
         </w:tc>
@@ -3710,7 +4604,7 @@
               <w:rPr>
                 <w:sz w:val="20"/>
               </w:rPr>
-              <w:t>Desperdicio y traslapos.</w:t>
+              <w:t>Confinamiento y desperdicio.</w:t>
             </w:r>
           </w:p>
         </w:tc>
@@ -3748,7 +4642,7 @@
           <w:color w:val="1F3B73"/>
           <w:sz w:val="23"/>
         </w:rPr>
-        <w:t>Long. = 628 kg  +  Estribos = 91.9 kg  =  719.8 kg  ×1.10</w:t>
+        <w:t>Estimación con +10 % (ver cartilla de hierros)</w:t>
       </w:r>
     </w:p>
     <w:p>
@@ -3758,7 +4652,21 @@
           <w:color w:val="006600"/>
           <w:sz w:val="23"/>
         </w:rPr>
-        <w:t>➜ Resultado: 791.8 kg</w:t>
+        <w:t>➜ Resultado: ≈ 791.8 kg (recalcular en cartilla)</w:t>
+      </w:r>
+    </w:p>
+    <w:p>
+      <w:pPr>
+        <w:spacing w:after="120"/>
+      </w:pPr>
+      <w:r>
+        <w:rPr>
+          <w:b w:val="0"/>
+          <w:i/>
+          <w:color w:val="B06000"/>
+          <w:sz w:val="20"/>
+        </w:rPr>
+        <w:t>Observación: CORREGIDO en descripción: el refuerzo difiere por tipo (Tipo1 6#6; Tipo2 4#6+4#7) y son 8 columnas. El kg exacto sale de la cartilla de hierros (DLNET).</w:t>
       </w:r>
     </w:p>
     <w:p>
@@ -3772,7 +4680,7 @@
           <w:color w:val="404040"/>
           <w:sz w:val="20"/>
         </w:rPr>
-        <w:t>Foto de referencia para el formato: Figura 3.2 (despiece de columnas): 2#6 + 2#7, L≈5.95 m, estribos.</w:t>
+        <w:t>Foto de referencia para el formato: Figura 3.2 y recortes del despiece.</w:t>
       </w:r>
     </w:p>
     <w:p>
@@ -3855,7 +4763,7 @@
               <w:rPr>
                 <w:sz w:val="20"/>
               </w:rPr>
-              <w:t>Long. 2#6 + 2#7 + 2#6</w:t>
+              <w:t>2#6 + 2#7 + 2#6 longitudinal</w:t>
             </w:r>
           </w:p>
         </w:tc>
@@ -3868,7 +4776,7 @@
               <w:rPr>
                 <w:sz w:val="20"/>
               </w:rPr>
-              <w:t>Refuerzo longitudinal de las vigas de cubierta.</w:t>
+              <w:t>Despiece de las vigas de cubierta.</w:t>
             </w:r>
           </w:p>
         </w:tc>
@@ -3883,7 +4791,7 @@
               <w:rPr>
                 <w:sz w:val="20"/>
               </w:rPr>
-              <w:t>Estribos #3 c/0.15 m</w:t>
+              <w:t>Estribos #3 c/0.15</w:t>
             </w:r>
           </w:p>
         </w:tc>
@@ -3896,7 +4804,7 @@
               <w:rPr>
                 <w:sz w:val="20"/>
               </w:rPr>
-              <w:t>Separación de estribos del plano.</w:t>
+              <w:t>Del plano.</w:t>
             </w:r>
           </w:p>
         </w:tc>
@@ -3962,7 +4870,7 @@
           <w:color w:val="1F3B73"/>
           <w:sz w:val="23"/>
         </w:rPr>
-        <w:t>Long. = 1 143.3 kg  +  Estribos = 454.6 kg  =  1 597.9 kg  ×1.10</w:t>
+        <w:t>1 143.3 kg (long.) + 454.6 kg (estribos) = 1 597.9 kg × 1.10</w:t>
       </w:r>
     </w:p>
     <w:p>
@@ -3977,6 +4885,20 @@
     </w:p>
     <w:p>
       <w:pPr>
+        <w:spacing w:after="120"/>
+      </w:pPr>
+      <w:r>
+        <w:rPr>
+          <w:b w:val="0"/>
+          <w:i/>
+          <w:color w:val="B06000"/>
+          <w:sz w:val="20"/>
+        </w:rPr>
+        <w:t>Observación: Valor exacto desde la cartilla de hierros.</w:t>
+      </w:r>
+    </w:p>
+    <w:p>
+      <w:pPr>
         <w:spacing w:after="240"/>
       </w:pPr>
       <w:r>
@@ -3986,7 +4908,7 @@
           <w:color w:val="404040"/>
           <w:sz w:val="20"/>
         </w:rPr>
-        <w:t>Foto de referencia para el formato: Figura 3.3 (despiece de vigas de cubierta): 2#6 + 2#7 + 2#6, estribos #3 c/0.15.</w:t>
+        <w:t>Foto de referencia para el formato: Figura 3.3 (despiece de vigas).</w:t>
       </w:r>
     </w:p>
     <w:p>
@@ -4098,7 +5020,7 @@
               <w:rPr>
                 <w:sz w:val="20"/>
               </w:rPr>
-              <w:t>Suma de la longitud de todos los muros del módulo (medida sobre el plano de mampostería).</w:t>
+              <w:t>Suma de longitudes de todos los muros (POR CONFIRMAR en DWG).</w:t>
             </w:r>
           </w:p>
         </w:tc>
@@ -4126,7 +5048,7 @@
               <w:rPr>
                 <w:sz w:val="20"/>
               </w:rPr>
-              <w:t>Altura libre del muro (piso a viga de cubierta).</w:t>
+              <w:t>Altura libre piso a viga de cubierta.</w:t>
             </w:r>
           </w:p>
         </w:tc>
@@ -4154,7 +5076,7 @@
               <w:rPr>
                 <w:sz w:val="20"/>
               </w:rPr>
-              <w:t>Se resta el área de puertas y ventanas (aprox. 20 % del área bruta).</w:t>
+              <w:t>Puertas y ventanas.</w:t>
             </w:r>
           </w:p>
         </w:tc>
@@ -4207,13 +5129,27 @@
     </w:p>
     <w:p>
       <w:pPr>
+        <w:spacing w:after="120"/>
+      </w:pPr>
+      <w:r>
+        <w:rPr>
+          <w:b w:val="0"/>
+          <w:i/>
+          <w:color w:val="B06000"/>
+          <w:sz w:val="20"/>
+        </w:rPr>
+        <w:t>Observación: Confirmar los 173.60 m midiendo los muros en el plano y adjuntar el pantallazo.</w:t>
+      </w:r>
+    </w:p>
+    <w:p>
+      <w:pPr>
         <w:jc w:val="center"/>
       </w:pPr>
       <w:r>
         <w:drawing>
           <wp:inline xmlns:a="http://schemas.openxmlformats.org/drawingml/2006/main" xmlns:pic="http://schemas.openxmlformats.org/drawingml/2006/picture">
             <wp:extent cx="5400000" cy="2691554"/>
-            <wp:docPr id="10" name="Picture 10"/>
+            <wp:docPr id="13" name="Picture 13"/>
             <wp:cNvGraphicFramePr>
               <a:graphicFrameLocks noChangeAspect="1"/>
             </wp:cNvGraphicFramePr>
@@ -4225,7 +5161,7 @@
                     <pic:cNvPicPr/>
                   </pic:nvPicPr>
                   <pic:blipFill>
-                    <a:blip r:embed="rId18"/>
+                    <a:blip r:embed="rId21"/>
                     <a:stretch>
                       <a:fillRect/>
                     </a:stretch>
@@ -4256,7 +5192,7 @@
           <w:color w:val="404040"/>
           <w:sz w:val="18"/>
         </w:rPr>
-        <w:t>Esquema 6. Elevación de muro: área bruta menos 20 % de vanos.</w:t>
+        <w:t>Esquema 6. Elevación de muro (área bruta − 20 % vanos).</w:t>
       </w:r>
     </w:p>
     <w:p>
@@ -4270,7 +5206,7 @@
           <w:color w:val="404040"/>
           <w:sz w:val="20"/>
         </w:rPr>
-        <w:t>Foto de referencia para el formato: Figura 3.4 / plano de mampostería — se miden las longitudes de todos los muros y su altura.</w:t>
+        <w:t>Foto de referencia para el formato: Figura 3.4 / plano de mampostería.</w:t>
       </w:r>
     </w:p>
     <w:p>
@@ -4366,7 +5302,7 @@
               <w:rPr>
                 <w:sz w:val="20"/>
               </w:rPr>
-              <w:t>Número de columnetas de confinamiento (una cada ≈3 m a lo largo de los muros).</w:t>
+              <w:t>Una columneta cada ~3 m (POR CONFIRMAR contando en el plano).</w:t>
             </w:r>
           </w:p>
         </w:tc>
@@ -4394,7 +5330,7 @@
               <w:rPr>
                 <w:sz w:val="20"/>
               </w:rPr>
-              <w:t>Altura de cada columneta (igual a la del muro).</w:t>
+              <w:t>Igual a la altura del muro.</w:t>
             </w:r>
           </w:p>
         </w:tc>
@@ -4422,7 +5358,7 @@
               <w:rPr>
                 <w:sz w:val="20"/>
               </w:rPr>
-              <w:t>Se mide por longitud (metro lineal).</w:t>
+              <w:t>Se mide por longitud (ml).</w:t>
             </w:r>
           </w:p>
         </w:tc>
@@ -4475,6 +5411,20 @@
     </w:p>
     <w:p>
       <w:pPr>
+        <w:spacing w:after="120"/>
+      </w:pPr>
+      <w:r>
+        <w:rPr>
+          <w:b w:val="0"/>
+          <w:i/>
+          <w:color w:val="B06000"/>
+          <w:sz w:val="20"/>
+        </w:rPr>
+        <w:t>Observación: Confirmar el número de columnetas contándolas en el plano de mampostería.</w:t>
+      </w:r>
+    </w:p>
+    <w:p>
+      <w:pPr>
         <w:spacing w:after="240"/>
       </w:pPr>
       <w:r>
@@ -4484,7 +5434,7 @@
           <w:color w:val="404040"/>
           <w:sz w:val="20"/>
         </w:rPr>
-        <w:t>Foto de referencia para el formato: Figura 3.4 (detalles de confinamiento) — columnetas cada 3 m.</w:t>
+        <w:t>Foto de referencia para el formato: Figura 3.4.</w:t>
       </w:r>
     </w:p>
     <w:p>
@@ -4580,7 +5530,7 @@
               <w:rPr>
                 <w:sz w:val="20"/>
               </w:rPr>
-              <w:t>Tomada del ítem 5.1.1 (muros).</w:t>
+              <w:t>Tomada del ítem 5.1.1.</w:t>
             </w:r>
           </w:p>
         </w:tc>
@@ -4608,7 +5558,7 @@
               <w:rPr>
                 <w:sz w:val="20"/>
               </w:rPr>
-              <w:t>Porcentaje del área de muro que lleva pañete (según alcance).</w:t>
+              <w:t>Porcentaje del área de muro que lleva pañete.</w:t>
             </w:r>
           </w:p>
         </w:tc>
@@ -4670,7 +5620,7 @@
           <w:color w:val="404040"/>
           <w:sz w:val="20"/>
         </w:rPr>
-        <w:t>Foto de referencia para el formato: Figura 3.4 — se pañeta un porcentaje del área de muro.</w:t>
+        <w:t>Foto de referencia para el formato: Figura 3.4.</w:t>
       </w:r>
     </w:p>
     <w:p>
@@ -4753,7 +5703,7 @@
               <w:rPr>
                 <w:sz w:val="20"/>
               </w:rPr>
-              <w:t>Long. 4#3</w:t>
+              <w:t>4#3 longitudinal</w:t>
             </w:r>
           </w:p>
         </w:tc>
@@ -4766,7 +5716,7 @@
               <w:rPr>
                 <w:sz w:val="20"/>
               </w:rPr>
-              <w:t>Refuerzo longitudinal de columnetas y vigas de confinamiento.</w:t>
+              <w:t>Columnetas y vigas de confinamiento.</w:t>
             </w:r>
           </w:p>
         </w:tc>
@@ -4781,7 +5731,7 @@
               <w:rPr>
                 <w:sz w:val="20"/>
               </w:rPr>
-              <w:t>Estribos #2 c/0.20 m</w:t>
+              <w:t>Estribos #2 c/0.20</w:t>
             </w:r>
           </w:p>
         </w:tc>
@@ -4794,7 +5744,7 @@
               <w:rPr>
                 <w:sz w:val="20"/>
               </w:rPr>
-              <w:t>Confinamiento del plano de detalles.</w:t>
+              <w:t>Del detalle.</w:t>
             </w:r>
           </w:p>
         </w:tc>
@@ -4822,7 +5772,7 @@
               <w:rPr>
                 <w:sz w:val="20"/>
               </w:rPr>
-              <w:t>Desperdicio y traslapos.</w:t>
+              <w:t>Desperdicio.</w:t>
             </w:r>
           </w:p>
         </w:tc>
@@ -4860,7 +5810,7 @@
           <w:color w:val="1F3B73"/>
           <w:sz w:val="23"/>
         </w:rPr>
-        <w:t>Long. = 376.8 kg  +  Estribos = 105.1 kg  =  481.9 kg  ×1.10</w:t>
+        <w:t>376.8 kg (long.) + 105.1 kg (estribos) = 481.9 kg × 1.10</w:t>
       </w:r>
     </w:p>
     <w:p>
@@ -4875,6 +5825,20 @@
     </w:p>
     <w:p>
       <w:pPr>
+        <w:spacing w:after="120"/>
+      </w:pPr>
+      <w:r>
+        <w:rPr>
+          <w:b w:val="0"/>
+          <w:i/>
+          <w:color w:val="B06000"/>
+          <w:sz w:val="20"/>
+        </w:rPr>
+        <w:t>Observación: Valor exacto desde la cartilla de hierros.</w:t>
+      </w:r>
+    </w:p>
+    <w:p>
+      <w:pPr>
         <w:spacing w:after="240"/>
       </w:pPr>
       <w:r>
@@ -4884,7 +5848,7 @@
           <w:color w:val="404040"/>
           <w:sz w:val="20"/>
         </w:rPr>
-        <w:t>Foto de referencia para el formato: Figura 3.4 (despiece de confinamiento): 4#3 longitudinal, estribos #2 c/0.20.</w:t>
+        <w:t>Foto de referencia para el formato: Figura 3.4 (despiece de confinamiento).</w:t>
       </w:r>
     </w:p>
     <w:p>
@@ -4996,7 +5960,7 @@
               <w:rPr>
                 <w:sz w:val="20"/>
               </w:rPr>
-              <w:t>Se toma el área de cada zona/espacio del plano arquitectónico o de adoquín: 18.62 + 17.49 + 22.25 + 7.76 + 14.60 + 15.00 + 1.91 + 1.91 + 15.76.</w:t>
+              <w:t>18.62+17.49+22.25+7.76+14.60+15.00+1.91+1.91+15.76 (POR CONFIRMAR midiendo en el plano).</w:t>
             </w:r>
           </w:p>
         </w:tc>
@@ -5024,7 +5988,7 @@
               <w:rPr>
                 <w:sz w:val="20"/>
               </w:rPr>
-              <w:t>Cada área se cuenta una vez.</w:t>
+              <w:t>Cada área una vez.</w:t>
             </w:r>
           </w:p>
         </w:tc>
@@ -5086,7 +6050,7 @@
           <w:color w:val="B06000"/>
           <w:sz w:val="20"/>
         </w:rPr>
-        <w:t>Observación: Cada área se lee/mide directamente sobre el plano de adoquín o arquitectónico; conviene pegar el pantallazo con esas zonas resaltadas.</w:t>
+        <w:t>Observación: El plano de adoquín entregado en PDF salió sin cotas; medir las zonas exteriores en el DWG/arquitectónico y adjuntar el pantallazo.</w:t>
       </w:r>
     </w:p>
     <w:p>
@@ -5100,7 +6064,7 @@
           <w:color w:val="404040"/>
           <w:sz w:val="20"/>
         </w:rPr>
-        <w:t>Foto de referencia para el formato: Figura 3.5 (planta arquitectónica) — se suman las áreas de las zonas que van en adoquín.</w:t>
+        <w:t>Foto de referencia para el formato: Figura 3.5 / plano de adoquín.</w:t>
       </w:r>
     </w:p>
     <w:p>
@@ -5116,20 +6080,7 @@
         <w:rPr>
           <w:color w:val="1F3B73"/>
         </w:rPr>
-        <w:t>5. Resumen de cantidades de obra</w:t>
-      </w:r>
-    </w:p>
-    <w:p>
-      <w:pPr>
-        <w:spacing w:after="120"/>
-      </w:pPr>
-      <w:r>
-        <w:rPr>
-          <w:b w:val="0"/>
-          <w:i w:val="0"/>
-          <w:sz w:val="22"/>
-        </w:rPr>
-        <w:t>Tabla consolidada de las cantidades calculadas (tal como quedan en la memoria):</w:t>
+        <w:t>6. Resumen de cantidades de obra (corregido)</w:t>
       </w:r>
     </w:p>
     <w:tbl>
@@ -5139,15 +6090,16 @@
         <w:tblLook w:firstColumn="1" w:firstRow="1" w:lastColumn="0" w:lastRow="0" w:noHBand="0" w:noVBand="1" w:val="04A0"/>
       </w:tblPr>
       <w:tblGrid>
-        <w:gridCol w:w="2160"/>
-        <w:gridCol w:w="2160"/>
-        <w:gridCol w:w="2160"/>
-        <w:gridCol w:w="2160"/>
+        <w:gridCol w:w="1728"/>
+        <w:gridCol w:w="1728"/>
+        <w:gridCol w:w="1728"/>
+        <w:gridCol w:w="1728"/>
+        <w:gridCol w:w="1728"/>
       </w:tblGrid>
       <w:tr>
         <w:tc>
           <w:tcPr>
-            <w:tcW w:type="dxa" w:w="2160"/>
+            <w:tcW w:type="dxa" w:w="1728"/>
           </w:tcPr>
           <w:p>
             <w:r>
@@ -5157,7 +6109,7 @@
         </w:tc>
         <w:tc>
           <w:tcPr>
-            <w:tcW w:type="dxa" w:w="2160"/>
+            <w:tcW w:type="dxa" w:w="1728"/>
           </w:tcPr>
           <w:p>
             <w:r>
@@ -5167,7 +6119,7 @@
         </w:tc>
         <w:tc>
           <w:tcPr>
-            <w:tcW w:type="dxa" w:w="2160"/>
+            <w:tcW w:type="dxa" w:w="1728"/>
           </w:tcPr>
           <w:p>
             <w:r>
@@ -5177,7 +6129,7 @@
         </w:tc>
         <w:tc>
           <w:tcPr>
-            <w:tcW w:type="dxa" w:w="2160"/>
+            <w:tcW w:type="dxa" w:w="1728"/>
           </w:tcPr>
           <w:p>
             <w:r>
@@ -5185,16 +6137,26 @@
             </w:r>
           </w:p>
         </w:tc>
+        <w:tc>
+          <w:tcPr>
+            <w:tcW w:type="dxa" w:w="1728"/>
+          </w:tcPr>
+          <w:p>
+            <w:r>
+              <w:t>Estado</w:t>
+            </w:r>
+          </w:p>
+        </w:tc>
       </w:tr>
       <w:tr>
         <w:tc>
           <w:tcPr>
-            <w:tcW w:type="dxa" w:w="2160"/>
+            <w:tcW w:type="dxa" w:w="1728"/>
           </w:tcPr>
           <w:p>
             <w:r>
               <w:rPr>
-                <w:sz w:val="19"/>
+                <w:sz w:val="18"/>
               </w:rPr>
               <w:t>2.1.1</w:t>
             </w:r>
@@ -5202,12 +6164,12 @@
         </w:tc>
         <w:tc>
           <w:tcPr>
-            <w:tcW w:type="dxa" w:w="2160"/>
+            <w:tcW w:type="dxa" w:w="1728"/>
           </w:tcPr>
           <w:p>
             <w:r>
               <w:rPr>
-                <w:sz w:val="19"/>
+                <w:sz w:val="18"/>
               </w:rPr>
               <w:t>Excavación a máquina 0–2 m</w:t>
             </w:r>
@@ -5215,12 +6177,12 @@
         </w:tc>
         <w:tc>
           <w:tcPr>
-            <w:tcW w:type="dxa" w:w="2160"/>
+            <w:tcW w:type="dxa" w:w="1728"/>
           </w:tcPr>
           <w:p>
             <w:r>
               <w:rPr>
-                <w:sz w:val="19"/>
+                <w:sz w:val="18"/>
               </w:rPr>
               <w:t>M3</w:t>
             </w:r>
@@ -5228,14 +6190,27 @@
         </w:tc>
         <w:tc>
           <w:tcPr>
-            <w:tcW w:type="dxa" w:w="2160"/>
+            <w:tcW w:type="dxa" w:w="1728"/>
           </w:tcPr>
           <w:p>
             <w:r>
               <w:rPr>
-                <w:sz w:val="19"/>
+                <w:sz w:val="18"/>
               </w:rPr>
               <w:t>118.92</w:t>
+            </w:r>
+          </w:p>
+        </w:tc>
+        <w:tc>
+          <w:tcPr>
+            <w:tcW w:type="dxa" w:w="1728"/>
+          </w:tcPr>
+          <w:p>
+            <w:r>
+              <w:rPr>
+                <w:sz w:val="18"/>
+              </w:rPr>
+              <w:t>por confirmar huella</w:t>
             </w:r>
           </w:p>
         </w:tc>
@@ -5243,12 +6218,12 @@
       <w:tr>
         <w:tc>
           <w:tcPr>
-            <w:tcW w:type="dxa" w:w="2160"/>
+            <w:tcW w:type="dxa" w:w="1728"/>
           </w:tcPr>
           <w:p>
             <w:r>
               <w:rPr>
-                <w:sz w:val="19"/>
+                <w:sz w:val="18"/>
               </w:rPr>
               <w:t>2.1.2</w:t>
             </w:r>
@@ -5256,12 +6231,12 @@
         </w:tc>
         <w:tc>
           <w:tcPr>
-            <w:tcW w:type="dxa" w:w="2160"/>
+            <w:tcW w:type="dxa" w:w="1728"/>
           </w:tcPr>
           <w:p>
             <w:r>
               <w:rPr>
-                <w:sz w:val="19"/>
+                <w:sz w:val="18"/>
               </w:rPr>
               <w:t>Relleno sub-base B-400</w:t>
             </w:r>
@@ -5269,12 +6244,12 @@
         </w:tc>
         <w:tc>
           <w:tcPr>
-            <w:tcW w:type="dxa" w:w="2160"/>
+            <w:tcW w:type="dxa" w:w="1728"/>
           </w:tcPr>
           <w:p>
             <w:r>
               <w:rPr>
-                <w:sz w:val="19"/>
+                <w:sz w:val="18"/>
               </w:rPr>
               <w:t>M3</w:t>
             </w:r>
@@ -5282,14 +6257,27 @@
         </w:tc>
         <w:tc>
           <w:tcPr>
-            <w:tcW w:type="dxa" w:w="2160"/>
+            <w:tcW w:type="dxa" w:w="1728"/>
           </w:tcPr>
           <w:p>
             <w:r>
               <w:rPr>
-                <w:sz w:val="19"/>
+                <w:sz w:val="18"/>
               </w:rPr>
               <w:t>32.44</w:t>
+            </w:r>
+          </w:p>
+        </w:tc>
+        <w:tc>
+          <w:tcPr>
+            <w:tcW w:type="dxa" w:w="1728"/>
+          </w:tcPr>
+          <w:p>
+            <w:r>
+              <w:rPr>
+                <w:sz w:val="18"/>
+              </w:rPr>
+              <w:t>por confirmar huella</w:t>
             </w:r>
           </w:p>
         </w:tc>
@@ -5297,12 +6285,12 @@
       <w:tr>
         <w:tc>
           <w:tcPr>
-            <w:tcW w:type="dxa" w:w="2160"/>
+            <w:tcW w:type="dxa" w:w="1728"/>
           </w:tcPr>
           <w:p>
             <w:r>
               <w:rPr>
-                <w:sz w:val="19"/>
+                <w:sz w:val="18"/>
               </w:rPr>
               <w:t>2.1.3</w:t>
             </w:r>
@@ -5310,12 +6298,12 @@
         </w:tc>
         <w:tc>
           <w:tcPr>
-            <w:tcW w:type="dxa" w:w="2160"/>
+            <w:tcW w:type="dxa" w:w="1728"/>
           </w:tcPr>
           <w:p>
             <w:r>
               <w:rPr>
-                <w:sz w:val="19"/>
+                <w:sz w:val="18"/>
               </w:rPr>
               <w:t>Excavación manual</w:t>
             </w:r>
@@ -5323,12 +6311,12 @@
         </w:tc>
         <w:tc>
           <w:tcPr>
-            <w:tcW w:type="dxa" w:w="2160"/>
+            <w:tcW w:type="dxa" w:w="1728"/>
           </w:tcPr>
           <w:p>
             <w:r>
               <w:rPr>
-                <w:sz w:val="19"/>
+                <w:sz w:val="18"/>
               </w:rPr>
               <w:t>M3</w:t>
             </w:r>
@@ -5336,14 +6324,27 @@
         </w:tc>
         <w:tc>
           <w:tcPr>
-            <w:tcW w:type="dxa" w:w="2160"/>
+            <w:tcW w:type="dxa" w:w="1728"/>
           </w:tcPr>
           <w:p>
             <w:r>
               <w:rPr>
-                <w:sz w:val="19"/>
+                <w:sz w:val="18"/>
               </w:rPr>
               <w:t>12.18</w:t>
+            </w:r>
+          </w:p>
+        </w:tc>
+        <w:tc>
+          <w:tcPr>
+            <w:tcW w:type="dxa" w:w="1728"/>
+          </w:tcPr>
+          <w:p>
+            <w:r>
+              <w:rPr>
+                <w:sz w:val="18"/>
+              </w:rPr>
+              <w:t>verificado</w:t>
             </w:r>
           </w:p>
         </w:tc>
@@ -5351,12 +6352,12 @@
       <w:tr>
         <w:tc>
           <w:tcPr>
-            <w:tcW w:type="dxa" w:w="2160"/>
+            <w:tcW w:type="dxa" w:w="1728"/>
           </w:tcPr>
           <w:p>
             <w:r>
               <w:rPr>
-                <w:sz w:val="19"/>
+                <w:sz w:val="18"/>
               </w:rPr>
               <w:t>2.1.4</w:t>
             </w:r>
@@ -5364,12 +6365,12 @@
         </w:tc>
         <w:tc>
           <w:tcPr>
-            <w:tcW w:type="dxa" w:w="2160"/>
+            <w:tcW w:type="dxa" w:w="1728"/>
           </w:tcPr>
           <w:p>
             <w:r>
               <w:rPr>
-                <w:sz w:val="19"/>
+                <w:sz w:val="18"/>
               </w:rPr>
               <w:t>Relleno común (recebo)</w:t>
             </w:r>
@@ -5377,12 +6378,12 @@
         </w:tc>
         <w:tc>
           <w:tcPr>
-            <w:tcW w:type="dxa" w:w="2160"/>
+            <w:tcW w:type="dxa" w:w="1728"/>
           </w:tcPr>
           <w:p>
             <w:r>
               <w:rPr>
-                <w:sz w:val="19"/>
+                <w:sz w:val="18"/>
               </w:rPr>
               <w:t>M3</w:t>
             </w:r>
@@ -5390,14 +6391,27 @@
         </w:tc>
         <w:tc>
           <w:tcPr>
-            <w:tcW w:type="dxa" w:w="2160"/>
+            <w:tcW w:type="dxa" w:w="1728"/>
           </w:tcPr>
           <w:p>
             <w:r>
               <w:rPr>
-                <w:sz w:val="19"/>
+                <w:sz w:val="18"/>
               </w:rPr>
               <w:t>43.24</w:t>
+            </w:r>
+          </w:p>
+        </w:tc>
+        <w:tc>
+          <w:tcPr>
+            <w:tcW w:type="dxa" w:w="1728"/>
+          </w:tcPr>
+          <w:p>
+            <w:r>
+              <w:rPr>
+                <w:sz w:val="18"/>
+              </w:rPr>
+              <w:t>por confirmar huella</w:t>
             </w:r>
           </w:p>
         </w:tc>
@@ -5405,12 +6419,12 @@
       <w:tr>
         <w:tc>
           <w:tcPr>
-            <w:tcW w:type="dxa" w:w="2160"/>
+            <w:tcW w:type="dxa" w:w="1728"/>
           </w:tcPr>
           <w:p>
             <w:r>
               <w:rPr>
-                <w:sz w:val="19"/>
+                <w:sz w:val="18"/>
               </w:rPr>
               <w:t>2.1.6</w:t>
             </w:r>
@@ -5418,12 +6432,12 @@
         </w:tc>
         <w:tc>
           <w:tcPr>
-            <w:tcW w:type="dxa" w:w="2160"/>
+            <w:tcW w:type="dxa" w:w="1728"/>
           </w:tcPr>
           <w:p>
             <w:r>
               <w:rPr>
-                <w:sz w:val="19"/>
+                <w:sz w:val="18"/>
               </w:rPr>
               <w:t>Geotextil NT 1600</w:t>
             </w:r>
@@ -5431,12 +6445,12 @@
         </w:tc>
         <w:tc>
           <w:tcPr>
-            <w:tcW w:type="dxa" w:w="2160"/>
+            <w:tcW w:type="dxa" w:w="1728"/>
           </w:tcPr>
           <w:p>
             <w:r>
               <w:rPr>
-                <w:sz w:val="19"/>
+                <w:sz w:val="18"/>
               </w:rPr>
               <w:t>M2</w:t>
             </w:r>
@@ -5444,14 +6458,27 @@
         </w:tc>
         <w:tc>
           <w:tcPr>
-            <w:tcW w:type="dxa" w:w="2160"/>
+            <w:tcW w:type="dxa" w:w="1728"/>
           </w:tcPr>
           <w:p>
             <w:r>
               <w:rPr>
-                <w:sz w:val="19"/>
+                <w:sz w:val="18"/>
               </w:rPr>
               <w:t>216.21</w:t>
+            </w:r>
+          </w:p>
+        </w:tc>
+        <w:tc>
+          <w:tcPr>
+            <w:tcW w:type="dxa" w:w="1728"/>
+          </w:tcPr>
+          <w:p>
+            <w:r>
+              <w:rPr>
+                <w:sz w:val="18"/>
+              </w:rPr>
+              <w:t>por confirmar huella</w:t>
             </w:r>
           </w:p>
         </w:tc>
@@ -5459,12 +6486,12 @@
       <w:tr>
         <w:tc>
           <w:tcPr>
-            <w:tcW w:type="dxa" w:w="2160"/>
+            <w:tcW w:type="dxa" w:w="1728"/>
           </w:tcPr>
           <w:p>
             <w:r>
               <w:rPr>
-                <w:sz w:val="19"/>
+                <w:sz w:val="18"/>
               </w:rPr>
               <w:t>2.2.1</w:t>
             </w:r>
@@ -5472,12 +6499,12 @@
         </w:tc>
         <w:tc>
           <w:tcPr>
-            <w:tcW w:type="dxa" w:w="2160"/>
+            <w:tcW w:type="dxa" w:w="1728"/>
           </w:tcPr>
           <w:p>
             <w:r>
               <w:rPr>
-                <w:sz w:val="19"/>
+                <w:sz w:val="18"/>
               </w:rPr>
               <w:t>Vigas de cimentación 3000 psi</w:t>
             </w:r>
@@ -5485,12 +6512,12 @@
         </w:tc>
         <w:tc>
           <w:tcPr>
-            <w:tcW w:type="dxa" w:w="2160"/>
+            <w:tcW w:type="dxa" w:w="1728"/>
           </w:tcPr>
           <w:p>
             <w:r>
               <w:rPr>
-                <w:sz w:val="19"/>
+                <w:sz w:val="18"/>
               </w:rPr>
               <w:t>M3</w:t>
             </w:r>
@@ -5498,14 +6525,27 @@
         </w:tc>
         <w:tc>
           <w:tcPr>
-            <w:tcW w:type="dxa" w:w="2160"/>
+            <w:tcW w:type="dxa" w:w="1728"/>
           </w:tcPr>
           <w:p>
             <w:r>
               <w:rPr>
-                <w:sz w:val="19"/>
+                <w:sz w:val="18"/>
               </w:rPr>
               <w:t>13.70</w:t>
+            </w:r>
+          </w:p>
+        </w:tc>
+        <w:tc>
+          <w:tcPr>
+            <w:tcW w:type="dxa" w:w="1728"/>
+          </w:tcPr>
+          <w:p>
+            <w:r>
+              <w:rPr>
+                <w:sz w:val="18"/>
+              </w:rPr>
+              <w:t>verificado</w:t>
             </w:r>
           </w:p>
         </w:tc>
@@ -5513,12 +6553,12 @@
       <w:tr>
         <w:tc>
           <w:tcPr>
-            <w:tcW w:type="dxa" w:w="2160"/>
+            <w:tcW w:type="dxa" w:w="1728"/>
           </w:tcPr>
           <w:p>
             <w:r>
               <w:rPr>
-                <w:sz w:val="19"/>
+                <w:sz w:val="18"/>
               </w:rPr>
               <w:t>2.2.2</w:t>
             </w:r>
@@ -5526,12 +6566,12 @@
         </w:tc>
         <w:tc>
           <w:tcPr>
-            <w:tcW w:type="dxa" w:w="2160"/>
+            <w:tcW w:type="dxa" w:w="1728"/>
           </w:tcPr>
           <w:p>
             <w:r>
               <w:rPr>
-                <w:sz w:val="19"/>
+                <w:sz w:val="18"/>
               </w:rPr>
               <w:t>Solado 1500 psi e=0.05</w:t>
             </w:r>
@@ -5539,12 +6579,12 @@
         </w:tc>
         <w:tc>
           <w:tcPr>
-            <w:tcW w:type="dxa" w:w="2160"/>
+            <w:tcW w:type="dxa" w:w="1728"/>
           </w:tcPr>
           <w:p>
             <w:r>
               <w:rPr>
-                <w:sz w:val="19"/>
+                <w:sz w:val="18"/>
               </w:rPr>
               <w:t>M2</w:t>
             </w:r>
@@ -5552,14 +6592,27 @@
         </w:tc>
         <w:tc>
           <w:tcPr>
-            <w:tcW w:type="dxa" w:w="2160"/>
+            <w:tcW w:type="dxa" w:w="1728"/>
           </w:tcPr>
           <w:p>
             <w:r>
               <w:rPr>
-                <w:sz w:val="19"/>
+                <w:sz w:val="18"/>
               </w:rPr>
               <w:t>38.05</w:t>
+            </w:r>
+          </w:p>
+        </w:tc>
+        <w:tc>
+          <w:tcPr>
+            <w:tcW w:type="dxa" w:w="1728"/>
+          </w:tcPr>
+          <w:p>
+            <w:r>
+              <w:rPr>
+                <w:sz w:val="18"/>
+              </w:rPr>
+              <w:t>verificado</w:t>
             </w:r>
           </w:p>
         </w:tc>
@@ -5567,12 +6620,12 @@
       <w:tr>
         <w:tc>
           <w:tcPr>
-            <w:tcW w:type="dxa" w:w="2160"/>
+            <w:tcW w:type="dxa" w:w="1728"/>
           </w:tcPr>
           <w:p>
             <w:r>
               <w:rPr>
-                <w:sz w:val="19"/>
+                <w:sz w:val="18"/>
               </w:rPr>
               <w:t>2.3.1</w:t>
             </w:r>
@@ -5580,12 +6633,12 @@
         </w:tc>
         <w:tc>
           <w:tcPr>
-            <w:tcW w:type="dxa" w:w="2160"/>
+            <w:tcW w:type="dxa" w:w="1728"/>
           </w:tcPr>
           <w:p>
             <w:r>
               <w:rPr>
-                <w:sz w:val="19"/>
+                <w:sz w:val="18"/>
               </w:rPr>
               <w:t>Acero vigas de cimentación</w:t>
             </w:r>
@@ -5593,12 +6646,12 @@
         </w:tc>
         <w:tc>
           <w:tcPr>
-            <w:tcW w:type="dxa" w:w="2160"/>
+            <w:tcW w:type="dxa" w:w="1728"/>
           </w:tcPr>
           <w:p>
             <w:r>
               <w:rPr>
-                <w:sz w:val="19"/>
+                <w:sz w:val="18"/>
               </w:rPr>
               <w:t>KG</w:t>
             </w:r>
@@ -5606,14 +6659,27 @@
         </w:tc>
         <w:tc>
           <w:tcPr>
-            <w:tcW w:type="dxa" w:w="2160"/>
+            <w:tcW w:type="dxa" w:w="1728"/>
           </w:tcPr>
           <w:p>
             <w:r>
               <w:rPr>
-                <w:sz w:val="19"/>
+                <w:sz w:val="18"/>
               </w:rPr>
               <w:t>1 302.6</w:t>
+            </w:r>
+          </w:p>
+        </w:tc>
+        <w:tc>
+          <w:tcPr>
+            <w:tcW w:type="dxa" w:w="1728"/>
+          </w:tcPr>
+          <w:p>
+            <w:r>
+              <w:rPr>
+                <w:sz w:val="18"/>
+              </w:rPr>
+              <w:t>cartilla</w:t>
             </w:r>
           </w:p>
         </w:tc>
@@ -5621,12 +6687,12 @@
       <w:tr>
         <w:tc>
           <w:tcPr>
-            <w:tcW w:type="dxa" w:w="2160"/>
+            <w:tcW w:type="dxa" w:w="1728"/>
           </w:tcPr>
           <w:p>
             <w:r>
               <w:rPr>
-                <w:sz w:val="19"/>
+                <w:sz w:val="18"/>
               </w:rPr>
               <w:t>4.1.1</w:t>
             </w:r>
@@ -5634,25 +6700,25 @@
         </w:tc>
         <w:tc>
           <w:tcPr>
-            <w:tcW w:type="dxa" w:w="2160"/>
+            <w:tcW w:type="dxa" w:w="1728"/>
           </w:tcPr>
           <w:p>
             <w:r>
               <w:rPr>
-                <w:sz w:val="19"/>
+                <w:sz w:val="18"/>
               </w:rPr>
-              <w:t>Columnas 3000 psi</w:t>
+              <w:t>Columnas 3000 psi (8 und, 2 tipos)</w:t>
             </w:r>
           </w:p>
         </w:tc>
         <w:tc>
           <w:tcPr>
-            <w:tcW w:type="dxa" w:w="2160"/>
+            <w:tcW w:type="dxa" w:w="1728"/>
           </w:tcPr>
           <w:p>
             <w:r>
               <w:rPr>
-                <w:sz w:val="19"/>
+                <w:sz w:val="18"/>
               </w:rPr>
               <w:t>M3</w:t>
             </w:r>
@@ -5660,14 +6726,27 @@
         </w:tc>
         <w:tc>
           <w:tcPr>
-            <w:tcW w:type="dxa" w:w="2160"/>
+            <w:tcW w:type="dxa" w:w="1728"/>
           </w:tcPr>
           <w:p>
             <w:r>
               <w:rPr>
-                <w:sz w:val="19"/>
+                <w:sz w:val="18"/>
               </w:rPr>
-              <w:t>7.84</w:t>
+              <w:t>7.91</w:t>
+            </w:r>
+          </w:p>
+        </w:tc>
+        <w:tc>
+          <w:tcPr>
+            <w:tcW w:type="dxa" w:w="1728"/>
+          </w:tcPr>
+          <w:p>
+            <w:r>
+              <w:rPr>
+                <w:sz w:val="18"/>
+              </w:rPr>
+              <w:t>CORREGIDO</w:t>
             </w:r>
           </w:p>
         </w:tc>
@@ -5675,12 +6754,12 @@
       <w:tr>
         <w:tc>
           <w:tcPr>
-            <w:tcW w:type="dxa" w:w="2160"/>
+            <w:tcW w:type="dxa" w:w="1728"/>
           </w:tcPr>
           <w:p>
             <w:r>
               <w:rPr>
-                <w:sz w:val="19"/>
+                <w:sz w:val="18"/>
               </w:rPr>
               <w:t>4.2.1</w:t>
             </w:r>
@@ -5688,12 +6767,12 @@
         </w:tc>
         <w:tc>
           <w:tcPr>
-            <w:tcW w:type="dxa" w:w="2160"/>
+            <w:tcW w:type="dxa" w:w="1728"/>
           </w:tcPr>
           <w:p>
             <w:r>
               <w:rPr>
-                <w:sz w:val="19"/>
+                <w:sz w:val="18"/>
               </w:rPr>
               <w:t>Vigas de cubierta 3000 psi</w:t>
             </w:r>
@@ -5701,12 +6780,12 @@
         </w:tc>
         <w:tc>
           <w:tcPr>
-            <w:tcW w:type="dxa" w:w="2160"/>
+            <w:tcW w:type="dxa" w:w="1728"/>
           </w:tcPr>
           <w:p>
             <w:r>
               <w:rPr>
-                <w:sz w:val="19"/>
+                <w:sz w:val="18"/>
               </w:rPr>
               <w:t>M3</w:t>
             </w:r>
@@ -5714,14 +6793,27 @@
         </w:tc>
         <w:tc>
           <w:tcPr>
-            <w:tcW w:type="dxa" w:w="2160"/>
+            <w:tcW w:type="dxa" w:w="1728"/>
           </w:tcPr>
           <w:p>
             <w:r>
               <w:rPr>
-                <w:sz w:val="19"/>
+                <w:sz w:val="18"/>
               </w:rPr>
               <w:t>15.22</w:t>
+            </w:r>
+          </w:p>
+        </w:tc>
+        <w:tc>
+          <w:tcPr>
+            <w:tcW w:type="dxa" w:w="1728"/>
+          </w:tcPr>
+          <w:p>
+            <w:r>
+              <w:rPr>
+                <w:sz w:val="18"/>
+              </w:rPr>
+              <w:t>verificado</w:t>
             </w:r>
           </w:p>
         </w:tc>
@@ -5729,12 +6821,12 @@
       <w:tr>
         <w:tc>
           <w:tcPr>
-            <w:tcW w:type="dxa" w:w="2160"/>
+            <w:tcW w:type="dxa" w:w="1728"/>
           </w:tcPr>
           <w:p>
             <w:r>
               <w:rPr>
-                <w:sz w:val="19"/>
+                <w:sz w:val="18"/>
               </w:rPr>
               <w:t>4.3.1</w:t>
             </w:r>
@@ -5742,12 +6834,12 @@
         </w:tc>
         <w:tc>
           <w:tcPr>
-            <w:tcW w:type="dxa" w:w="2160"/>
+            <w:tcW w:type="dxa" w:w="1728"/>
           </w:tcPr>
           <w:p>
             <w:r>
               <w:rPr>
-                <w:sz w:val="19"/>
+                <w:sz w:val="18"/>
               </w:rPr>
               <w:t>Placa de contrapiso</w:t>
             </w:r>
@@ -5755,12 +6847,12 @@
         </w:tc>
         <w:tc>
           <w:tcPr>
-            <w:tcW w:type="dxa" w:w="2160"/>
+            <w:tcW w:type="dxa" w:w="1728"/>
           </w:tcPr>
           <w:p>
             <w:r>
               <w:rPr>
-                <w:sz w:val="19"/>
+                <w:sz w:val="18"/>
               </w:rPr>
               <w:t>M3</w:t>
             </w:r>
@@ -5768,14 +6860,27 @@
         </w:tc>
         <w:tc>
           <w:tcPr>
-            <w:tcW w:type="dxa" w:w="2160"/>
+            <w:tcW w:type="dxa" w:w="1728"/>
           </w:tcPr>
           <w:p>
             <w:r>
               <w:rPr>
-                <w:sz w:val="19"/>
+                <w:sz w:val="18"/>
               </w:rPr>
               <w:t>21.62</w:t>
+            </w:r>
+          </w:p>
+        </w:tc>
+        <w:tc>
+          <w:tcPr>
+            <w:tcW w:type="dxa" w:w="1728"/>
+          </w:tcPr>
+          <w:p>
+            <w:r>
+              <w:rPr>
+                <w:sz w:val="18"/>
+              </w:rPr>
+              <w:t>por confirmar huella</w:t>
             </w:r>
           </w:p>
         </w:tc>
@@ -5783,12 +6888,12 @@
       <w:tr>
         <w:tc>
           <w:tcPr>
-            <w:tcW w:type="dxa" w:w="2160"/>
+            <w:tcW w:type="dxa" w:w="1728"/>
           </w:tcPr>
           <w:p>
             <w:r>
               <w:rPr>
-                <w:sz w:val="19"/>
+                <w:sz w:val="18"/>
               </w:rPr>
               <w:t>4.3.3.1</w:t>
             </w:r>
@@ -5796,12 +6901,12 @@
         </w:tc>
         <w:tc>
           <w:tcPr>
-            <w:tcW w:type="dxa" w:w="2160"/>
+            <w:tcW w:type="dxa" w:w="1728"/>
           </w:tcPr>
           <w:p>
             <w:r>
               <w:rPr>
-                <w:sz w:val="19"/>
+                <w:sz w:val="18"/>
               </w:rPr>
               <w:t>Placa de cubierta aligerada</w:t>
             </w:r>
@@ -5809,12 +6914,12 @@
         </w:tc>
         <w:tc>
           <w:tcPr>
-            <w:tcW w:type="dxa" w:w="2160"/>
+            <w:tcW w:type="dxa" w:w="1728"/>
           </w:tcPr>
           <w:p>
             <w:r>
               <w:rPr>
-                <w:sz w:val="19"/>
+                <w:sz w:val="18"/>
               </w:rPr>
               <w:t>M2</w:t>
             </w:r>
@@ -5822,14 +6927,27 @@
         </w:tc>
         <w:tc>
           <w:tcPr>
-            <w:tcW w:type="dxa" w:w="2160"/>
+            <w:tcW w:type="dxa" w:w="1728"/>
           </w:tcPr>
           <w:p>
             <w:r>
               <w:rPr>
-                <w:sz w:val="19"/>
+                <w:sz w:val="18"/>
               </w:rPr>
-              <w:t>ver ítem</w:t>
+              <w:t>135.20</w:t>
+            </w:r>
+          </w:p>
+        </w:tc>
+        <w:tc>
+          <w:tcPr>
+            <w:tcW w:type="dxa" w:w="1728"/>
+          </w:tcPr>
+          <w:p>
+            <w:r>
+              <w:rPr>
+                <w:sz w:val="18"/>
+              </w:rPr>
+              <w:t>CORREGIDO</w:t>
             </w:r>
           </w:p>
         </w:tc>
@@ -5837,12 +6955,12 @@
       <w:tr>
         <w:tc>
           <w:tcPr>
-            <w:tcW w:type="dxa" w:w="2160"/>
+            <w:tcW w:type="dxa" w:w="1728"/>
           </w:tcPr>
           <w:p>
             <w:r>
               <w:rPr>
-                <w:sz w:val="19"/>
+                <w:sz w:val="18"/>
               </w:rPr>
               <w:t>4.7.1</w:t>
             </w:r>
@@ -5850,12 +6968,12 @@
         </w:tc>
         <w:tc>
           <w:tcPr>
-            <w:tcW w:type="dxa" w:w="2160"/>
+            <w:tcW w:type="dxa" w:w="1728"/>
           </w:tcPr>
           <w:p>
             <w:r>
               <w:rPr>
-                <w:sz w:val="19"/>
+                <w:sz w:val="18"/>
               </w:rPr>
               <w:t>Acero columnas</w:t>
             </w:r>
@@ -5863,12 +6981,12 @@
         </w:tc>
         <w:tc>
           <w:tcPr>
-            <w:tcW w:type="dxa" w:w="2160"/>
+            <w:tcW w:type="dxa" w:w="1728"/>
           </w:tcPr>
           <w:p>
             <w:r>
               <w:rPr>
-                <w:sz w:val="19"/>
+                <w:sz w:val="18"/>
               </w:rPr>
               <w:t>KG</w:t>
             </w:r>
@@ -5876,14 +6994,27 @@
         </w:tc>
         <w:tc>
           <w:tcPr>
-            <w:tcW w:type="dxa" w:w="2160"/>
+            <w:tcW w:type="dxa" w:w="1728"/>
           </w:tcPr>
           <w:p>
             <w:r>
               <w:rPr>
-                <w:sz w:val="19"/>
+                <w:sz w:val="18"/>
               </w:rPr>
-              <w:t>791.8</w:t>
+              <w:t>≈791.8</w:t>
+            </w:r>
+          </w:p>
+        </w:tc>
+        <w:tc>
+          <w:tcPr>
+            <w:tcW w:type="dxa" w:w="1728"/>
+          </w:tcPr>
+          <w:p>
+            <w:r>
+              <w:rPr>
+                <w:sz w:val="18"/>
+              </w:rPr>
+              <w:t>cartilla / CORREGIDO</w:t>
             </w:r>
           </w:p>
         </w:tc>
@@ -5891,12 +7022,12 @@
       <w:tr>
         <w:tc>
           <w:tcPr>
-            <w:tcW w:type="dxa" w:w="2160"/>
+            <w:tcW w:type="dxa" w:w="1728"/>
           </w:tcPr>
           <w:p>
             <w:r>
               <w:rPr>
-                <w:sz w:val="19"/>
+                <w:sz w:val="18"/>
               </w:rPr>
               <w:t>4.8.1</w:t>
             </w:r>
@@ -5904,12 +7035,12 @@
         </w:tc>
         <w:tc>
           <w:tcPr>
-            <w:tcW w:type="dxa" w:w="2160"/>
+            <w:tcW w:type="dxa" w:w="1728"/>
           </w:tcPr>
           <w:p>
             <w:r>
               <w:rPr>
-                <w:sz w:val="19"/>
+                <w:sz w:val="18"/>
               </w:rPr>
               <w:t>Acero vigas de cubierta</w:t>
             </w:r>
@@ -5917,12 +7048,12 @@
         </w:tc>
         <w:tc>
           <w:tcPr>
-            <w:tcW w:type="dxa" w:w="2160"/>
+            <w:tcW w:type="dxa" w:w="1728"/>
           </w:tcPr>
           <w:p>
             <w:r>
               <w:rPr>
-                <w:sz w:val="19"/>
+                <w:sz w:val="18"/>
               </w:rPr>
               <w:t>KG</w:t>
             </w:r>
@@ -5930,14 +7061,27 @@
         </w:tc>
         <w:tc>
           <w:tcPr>
-            <w:tcW w:type="dxa" w:w="2160"/>
+            <w:tcW w:type="dxa" w:w="1728"/>
           </w:tcPr>
           <w:p>
             <w:r>
               <w:rPr>
-                <w:sz w:val="19"/>
+                <w:sz w:val="18"/>
               </w:rPr>
               <w:t>1 757.7</w:t>
+            </w:r>
+          </w:p>
+        </w:tc>
+        <w:tc>
+          <w:tcPr>
+            <w:tcW w:type="dxa" w:w="1728"/>
+          </w:tcPr>
+          <w:p>
+            <w:r>
+              <w:rPr>
+                <w:sz w:val="18"/>
+              </w:rPr>
+              <w:t>cartilla</w:t>
             </w:r>
           </w:p>
         </w:tc>
@@ -5945,12 +7089,12 @@
       <w:tr>
         <w:tc>
           <w:tcPr>
-            <w:tcW w:type="dxa" w:w="2160"/>
+            <w:tcW w:type="dxa" w:w="1728"/>
           </w:tcPr>
           <w:p>
             <w:r>
               <w:rPr>
-                <w:sz w:val="19"/>
+                <w:sz w:val="18"/>
               </w:rPr>
               <w:t>5.1.1</w:t>
             </w:r>
@@ -5958,12 +7102,12 @@
         </w:tc>
         <w:tc>
           <w:tcPr>
-            <w:tcW w:type="dxa" w:w="2160"/>
+            <w:tcW w:type="dxa" w:w="1728"/>
           </w:tcPr>
           <w:p>
             <w:r>
               <w:rPr>
-                <w:sz w:val="19"/>
+                <w:sz w:val="18"/>
               </w:rPr>
               <w:t>Muros bloque No.4</w:t>
             </w:r>
@@ -5971,12 +7115,12 @@
         </w:tc>
         <w:tc>
           <w:tcPr>
-            <w:tcW w:type="dxa" w:w="2160"/>
+            <w:tcW w:type="dxa" w:w="1728"/>
           </w:tcPr>
           <w:p>
             <w:r>
               <w:rPr>
-                <w:sz w:val="19"/>
+                <w:sz w:val="18"/>
               </w:rPr>
               <w:t>M2</w:t>
             </w:r>
@@ -5984,14 +7128,27 @@
         </w:tc>
         <w:tc>
           <w:tcPr>
-            <w:tcW w:type="dxa" w:w="2160"/>
+            <w:tcW w:type="dxa" w:w="1728"/>
           </w:tcPr>
           <w:p>
             <w:r>
               <w:rPr>
-                <w:sz w:val="19"/>
+                <w:sz w:val="18"/>
               </w:rPr>
               <w:t>402.75</w:t>
+            </w:r>
+          </w:p>
+        </w:tc>
+        <w:tc>
+          <w:tcPr>
+            <w:tcW w:type="dxa" w:w="1728"/>
+          </w:tcPr>
+          <w:p>
+            <w:r>
+              <w:rPr>
+                <w:sz w:val="18"/>
+              </w:rPr>
+              <w:t>por confirmar L</w:t>
             </w:r>
           </w:p>
         </w:tc>
@@ -5999,12 +7156,12 @@
       <w:tr>
         <w:tc>
           <w:tcPr>
-            <w:tcW w:type="dxa" w:w="2160"/>
+            <w:tcW w:type="dxa" w:w="1728"/>
           </w:tcPr>
           <w:p>
             <w:r>
               <w:rPr>
-                <w:sz w:val="19"/>
+                <w:sz w:val="18"/>
               </w:rPr>
               <w:t>5.1.2</w:t>
             </w:r>
@@ -6012,12 +7169,12 @@
         </w:tc>
         <w:tc>
           <w:tcPr>
-            <w:tcW w:type="dxa" w:w="2160"/>
+            <w:tcW w:type="dxa" w:w="1728"/>
           </w:tcPr>
           <w:p>
             <w:r>
               <w:rPr>
-                <w:sz w:val="19"/>
+                <w:sz w:val="18"/>
               </w:rPr>
               <w:t>Columneta de confinamiento</w:t>
             </w:r>
@@ -6025,12 +7182,12 @@
         </w:tc>
         <w:tc>
           <w:tcPr>
-            <w:tcW w:type="dxa" w:w="2160"/>
+            <w:tcW w:type="dxa" w:w="1728"/>
           </w:tcPr>
           <w:p>
             <w:r>
               <w:rPr>
-                <w:sz w:val="19"/>
+                <w:sz w:val="18"/>
               </w:rPr>
               <w:t>ML</w:t>
             </w:r>
@@ -6038,14 +7195,27 @@
         </w:tc>
         <w:tc>
           <w:tcPr>
-            <w:tcW w:type="dxa" w:w="2160"/>
+            <w:tcW w:type="dxa" w:w="1728"/>
           </w:tcPr>
           <w:p>
             <w:r>
               <w:rPr>
-                <w:sz w:val="19"/>
+                <w:sz w:val="18"/>
               </w:rPr>
               <w:t>168.20</w:t>
+            </w:r>
+          </w:p>
+        </w:tc>
+        <w:tc>
+          <w:tcPr>
+            <w:tcW w:type="dxa" w:w="1728"/>
+          </w:tcPr>
+          <w:p>
+            <w:r>
+              <w:rPr>
+                <w:sz w:val="18"/>
+              </w:rPr>
+              <w:t>por confirmar cant.</w:t>
             </w:r>
           </w:p>
         </w:tc>
@@ -6053,12 +7223,12 @@
       <w:tr>
         <w:tc>
           <w:tcPr>
-            <w:tcW w:type="dxa" w:w="2160"/>
+            <w:tcW w:type="dxa" w:w="1728"/>
           </w:tcPr>
           <w:p>
             <w:r>
               <w:rPr>
-                <w:sz w:val="19"/>
+                <w:sz w:val="18"/>
               </w:rPr>
               <w:t>5.1.4</w:t>
             </w:r>
@@ -6066,12 +7236,12 @@
         </w:tc>
         <w:tc>
           <w:tcPr>
-            <w:tcW w:type="dxa" w:w="2160"/>
+            <w:tcW w:type="dxa" w:w="1728"/>
           </w:tcPr>
           <w:p>
             <w:r>
               <w:rPr>
-                <w:sz w:val="19"/>
+                <w:sz w:val="18"/>
               </w:rPr>
               <w:t>Pañete liso impermeabilizado</w:t>
             </w:r>
@@ -6079,12 +7249,12 @@
         </w:tc>
         <w:tc>
           <w:tcPr>
-            <w:tcW w:type="dxa" w:w="2160"/>
+            <w:tcW w:type="dxa" w:w="1728"/>
           </w:tcPr>
           <w:p>
             <w:r>
               <w:rPr>
-                <w:sz w:val="19"/>
+                <w:sz w:val="18"/>
               </w:rPr>
               <w:t>M2</w:t>
             </w:r>
@@ -6092,14 +7262,27 @@
         </w:tc>
         <w:tc>
           <w:tcPr>
-            <w:tcW w:type="dxa" w:w="2160"/>
+            <w:tcW w:type="dxa" w:w="1728"/>
           </w:tcPr>
           <w:p>
             <w:r>
               <w:rPr>
-                <w:sz w:val="19"/>
+                <w:sz w:val="18"/>
               </w:rPr>
               <w:t>261.79</w:t>
+            </w:r>
+          </w:p>
+        </w:tc>
+        <w:tc>
+          <w:tcPr>
+            <w:tcW w:type="dxa" w:w="1728"/>
+          </w:tcPr>
+          <w:p>
+            <w:r>
+              <w:rPr>
+                <w:sz w:val="18"/>
+              </w:rPr>
+              <w:t>verificado</w:t>
             </w:r>
           </w:p>
         </w:tc>
@@ -6107,12 +7290,12 @@
       <w:tr>
         <w:tc>
           <w:tcPr>
-            <w:tcW w:type="dxa" w:w="2160"/>
+            <w:tcW w:type="dxa" w:w="1728"/>
           </w:tcPr>
           <w:p>
             <w:r>
               <w:rPr>
-                <w:sz w:val="19"/>
+                <w:sz w:val="18"/>
               </w:rPr>
               <w:t>5.2.1</w:t>
             </w:r>
@@ -6120,12 +7303,12 @@
         </w:tc>
         <w:tc>
           <w:tcPr>
-            <w:tcW w:type="dxa" w:w="2160"/>
+            <w:tcW w:type="dxa" w:w="1728"/>
           </w:tcPr>
           <w:p>
             <w:r>
               <w:rPr>
-                <w:sz w:val="19"/>
+                <w:sz w:val="18"/>
               </w:rPr>
               <w:t>Acero mampostería confinada</w:t>
             </w:r>
@@ -6133,12 +7316,12 @@
         </w:tc>
         <w:tc>
           <w:tcPr>
-            <w:tcW w:type="dxa" w:w="2160"/>
+            <w:tcW w:type="dxa" w:w="1728"/>
           </w:tcPr>
           <w:p>
             <w:r>
               <w:rPr>
-                <w:sz w:val="19"/>
+                <w:sz w:val="18"/>
               </w:rPr>
               <w:t>KG</w:t>
             </w:r>
@@ -6146,14 +7329,27 @@
         </w:tc>
         <w:tc>
           <w:tcPr>
-            <w:tcW w:type="dxa" w:w="2160"/>
+            <w:tcW w:type="dxa" w:w="1728"/>
           </w:tcPr>
           <w:p>
             <w:r>
               <w:rPr>
-                <w:sz w:val="19"/>
+                <w:sz w:val="18"/>
               </w:rPr>
               <w:t>530.1</w:t>
+            </w:r>
+          </w:p>
+        </w:tc>
+        <w:tc>
+          <w:tcPr>
+            <w:tcW w:type="dxa" w:w="1728"/>
+          </w:tcPr>
+          <w:p>
+            <w:r>
+              <w:rPr>
+                <w:sz w:val="18"/>
+              </w:rPr>
+              <w:t>cartilla</w:t>
             </w:r>
           </w:p>
         </w:tc>
@@ -6161,12 +7357,12 @@
       <w:tr>
         <w:tc>
           <w:tcPr>
-            <w:tcW w:type="dxa" w:w="2160"/>
+            <w:tcW w:type="dxa" w:w="1728"/>
           </w:tcPr>
           <w:p>
             <w:r>
               <w:rPr>
-                <w:sz w:val="19"/>
+                <w:sz w:val="18"/>
               </w:rPr>
               <w:t>8.1.1</w:t>
             </w:r>
@@ -6174,12 +7370,12 @@
         </w:tc>
         <w:tc>
           <w:tcPr>
-            <w:tcW w:type="dxa" w:w="2160"/>
+            <w:tcW w:type="dxa" w:w="1728"/>
           </w:tcPr>
           <w:p>
             <w:r>
               <w:rPr>
-                <w:sz w:val="19"/>
+                <w:sz w:val="18"/>
               </w:rPr>
               <w:t>Adoquín en concreto</w:t>
             </w:r>
@@ -6187,12 +7383,12 @@
         </w:tc>
         <w:tc>
           <w:tcPr>
-            <w:tcW w:type="dxa" w:w="2160"/>
+            <w:tcW w:type="dxa" w:w="1728"/>
           </w:tcPr>
           <w:p>
             <w:r>
               <w:rPr>
-                <w:sz w:val="19"/>
+                <w:sz w:val="18"/>
               </w:rPr>
               <w:t>M2</w:t>
             </w:r>
@@ -6200,14 +7396,27 @@
         </w:tc>
         <w:tc>
           <w:tcPr>
-            <w:tcW w:type="dxa" w:w="2160"/>
+            <w:tcW w:type="dxa" w:w="1728"/>
           </w:tcPr>
           <w:p>
             <w:r>
               <w:rPr>
-                <w:sz w:val="19"/>
+                <w:sz w:val="18"/>
               </w:rPr>
               <w:t>115.30</w:t>
+            </w:r>
+          </w:p>
+        </w:tc>
+        <w:tc>
+          <w:tcPr>
+            <w:tcW w:type="dxa" w:w="1728"/>
+          </w:tcPr>
+          <w:p>
+            <w:r>
+              <w:rPr>
+                <w:sz w:val="18"/>
+              </w:rPr>
+              <w:t>por confirmar áreas</w:t>
             </w:r>
           </w:p>
         </w:tc>
@@ -6226,7 +7435,7 @@
         <w:rPr>
           <w:color w:val="1F3B73"/>
         </w:rPr>
-        <w:t>6. Cómo llenar la columna «IMAGEN/REFERENCIA» del formato</w:t>
+        <w:t>7. Cómo llenar la columna «IMAGEN/REFERENCIA»</w:t>
       </w:r>
     </w:p>
     <w:p>
@@ -6239,7 +7448,7 @@
           <w:i w:val="0"/>
           <w:sz w:val="22"/>
         </w:rPr>
-        <w:t>El formato de memoria de cálculo tiene, a la izquierda de cada renglón, una casilla llamada «IMAGEN/REFERENCIA». Ahí es donde el profesor pide la «foto de dónde saliste el dato». El procedimiento es:</w:t>
+        <w:t>En cada renglón del formato hay una casilla «IMAGEN/REFERENCIA». Ahí va la «foto de dónde salió el dato». Procedimiento:</w:t>
       </w:r>
     </w:p>
     <w:p>
@@ -6247,7 +7456,7 @@
         <w:pStyle w:val="ListBullet"/>
       </w:pPr>
       <w:r>
-        <w:t>Abre el plano PDF correspondiente al ítem (ver la figura indicada en cada bloque de este documento).</w:t>
+        <w:t>Abre el plano PDF del ítem (la figura indicada en cada bloque).</w:t>
       </w:r>
     </w:p>
     <w:p>
@@ -6255,7 +7464,7 @@
         <w:pStyle w:val="ListBullet"/>
       </w:pPr>
       <w:r>
-        <w:t>Haz un recorte/pantallazo de la zona donde se ve la cota o la dimensión usada (ej.: el rótulo B=0.40 H=0.45 de la viga, la altura 4.90 de la columna, la longitud entre ejes, etc.).</w:t>
+        <w:t>Recorta la zona donde se ve la cota usada (rótulo de la viga, altura de columna, luz entre ejes, etc.).</w:t>
       </w:r>
     </w:p>
     <w:p>
@@ -6263,7 +7472,7 @@
         <w:pStyle w:val="ListBullet"/>
       </w:pPr>
       <w:r>
-        <w:t>Pega ese recorte en la casilla IMAGEN/REFERENCIA de ese ítem en el Excel.</w:t>
+        <w:t>Pega el recorte en la casilla IMAGEN/REFERENCIA de ese ítem en el Excel.</w:t>
       </w:r>
     </w:p>
     <w:p>
@@ -6276,7 +7485,7 @@
           <w:i w:val="0"/>
           <w:sz w:val="22"/>
         </w:rPr>
-        <w:t>Correspondencia rápida ítem → plano:</w:t>
+        <w:t>Correspondencia ítem → plano:</w:t>
       </w:r>
     </w:p>
     <w:tbl>
@@ -6334,7 +7543,7 @@
               <w:rPr>
                 <w:sz w:val="20"/>
               </w:rPr>
-              <w:t>Planta de cimentación + corte de piso (Figura 3.1 / Esquema 1)</w:t>
+              <w:t>Cimentación + corte de piso (Fig 3.1 / Esquema 1)</w:t>
             </w:r>
           </w:p>
         </w:tc>
@@ -6362,7 +7571,7 @@
               <w:rPr>
                 <w:sz w:val="20"/>
               </w:rPr>
-              <w:t>Planta de cimentación – vigas VC y despiece (Figura 3.1)</w:t>
+              <w:t>Cimentación – vigas VC y despiece (Fig 3.1)</w:t>
             </w:r>
           </w:p>
         </w:tc>
@@ -6390,7 +7599,7 @@
               <w:rPr>
                 <w:sz w:val="20"/>
               </w:rPr>
-              <w:t>Planta y detalle de columnas (Figura 3.2)</w:t>
+              <w:t>Detalle de columnas (Fig 3.2 y recortes Sección 4)</w:t>
             </w:r>
           </w:p>
         </w:tc>
@@ -6418,7 +7627,7 @@
               <w:rPr>
                 <w:sz w:val="20"/>
               </w:rPr>
-              <w:t>Placa de cubierta y vigas VG (Figura 3.3)</w:t>
+              <w:t>Placa de cubierta y vigas VG (Fig 3.3)</w:t>
             </w:r>
           </w:p>
         </w:tc>
@@ -6446,7 +7655,7 @@
               <w:rPr>
                 <w:sz w:val="20"/>
               </w:rPr>
-              <w:t>Detalles de mampostería / fachada (Figura 3.4)</w:t>
+              <w:t>Detalles de mampostería (Fig 3.4)</w:t>
             </w:r>
           </w:p>
         </w:tc>
@@ -6474,7 +7683,7 @@
               <w:rPr>
                 <w:sz w:val="20"/>
               </w:rPr>
-              <w:t>Planta arquitectónica / adoquín con áreas (Figura 3.5)</w:t>
+              <w:t>Adoquín / arquitectónico con áreas (Fig 3.5)</w:t>
             </w:r>
           </w:p>
         </w:tc>
@@ -6503,7 +7712,7 @@
           <w:color w:val="404040"/>
           <w:sz w:val="20"/>
         </w:rPr>
-        <w:t>Nota final: todas las dimensiones de este documento provienen de los planos entregados y coinciden con las fórmulas del archivo MEMORIAS DE CALCULO.xlsx. Si el profesor pide ajustar un porcentaje (vanos, pañete) o un espesor, basta con cambiar ese dato en el renglón y la cantidad se recalcula sola.</w:t>
+        <w:t>Nota: las correcciones de columnas y viguetas ya quedaron aplicadas en MEMORIAS DE CALCULO.xlsx. Los valores marcados «por confirmar» dependen de una cota que no está en los PDF; confírmalos en el DWG y quedan cerrados.</w:t>
       </w:r>
     </w:p>
     <w:sectPr>

</xml_diff>

<commit_message>
fix(cap.2): logica de cimentacion completa - excavacion 0.60, sub-base 0.30, zapatas agregadas (concreto+acero), solado bajo zapatas
</commit_message>
<xml_diff>
--- a/Proyectos/Fundamentos-de-Construccion/EXPLICACION - Memoria de Calculo - Cantidades de Obra.docx
+++ b/Proyectos/Fundamentos-de-Construccion/EXPLICACION - Memoria de Calculo - Cantidades de Obra.docx
@@ -1149,6 +1149,252 @@
               <w:rPr>
                 <w:sz w:val="19"/>
               </w:rPr>
+              <w:t>2.1.1 Excavación masiva</w:t>
+            </w:r>
+          </w:p>
+        </w:tc>
+        <w:tc>
+          <w:tcPr>
+            <w:tcW w:type="dxa" w:w="2880"/>
+          </w:tcPr>
+          <w:p>
+            <w:r>
+              <w:rPr>
+                <w:sz w:val="19"/>
+              </w:rPr>
+              <w:t>prof. 0.55 m</w:t>
+            </w:r>
+          </w:p>
+        </w:tc>
+        <w:tc>
+          <w:tcPr>
+            <w:tcW w:type="dxa" w:w="2880"/>
+          </w:tcPr>
+          <w:p>
+            <w:r>
+              <w:rPr>
+                <w:sz w:val="19"/>
+              </w:rPr>
+              <w:t>0.60 m (recebo 0.20 + sub-base 0.30 + placa 0.10)</w:t>
+            </w:r>
+          </w:p>
+        </w:tc>
+      </w:tr>
+      <w:tr>
+        <w:tc>
+          <w:tcPr>
+            <w:tcW w:type="dxa" w:w="2880"/>
+          </w:tcPr>
+          <w:p>
+            <w:r>
+              <w:rPr>
+                <w:sz w:val="19"/>
+              </w:rPr>
+              <w:t>2.1.2 Sub-base</w:t>
+            </w:r>
+          </w:p>
+        </w:tc>
+        <w:tc>
+          <w:tcPr>
+            <w:tcW w:type="dxa" w:w="2880"/>
+          </w:tcPr>
+          <w:p>
+            <w:r>
+              <w:rPr>
+                <w:sz w:val="19"/>
+              </w:rPr>
+              <w:t>e = 0.15 m</w:t>
+            </w:r>
+          </w:p>
+        </w:tc>
+        <w:tc>
+          <w:tcPr>
+            <w:tcW w:type="dxa" w:w="2880"/>
+          </w:tcPr>
+          <w:p>
+            <w:r>
+              <w:rPr>
+                <w:sz w:val="19"/>
+              </w:rPr>
+              <w:t>e = 0.30 m (el detalle dice 'SUB-BASE 30 cm')</w:t>
+            </w:r>
+          </w:p>
+        </w:tc>
+      </w:tr>
+      <w:tr>
+        <w:tc>
+          <w:tcPr>
+            <w:tcW w:type="dxa" w:w="2880"/>
+          </w:tcPr>
+          <w:p>
+            <w:r>
+              <w:rPr>
+                <w:sz w:val="19"/>
+              </w:rPr>
+              <w:t>2.1.3 Excavación manual</w:t>
+            </w:r>
+          </w:p>
+        </w:tc>
+        <w:tc>
+          <w:tcPr>
+            <w:tcW w:type="dxa" w:w="2880"/>
+          </w:tcPr>
+          <w:p>
+            <w:r>
+              <w:rPr>
+                <w:sz w:val="19"/>
+              </w:rPr>
+              <w:t>solo zanjas 0.40 prof.</w:t>
+            </w:r>
+          </w:p>
+        </w:tc>
+        <w:tc>
+          <w:tcPr>
+            <w:tcW w:type="dxa" w:w="2880"/>
+          </w:tcPr>
+          <w:p>
+            <w:r>
+              <w:rPr>
+                <w:sz w:val="19"/>
+              </w:rPr>
+              <w:t>zanjas 0.45 + fosos de 8 zapatas hasta −1.55</w:t>
+            </w:r>
+          </w:p>
+        </w:tc>
+      </w:tr>
+      <w:tr>
+        <w:tc>
+          <w:tcPr>
+            <w:tcW w:type="dxa" w:w="2880"/>
+          </w:tcPr>
+          <w:p>
+            <w:r>
+              <w:rPr>
+                <w:sz w:val="19"/>
+              </w:rPr>
+              <w:t>2.2.2 Solado</w:t>
+            </w:r>
+          </w:p>
+        </w:tc>
+        <w:tc>
+          <w:tcPr>
+            <w:tcW w:type="dxa" w:w="2880"/>
+          </w:tcPr>
+          <w:p>
+            <w:r>
+              <w:rPr>
+                <w:sz w:val="19"/>
+              </w:rPr>
+              <w:t>solo bajo vigas (38.05)</w:t>
+            </w:r>
+          </w:p>
+        </w:tc>
+        <w:tc>
+          <w:tcPr>
+            <w:tcW w:type="dxa" w:w="2880"/>
+          </w:tcPr>
+          <w:p>
+            <w:r>
+              <w:rPr>
+                <w:sz w:val="19"/>
+              </w:rPr>
+              <w:t>+ solado bajo 8 zapatas = 77.70 m²</w:t>
+            </w:r>
+          </w:p>
+        </w:tc>
+      </w:tr>
+      <w:tr>
+        <w:tc>
+          <w:tcPr>
+            <w:tcW w:type="dxa" w:w="2880"/>
+          </w:tcPr>
+          <w:p>
+            <w:r>
+              <w:rPr>
+                <w:sz w:val="19"/>
+              </w:rPr>
+              <w:t>2.2.3 Zapatas concreto</w:t>
+            </w:r>
+          </w:p>
+        </w:tc>
+        <w:tc>
+          <w:tcPr>
+            <w:tcW w:type="dxa" w:w="2880"/>
+          </w:tcPr>
+          <w:p>
+            <w:r>
+              <w:rPr>
+                <w:sz w:val="19"/>
+              </w:rPr>
+              <w:t>no existía</w:t>
+            </w:r>
+          </w:p>
+        </w:tc>
+        <w:tc>
+          <w:tcPr>
+            <w:tcW w:type="dxa" w:w="2880"/>
+          </w:tcPr>
+          <w:p>
+            <w:r>
+              <w:rPr>
+                <w:sz w:val="19"/>
+              </w:rPr>
+              <w:t>AGREGADO: 4×Z-1 + 4×Z-2 = 15.86 m³</w:t>
+            </w:r>
+          </w:p>
+        </w:tc>
+      </w:tr>
+      <w:tr>
+        <w:tc>
+          <w:tcPr>
+            <w:tcW w:type="dxa" w:w="2880"/>
+          </w:tcPr>
+          <w:p>
+            <w:r>
+              <w:rPr>
+                <w:sz w:val="19"/>
+              </w:rPr>
+              <w:t>2.3.2 Acero zapatas</w:t>
+            </w:r>
+          </w:p>
+        </w:tc>
+        <w:tc>
+          <w:tcPr>
+            <w:tcW w:type="dxa" w:w="2880"/>
+          </w:tcPr>
+          <w:p>
+            <w:r>
+              <w:rPr>
+                <w:sz w:val="19"/>
+              </w:rPr>
+              <w:t>no existía</w:t>
+            </w:r>
+          </w:p>
+        </w:tc>
+        <w:tc>
+          <w:tcPr>
+            <w:tcW w:type="dxa" w:w="2880"/>
+          </w:tcPr>
+          <w:p>
+            <w:r>
+              <w:rPr>
+                <w:sz w:val="19"/>
+              </w:rPr>
+              <w:t>AGREGADO (estimación): ≈668.6 kg</w:t>
+            </w:r>
+          </w:p>
+        </w:tc>
+      </w:tr>
+      <w:tr>
+        <w:tc>
+          <w:tcPr>
+            <w:tcW w:type="dxa" w:w="2880"/>
+          </w:tcPr>
+          <w:p>
+            <w:r>
+              <w:rPr>
+                <w:sz w:val="19"/>
+              </w:rPr>
               <w:t>4.1.1 Columnas</w:t>
             </w:r>
           </w:p>
@@ -1425,7 +1671,7 @@
         <w:pStyle w:val="ListBullet"/>
       </w:pPr>
       <w:r>
-        <w:t>El plano tiene zapatas aisladas (Z-1 2.30×2.30×0.40 y Z-2 2.15×2.15×0.40), pero la memoria/presupuesto no incluye ítem de concreto ni de acero de zapatas. Si el alcance lo exige, deben agregarse.</w:t>
+        <w:t>El plano tiene 8 zapatas aisladas (4 Z-1 2.30×2.30×0.40 bajo las columnas de 0.50, y 4 Z-2 2.15×2.15×0.40 bajo las de 0.40). YA SE AGREGARON a la memoria (ítems 2.2.3 concreto y 2.3.2 acero); falta crear esas dos líneas en el presupuesto.</w:t>
       </w:r>
     </w:p>
     <w:p>
@@ -1657,6 +1903,85 @@
     </w:p>
     <w:p>
       <w:pPr>
+        <w:spacing w:after="80"/>
+      </w:pPr>
+      <w:r>
+        <w:rPr>
+          <w:b w:val="0"/>
+          <w:i w:val="0"/>
+          <w:sz w:val="22"/>
+        </w:rPr>
+        <w:t>Todo el capítulo 2 se apoya en un único sistema de niveles. El siguiente corte muestra cómo encajan las capas (el fondo de cada una es el techo de la siguiente), verificado con los tres detalles del plano: losa de contrapiso, planta de cimentación (NE −1.10) y detalle de zapata (desplante −1.50).</w:t>
+      </w:r>
+    </w:p>
+    <w:p>
+      <w:pPr>
+        <w:jc w:val="center"/>
+      </w:pPr>
+      <w:r>
+        <w:drawing>
+          <wp:inline xmlns:a="http://schemas.openxmlformats.org/drawingml/2006/main" xmlns:pic="http://schemas.openxmlformats.org/drawingml/2006/picture">
+            <wp:extent cx="5760000" cy="4536309"/>
+            <wp:docPr id="9" name="Picture 9"/>
+            <wp:cNvGraphicFramePr>
+              <a:graphicFrameLocks noChangeAspect="1"/>
+            </wp:cNvGraphicFramePr>
+            <a:graphic>
+              <a:graphicData uri="http://schemas.openxmlformats.org/drawingml/2006/picture">
+                <pic:pic>
+                  <pic:nvPicPr>
+                    <pic:cNvPr id="0" name="esq_seccion_general.png"/>
+                    <pic:cNvPicPr/>
+                  </pic:nvPicPr>
+                  <pic:blipFill>
+                    <a:blip r:embed="rId17"/>
+                    <a:stretch>
+                      <a:fillRect/>
+                    </a:stretch>
+                  </pic:blipFill>
+                  <pic:spPr>
+                    <a:xfrm>
+                      <a:off x="0" y="0"/>
+                      <a:ext cx="5760000" cy="4536309"/>
+                    </a:xfrm>
+                    <a:prstGeom prst="rect"/>
+                  </pic:spPr>
+                </pic:pic>
+              </a:graphicData>
+            </a:graphic>
+          </wp:inline>
+        </w:drawing>
+      </w:r>
+    </w:p>
+    <w:p>
+      <w:pPr>
+        <w:spacing w:after="200"/>
+        <w:jc w:val="center"/>
+      </w:pPr>
+      <w:r>
+        <w:rPr>
+          <w:b w:val="0"/>
+          <w:i/>
+          <w:color w:val="404040"/>
+          <w:sz w:val="18"/>
+        </w:rPr>
+        <w:t>Corte lógico de la cimentación con niveles reales (desde N ±0.00).</w:t>
+      </w:r>
+    </w:p>
+    <w:p>
+      <w:pPr>
+        <w:spacing w:after="120"/>
+      </w:pPr>
+      <w:r>
+        <w:rPr>
+          <w:b w:val="0"/>
+          <w:i w:val="0"/>
+          <w:sz w:val="22"/>
+        </w:rPr>
+      </w:r>
+    </w:p>
+    <w:p>
+      <w:pPr>
         <w:pStyle w:val="Heading2"/>
       </w:pPr>
       <w:r>
@@ -1763,7 +2088,7 @@
               <w:rPr>
                 <w:sz w:val="20"/>
               </w:rPr>
-              <w:t>Alto = 0.55 m</w:t>
+              <w:t>Alto = 0.60 m</w:t>
             </w:r>
           </w:p>
         </w:tc>
@@ -1776,7 +2101,7 @@
               <w:rPr>
                 <w:sz w:val="20"/>
               </w:rPr>
-              <w:t>Profundidad de la excavación masiva (0.20 recebo + 0.15 subbase + 0.10 placa + solado ≈ 0.55).</w:t>
+              <w:t>Profundidad de la excavación masiva = recebo 0.20 + sub-base 0.30 + placa 0.10 (paquete de reemplazo bajo la placa, hasta −0.65).</w:t>
             </w:r>
           </w:p>
         </w:tc>
@@ -1814,7 +2139,7 @@
           <w:color w:val="1F3B73"/>
           <w:sz w:val="23"/>
         </w:rPr>
-        <w:t>V = 9.85 × 0.55 × 21.95 × 1</w:t>
+        <w:t>V = 9.85 × 0.60 × 21.95 × 1</w:t>
       </w:r>
     </w:p>
     <w:p>
@@ -1824,7 +2149,7 @@
           <w:color w:val="006600"/>
           <w:sz w:val="23"/>
         </w:rPr>
-        <w:t>➜ Resultado: 118.92 m³</w:t>
+        <w:t>➜ Resultado: 129.72 m³</w:t>
       </w:r>
     </w:p>
     <w:p>
@@ -1838,7 +2163,7 @@
           <w:color w:val="B06000"/>
           <w:sz w:val="20"/>
         </w:rPr>
-        <w:t>Observación: La huella 9.85×21.95 no está acotada en los PDF; confirmar en el DWG y pegar el pantallazo de la cota.</w:t>
+        <w:t>Observación: CORREGIDO: 0.55 → 0.60 m (el 0.55 no cuadraba). Huella 9.85×21.95 aún por confirmar en DWG.</w:t>
       </w:r>
     </w:p>
     <w:p>
@@ -1849,7 +2174,7 @@
         <w:drawing>
           <wp:inline xmlns:a="http://schemas.openxmlformats.org/drawingml/2006/main" xmlns:pic="http://schemas.openxmlformats.org/drawingml/2006/picture">
             <wp:extent cx="5400000" cy="2787097"/>
-            <wp:docPr id="9" name="Picture 9"/>
+            <wp:docPr id="10" name="Picture 10"/>
             <wp:cNvGraphicFramePr>
               <a:graphicFrameLocks noChangeAspect="1"/>
             </wp:cNvGraphicFramePr>
@@ -1861,7 +2186,7 @@
                     <pic:cNvPicPr/>
                   </pic:nvPicPr>
                   <pic:blipFill>
-                    <a:blip r:embed="rId17"/>
+                    <a:blip r:embed="rId18"/>
                     <a:stretch>
                       <a:fillRect/>
                     </a:stretch>
@@ -1906,7 +2231,7 @@
           <w:color w:val="404040"/>
           <w:sz w:val="20"/>
         </w:rPr>
-        <w:t>Foto de referencia para el formato: Figura 3.1 + Esquema 1.</w:t>
+        <w:t>Foto de referencia para el formato: Figura 3.1 + corte lógico.</w:t>
       </w:r>
     </w:p>
     <w:p>
@@ -2017,7 +2342,7 @@
               <w:rPr>
                 <w:sz w:val="20"/>
               </w:rPr>
-              <w:t>Alto = 0.15 m</w:t>
+              <w:t>Alto = 0.30 m</w:t>
             </w:r>
           </w:p>
         </w:tc>
@@ -2030,7 +2355,7 @@
               <w:rPr>
                 <w:sz w:val="20"/>
               </w:rPr>
-              <w:t>Espesor de la sub-base granular.</w:t>
+              <w:t>Espesor de la sub-base. El detalle dice 'SUB-BASE DE 30 cm' y 'Mínimo 0.30m'.</w:t>
             </w:r>
           </w:p>
         </w:tc>
@@ -2068,7 +2393,7 @@
           <w:color w:val="1F3B73"/>
           <w:sz w:val="23"/>
         </w:rPr>
-        <w:t>V = 9.85 × 0.15 × 21.95 × 1</w:t>
+        <w:t>V = 9.85 × 0.30 × 21.95 × 1</w:t>
       </w:r>
     </w:p>
     <w:p>
@@ -2078,7 +2403,7 @@
           <w:color w:val="006600"/>
           <w:sz w:val="23"/>
         </w:rPr>
-        <w:t>➜ Resultado: 32.44 m³</w:t>
+        <w:t>➜ Resultado: 64.86 m³</w:t>
       </w:r>
     </w:p>
     <w:p>
@@ -2092,7 +2417,7 @@
           <w:color w:val="B06000"/>
           <w:sz w:val="20"/>
         </w:rPr>
-        <w:t>Observación: La huella 9.85×21.95 no está acotada en los PDF; confirmar en el DWG y pegar el pantallazo de la cota.</w:t>
+        <w:t>Observación: CORREGIDO: 0.15 → 0.30 m (lo dice el detalle de la losa).</w:t>
       </w:r>
     </w:p>
     <w:p>
@@ -2106,7 +2431,7 @@
           <w:color w:val="404040"/>
           <w:sz w:val="20"/>
         </w:rPr>
-        <w:t>Foto de referencia para el formato: Figura 3.1 + Esquema 1.</w:t>
+        <w:t>Foto de referencia para el formato: Figura 3.1 + detalle de losa de contrapiso.</w:t>
       </w:r>
     </w:p>
     <w:p>
@@ -2189,7 +2514,7 @@
               <w:rPr>
                 <w:sz w:val="20"/>
               </w:rPr>
-              <w:t>Long.: 0.40×0.40×19.80, cant. 2</w:t>
+              <w:t>Zanjas de vigas: 0.40×0.45×19.80 (×2) y ×7.30 (×5)</w:t>
             </w:r>
           </w:p>
         </w:tc>
@@ -2202,7 +2527,7 @@
               <w:rPr>
                 <w:sz w:val="20"/>
               </w:rPr>
-              <w:t>Zanjas en ejes A y B (0.40 ancho, 0.40 prof., 19.80 largo).</w:t>
+              <w:t>Zanjas para las vigas de cimentación, de −0.65 a −1.10 (0.45 = alto de la viga).</w:t>
             </w:r>
           </w:p>
         </w:tc>
@@ -2217,7 +2542,7 @@
               <w:rPr>
                 <w:sz w:val="20"/>
               </w:rPr>
-              <w:t>Transv.: 0.40×0.40×7.30, cant. 5</w:t>
+              <w:t>Fosos Z-1: 2.30×2.30, prof 0.90, ×4</w:t>
             </w:r>
           </w:p>
         </w:tc>
@@ -2230,7 +2555,35 @@
               <w:rPr>
                 <w:sz w:val="20"/>
               </w:rPr>
-              <w:t>5 ejes, luz 7.30 m.</w:t>
+              <w:t>Zapatas grandes, de −0.65 a −1.55 (desplante).</w:t>
+            </w:r>
+          </w:p>
+        </w:tc>
+      </w:tr>
+      <w:tr>
+        <w:tc>
+          <w:tcPr>
+            <w:tcW w:type="dxa" w:w="4320"/>
+          </w:tcPr>
+          <w:p>
+            <w:r>
+              <w:rPr>
+                <w:sz w:val="20"/>
+              </w:rPr>
+              <w:t>Fosos Z-2: 2.15×2.15, prof 0.90, ×4</w:t>
+            </w:r>
+          </w:p>
+        </w:tc>
+        <w:tc>
+          <w:tcPr>
+            <w:tcW w:type="dxa" w:w="4320"/>
+          </w:tcPr>
+          <w:p>
+            <w:r>
+              <w:rPr>
+                <w:sz w:val="20"/>
+              </w:rPr>
+              <w:t>Zapatas pequeñas, misma profundidad.</w:t>
             </w:r>
           </w:p>
         </w:tc>
@@ -2268,7 +2621,7 @@
           <w:color w:val="1F3B73"/>
           <w:sz w:val="23"/>
         </w:rPr>
-        <w:t>V = (0.40×0.40×19.80×2)+(0.40×0.40×7.30×5) = 6.34 + 5.84</w:t>
+        <w:t>V = 7.13 + 6.57 (zanjas) + 19.04 + 16.64 (zapatas)</w:t>
       </w:r>
     </w:p>
     <w:p>
@@ -2278,7 +2631,21 @@
           <w:color w:val="006600"/>
           <w:sz w:val="23"/>
         </w:rPr>
-        <w:t>➜ Resultado: 12.18 m³</w:t>
+        <w:t>➜ Resultado: 49.38 m³</w:t>
+      </w:r>
+    </w:p>
+    <w:p>
+      <w:pPr>
+        <w:spacing w:after="120"/>
+      </w:pPr>
+      <w:r>
+        <w:rPr>
+          <w:b w:val="0"/>
+          <w:i/>
+          <w:color w:val="B06000"/>
+          <w:sz w:val="20"/>
+        </w:rPr>
+        <w:t>Observación: CORREGIDO: la excavación manual va por debajo del nivel masivo (−0.65). Incluye las zanjas de vigas (0.45 m) y los fosos de las 8 zapatas hasta el desplante (−1.55). Estimación sin descontar solapes (conservador).</w:t>
       </w:r>
     </w:p>
     <w:p>
@@ -2292,7 +2659,7 @@
           <w:color w:val="404040"/>
           <w:sz w:val="20"/>
         </w:rPr>
-        <w:t>Foto de referencia para el formato: Figura 3.1 (zanjas de vigas VC).</w:t>
+        <w:t>Foto de referencia para el formato: Figura 3.1 (vigas VC y zapatas) + detalle de zapata.</w:t>
       </w:r>
     </w:p>
     <w:p>
@@ -2903,7 +3270,7 @@
         <w:drawing>
           <wp:inline xmlns:a="http://schemas.openxmlformats.org/drawingml/2006/main" xmlns:pic="http://schemas.openxmlformats.org/drawingml/2006/picture">
             <wp:extent cx="5400000" cy="6079787"/>
-            <wp:docPr id="10" name="Picture 10"/>
+            <wp:docPr id="11" name="Picture 11"/>
             <wp:cNvGraphicFramePr>
               <a:graphicFrameLocks noChangeAspect="1"/>
             </wp:cNvGraphicFramePr>
@@ -2915,7 +3282,7 @@
                     <pic:cNvPicPr/>
                   </pic:nvPicPr>
                   <pic:blipFill>
-                    <a:blip r:embed="rId18"/>
+                    <a:blip r:embed="rId19"/>
                     <a:stretch>
                       <a:fillRect/>
                     </a:stretch>
@@ -3043,7 +3410,7 @@
               <w:rPr>
                 <w:sz w:val="20"/>
               </w:rPr>
-              <w:t>Ancho = 0.50 m</w:t>
+              <w:t>Bajo vigas: 0.50 × long. (19.80×2 y 7.30×5)</w:t>
             </w:r>
           </w:p>
         </w:tc>
@@ -3056,7 +3423,7 @@
               <w:rPr>
                 <w:sz w:val="20"/>
               </w:rPr>
-              <w:t>10 cm más ancho que la viga (a cada lado).</w:t>
+              <w:t>Solado 10 cm más ancho que la viga.</w:t>
             </w:r>
           </w:p>
         </w:tc>
@@ -3071,7 +3438,7 @@
               <w:rPr>
                 <w:sz w:val="20"/>
               </w:rPr>
-              <w:t>Long. 19.80×2 y 7.30×5</w:t>
+              <w:t>Bajo zapatas: Z-1 2.30×2.30 ×4 y Z-2 2.15×2.15 ×4</w:t>
             </w:r>
           </w:p>
         </w:tc>
@@ -3084,7 +3451,7 @@
               <w:rPr>
                 <w:sz w:val="20"/>
               </w:rPr>
-              <w:t>Mismo desarrollo de las vigas.</w:t>
+              <w:t>El detalle de zapata muestra solado de limpieza bajo cada zapata.</w:t>
             </w:r>
           </w:p>
         </w:tc>
@@ -3150,7 +3517,7 @@
           <w:color w:val="1F3B73"/>
           <w:sz w:val="23"/>
         </w:rPr>
-        <w:t>A = (0.50×1×19.80×2)+(0.50×1×7.30×5) = 19.80 + 18.25</w:t>
+        <w:t>A = 38.05 (vigas) + 39.65 (zapatas)</w:t>
       </w:r>
     </w:p>
     <w:p>
@@ -3160,7 +3527,21 @@
           <w:color w:val="006600"/>
           <w:sz w:val="23"/>
         </w:rPr>
-        <w:t>➜ Resultado: 38.05 m²</w:t>
+        <w:t>➜ Resultado: 77.70 m²</w:t>
+      </w:r>
+    </w:p>
+    <w:p>
+      <w:pPr>
+        <w:spacing w:after="120"/>
+      </w:pPr>
+      <w:r>
+        <w:rPr>
+          <w:b w:val="0"/>
+          <w:i/>
+          <w:color w:val="B06000"/>
+          <w:sz w:val="20"/>
+        </w:rPr>
+        <w:t>Observación: AGREGADO: solado también bajo las 8 zapatas (antes solo bajo vigas).</w:t>
       </w:r>
     </w:p>
     <w:p>
@@ -3174,7 +3555,235 @@
           <w:color w:val="404040"/>
           <w:sz w:val="20"/>
         </w:rPr>
-        <w:t>Foto de referencia para el formato: Figura 3.1 + Esquema 3.</w:t>
+        <w:t>Foto de referencia para el formato: Figura 3.1 + detalle de zapata (solado de limpieza).</w:t>
+      </w:r>
+    </w:p>
+    <w:p>
+      <w:pPr>
+        <w:pStyle w:val="Heading2"/>
+      </w:pPr>
+      <w:r>
+        <w:rPr>
+          <w:color w:val="1F3B73"/>
+        </w:rPr>
+        <w:t>Ítem 2.2.3 — Zapatas concreto 3000 psi  (M3)</w:t>
+      </w:r>
+    </w:p>
+    <w:p>
+      <w:pPr>
+        <w:spacing w:after="80"/>
+      </w:pPr>
+      <w:r>
+        <w:rPr>
+          <w:b w:val="0"/>
+          <w:i/>
+          <w:color w:val="404040"/>
+          <w:sz w:val="20"/>
+        </w:rPr>
+        <w:t>Capítulo: 2. Cimentación</w:t>
+      </w:r>
+    </w:p>
+    <w:p>
+      <w:pPr>
+        <w:spacing w:after="40"/>
+      </w:pPr>
+      <w:r>
+        <w:rPr>
+          <w:b/>
+          <w:i w:val="0"/>
+          <w:sz w:val="22"/>
+        </w:rPr>
+        <w:t>Origen de cada valor (de dónde sale):</w:t>
+      </w:r>
+    </w:p>
+    <w:tbl>
+      <w:tblPr>
+        <w:tblStyle w:val="LightList-Accent1"/>
+        <w:tblW w:type="auto" w:w="0"/>
+        <w:tblLook w:firstColumn="1" w:firstRow="1" w:lastColumn="0" w:lastRow="0" w:noHBand="0" w:noVBand="1" w:val="04A0"/>
+      </w:tblPr>
+      <w:tblGrid>
+        <w:gridCol w:w="4320"/>
+        <w:gridCol w:w="4320"/>
+      </w:tblGrid>
+      <w:tr>
+        <w:tc>
+          <w:tcPr>
+            <w:tcW w:type="dxa" w:w="4320"/>
+          </w:tcPr>
+          <w:p>
+            <w:r>
+              <w:t>Dimensión / dato</w:t>
+            </w:r>
+          </w:p>
+        </w:tc>
+        <w:tc>
+          <w:tcPr>
+            <w:tcW w:type="dxa" w:w="4320"/>
+          </w:tcPr>
+          <w:p>
+            <w:r>
+              <w:t>De dónde se obtiene</w:t>
+            </w:r>
+          </w:p>
+        </w:tc>
+      </w:tr>
+      <w:tr>
+        <w:tc>
+          <w:tcPr>
+            <w:tcW w:type="dxa" w:w="4320"/>
+          </w:tcPr>
+          <w:p>
+            <w:r>
+              <w:rPr>
+                <w:sz w:val="20"/>
+              </w:rPr>
+              <w:t>Z-1: 2.30×2.30×0.40, ×4</w:t>
+            </w:r>
+          </w:p>
+        </w:tc>
+        <w:tc>
+          <w:tcPr>
+            <w:tcW w:type="dxa" w:w="4320"/>
+          </w:tcPr>
+          <w:p>
+            <w:r>
+              <w:rPr>
+                <w:sz w:val="20"/>
+              </w:rPr>
+              <w:t>Zapatas bajo columnas 0.50×0.50 (ejes 2A,3A,2B,3B).</w:t>
+            </w:r>
+          </w:p>
+        </w:tc>
+      </w:tr>
+      <w:tr>
+        <w:tc>
+          <w:tcPr>
+            <w:tcW w:type="dxa" w:w="4320"/>
+          </w:tcPr>
+          <w:p>
+            <w:r>
+              <w:rPr>
+                <w:sz w:val="20"/>
+              </w:rPr>
+              <w:t>Z-2: 2.15×2.15×0.40, ×4</w:t>
+            </w:r>
+          </w:p>
+        </w:tc>
+        <w:tc>
+          <w:tcPr>
+            <w:tcW w:type="dxa" w:w="4320"/>
+          </w:tcPr>
+          <w:p>
+            <w:r>
+              <w:rPr>
+                <w:sz w:val="20"/>
+              </w:rPr>
+              <w:t>Zapatas bajo columnas 0.40×0.40 (ejes 1A,4A,1B,4B).</w:t>
+            </w:r>
+          </w:p>
+        </w:tc>
+      </w:tr>
+      <w:tr>
+        <w:tc>
+          <w:tcPr>
+            <w:tcW w:type="dxa" w:w="4320"/>
+          </w:tcPr>
+          <w:p>
+            <w:r>
+              <w:rPr>
+                <w:sz w:val="20"/>
+              </w:rPr>
+              <w:t>H = 0.40 m</w:t>
+            </w:r>
+          </w:p>
+        </w:tc>
+        <w:tc>
+          <w:tcPr>
+            <w:tcW w:type="dxa" w:w="4320"/>
+          </w:tcPr>
+          <w:p>
+            <w:r>
+              <w:rPr>
+                <w:sz w:val="20"/>
+              </w:rPr>
+              <w:t>Altura de zapata del cuadro de zapatas.</w:t>
+            </w:r>
+          </w:p>
+        </w:tc>
+      </w:tr>
+    </w:tbl>
+    <w:p>
+      <w:pPr>
+        <w:spacing w:after="120"/>
+      </w:pPr>
+      <w:r>
+        <w:rPr>
+          <w:b w:val="0"/>
+          <w:i w:val="0"/>
+          <w:sz w:val="22"/>
+        </w:rPr>
+      </w:r>
+    </w:p>
+    <w:p>
+      <w:pPr>
+        <w:spacing w:after="40"/>
+      </w:pPr>
+      <w:r>
+        <w:rPr>
+          <w:b/>
+          <w:i w:val="0"/>
+          <w:sz w:val="22"/>
+        </w:rPr>
+        <w:t>Cálculo:</w:t>
+      </w:r>
+    </w:p>
+    <w:p>
+      <w:r>
+        <w:rPr>
+          <w:b/>
+          <w:color w:val="1F3B73"/>
+          <w:sz w:val="23"/>
+        </w:rPr>
+        <w:t>V = (2.30²×0.40×4) + (2.15²×0.40×4) = 8.46 + 7.40</w:t>
+      </w:r>
+    </w:p>
+    <w:p>
+      <w:r>
+        <w:rPr>
+          <w:b/>
+          <w:color w:val="006600"/>
+          <w:sz w:val="23"/>
+        </w:rPr>
+        <w:t>➜ Resultado: 15.86 m³</w:t>
+      </w:r>
+    </w:p>
+    <w:p>
+      <w:pPr>
+        <w:spacing w:after="120"/>
+      </w:pPr>
+      <w:r>
+        <w:rPr>
+          <w:b w:val="0"/>
+          <w:i/>
+          <w:color w:val="B06000"/>
+          <w:sz w:val="20"/>
+        </w:rPr>
+        <w:t>Observación: AGREGADO: las zapatas estaban en el plano pero no en la memoria. Falta agregar la línea 2.2.3 al presupuesto.</w:t>
+      </w:r>
+    </w:p>
+    <w:p>
+      <w:pPr>
+        <w:spacing w:after="240"/>
+      </w:pPr>
+      <w:r>
+        <w:rPr>
+          <w:b w:val="0"/>
+          <w:i/>
+          <w:color w:val="404040"/>
+          <w:sz w:val="20"/>
+        </w:rPr>
+        <w:t>Foto de referencia para el formato: Figura 3.1 (cuadro de zapatas) + detalle de zapata.</w:t>
       </w:r>
     </w:p>
     <w:p>
@@ -3434,6 +4043,206 @@
       </w:r>
     </w:p>
     <w:p>
+      <w:pPr>
+        <w:pStyle w:val="Heading2"/>
+      </w:pPr>
+      <w:r>
+        <w:rPr>
+          <w:color w:val="1F3B73"/>
+        </w:rPr>
+        <w:t>Ítem 2.3.2 — Acero figurado zapatas  (KG)</w:t>
+      </w:r>
+    </w:p>
+    <w:p>
+      <w:pPr>
+        <w:spacing w:after="80"/>
+      </w:pPr>
+      <w:r>
+        <w:rPr>
+          <w:b w:val="0"/>
+          <w:i/>
+          <w:color w:val="404040"/>
+          <w:sz w:val="20"/>
+        </w:rPr>
+        <w:t>Capítulo: 2. Refuerzos / Acero</w:t>
+      </w:r>
+    </w:p>
+    <w:p>
+      <w:pPr>
+        <w:spacing w:after="40"/>
+      </w:pPr>
+      <w:r>
+        <w:rPr>
+          <w:b/>
+          <w:i w:val="0"/>
+          <w:sz w:val="22"/>
+        </w:rPr>
+        <w:t>Origen de cada valor (de dónde sale):</w:t>
+      </w:r>
+    </w:p>
+    <w:tbl>
+      <w:tblPr>
+        <w:tblStyle w:val="LightList-Accent1"/>
+        <w:tblW w:type="auto" w:w="0"/>
+        <w:tblLook w:firstColumn="1" w:firstRow="1" w:lastColumn="0" w:lastRow="0" w:noHBand="0" w:noVBand="1" w:val="04A0"/>
+      </w:tblPr>
+      <w:tblGrid>
+        <w:gridCol w:w="4320"/>
+        <w:gridCol w:w="4320"/>
+      </w:tblGrid>
+      <w:tr>
+        <w:tc>
+          <w:tcPr>
+            <w:tcW w:type="dxa" w:w="4320"/>
+          </w:tcPr>
+          <w:p>
+            <w:r>
+              <w:t>Dimensión / dato</w:t>
+            </w:r>
+          </w:p>
+        </w:tc>
+        <w:tc>
+          <w:tcPr>
+            <w:tcW w:type="dxa" w:w="4320"/>
+          </w:tcPr>
+          <w:p>
+            <w:r>
+              <w:t>De dónde se obtiene</w:t>
+            </w:r>
+          </w:p>
+        </w:tc>
+      </w:tr>
+      <w:tr>
+        <w:tc>
+          <w:tcPr>
+            <w:tcW w:type="dxa" w:w="4320"/>
+          </w:tcPr>
+          <w:p>
+            <w:r>
+              <w:rPr>
+                <w:sz w:val="20"/>
+              </w:rPr>
+              <w:t>Z-1 (×4) y Z-2 (×4)</w:t>
+            </w:r>
+          </w:p>
+        </w:tc>
+        <w:tc>
+          <w:tcPr>
+            <w:tcW w:type="dxa" w:w="4320"/>
+          </w:tcPr>
+          <w:p>
+            <w:r>
+              <w:rPr>
+                <w:sz w:val="20"/>
+              </w:rPr>
+              <w:t>Parrilla #5 @0.20 en ambas direcciones (del cuadro de zapatas).</w:t>
+            </w:r>
+          </w:p>
+        </w:tc>
+      </w:tr>
+      <w:tr>
+        <w:tc>
+          <w:tcPr>
+            <w:tcW w:type="dxa" w:w="4320"/>
+          </w:tcPr>
+          <w:p>
+            <w:r>
+              <w:rPr>
+                <w:sz w:val="20"/>
+              </w:rPr>
+              <w:t>+10 %</w:t>
+            </w:r>
+          </w:p>
+        </w:tc>
+        <w:tc>
+          <w:tcPr>
+            <w:tcW w:type="dxa" w:w="4320"/>
+          </w:tcPr>
+          <w:p>
+            <w:r>
+              <w:rPr>
+                <w:sz w:val="20"/>
+              </w:rPr>
+              <w:t>Desperdicio y traslapos.</w:t>
+            </w:r>
+          </w:p>
+        </w:tc>
+      </w:tr>
+    </w:tbl>
+    <w:p>
+      <w:pPr>
+        <w:spacing w:after="120"/>
+      </w:pPr>
+      <w:r>
+        <w:rPr>
+          <w:b w:val="0"/>
+          <w:i w:val="0"/>
+          <w:sz w:val="22"/>
+        </w:rPr>
+      </w:r>
+    </w:p>
+    <w:p>
+      <w:pPr>
+        <w:spacing w:after="40"/>
+      </w:pPr>
+      <w:r>
+        <w:rPr>
+          <w:b/>
+          <w:i w:val="0"/>
+          <w:sz w:val="22"/>
+        </w:rPr>
+        <w:t>Cálculo:</w:t>
+      </w:r>
+    </w:p>
+    <w:p>
+      <w:r>
+        <w:rPr>
+          <w:b/>
+          <w:color w:val="1F3B73"/>
+          <w:sz w:val="23"/>
+        </w:rPr>
+        <w:t>≈ 327.8 kg (Z-1) + 280.0 kg (Z-2) = 607.8 kg × 1.10</w:t>
+      </w:r>
+    </w:p>
+    <w:p>
+      <w:r>
+        <w:rPr>
+          <w:b/>
+          <w:color w:val="006600"/>
+          <w:sz w:val="23"/>
+        </w:rPr>
+        <w:t>➜ Resultado: ≈ 668.6 kg (estimación)</w:t>
+      </w:r>
+    </w:p>
+    <w:p>
+      <w:pPr>
+        <w:spacing w:after="120"/>
+      </w:pPr>
+      <w:r>
+        <w:rPr>
+          <w:b w:val="0"/>
+          <w:i/>
+          <w:color w:val="B06000"/>
+          <w:sz w:val="20"/>
+        </w:rPr>
+        <w:t>Observación: AGREGADO (estimación): el peso exacto sale de la cartilla de hierros. Falta la línea 2.3.2 en el presupuesto.</w:t>
+      </w:r>
+    </w:p>
+    <w:p>
+      <w:pPr>
+        <w:spacing w:after="240"/>
+      </w:pPr>
+      <w:r>
+        <w:rPr>
+          <w:b w:val="0"/>
+          <w:i/>
+          <w:color w:val="404040"/>
+          <w:sz w:val="20"/>
+        </w:rPr>
+        <w:t>Foto de referencia para el formato: Figura 3.1 (cuadro de zapatas: #5 @0.20 ambos sentidos).</w:t>
+      </w:r>
+    </w:p>
+    <w:p>
       <w:r>
         <w:br w:type="page"/>
       </w:r>
@@ -3671,7 +4480,7 @@
         <w:drawing>
           <wp:inline xmlns:a="http://schemas.openxmlformats.org/drawingml/2006/main" xmlns:pic="http://schemas.openxmlformats.org/drawingml/2006/picture">
             <wp:extent cx="5400000" cy="3657200"/>
-            <wp:docPr id="11" name="Picture 11"/>
+            <wp:docPr id="12" name="Picture 12"/>
             <wp:cNvGraphicFramePr>
               <a:graphicFrameLocks noChangeAspect="1"/>
             </wp:cNvGraphicFramePr>
@@ -3683,7 +4492,7 @@
                     <pic:cNvPicPr/>
                   </pic:nvPicPr>
                   <pic:blipFill>
-                    <a:blip r:embed="rId19"/>
+                    <a:blip r:embed="rId20"/>
                     <a:stretch>
                       <a:fillRect/>
                     </a:stretch>
@@ -4395,7 +5204,7 @@
         <w:drawing>
           <wp:inline xmlns:a="http://schemas.openxmlformats.org/drawingml/2006/main" xmlns:pic="http://schemas.openxmlformats.org/drawingml/2006/picture">
             <wp:extent cx="5400000" cy="2950574"/>
-            <wp:docPr id="12" name="Picture 12"/>
+            <wp:docPr id="13" name="Picture 13"/>
             <wp:cNvGraphicFramePr>
               <a:graphicFrameLocks noChangeAspect="1"/>
             </wp:cNvGraphicFramePr>
@@ -4407,7 +5216,7 @@
                     <pic:cNvPicPr/>
                   </pic:nvPicPr>
                   <pic:blipFill>
-                    <a:blip r:embed="rId20"/>
+                    <a:blip r:embed="rId21"/>
                     <a:stretch>
                       <a:fillRect/>
                     </a:stretch>
@@ -5149,7 +5958,7 @@
         <w:drawing>
           <wp:inline xmlns:a="http://schemas.openxmlformats.org/drawingml/2006/main" xmlns:pic="http://schemas.openxmlformats.org/drawingml/2006/picture">
             <wp:extent cx="5400000" cy="2691554"/>
-            <wp:docPr id="13" name="Picture 13"/>
+            <wp:docPr id="14" name="Picture 14"/>
             <wp:cNvGraphicFramePr>
               <a:graphicFrameLocks noChangeAspect="1"/>
             </wp:cNvGraphicFramePr>
@@ -5161,7 +5970,7 @@
                     <pic:cNvPicPr/>
                   </pic:nvPicPr>
                   <pic:blipFill>
-                    <a:blip r:embed="rId21"/>
+                    <a:blip r:embed="rId22"/>
                     <a:stretch>
                       <a:fillRect/>
                     </a:stretch>
@@ -6197,7 +7006,208 @@
               <w:rPr>
                 <w:sz w:val="18"/>
               </w:rPr>
-              <w:t>118.92</w:t>
+              <w:t>129.72</w:t>
+            </w:r>
+          </w:p>
+        </w:tc>
+        <w:tc>
+          <w:tcPr>
+            <w:tcW w:type="dxa" w:w="1728"/>
+          </w:tcPr>
+          <w:p>
+            <w:r>
+              <w:rPr>
+                <w:sz w:val="18"/>
+              </w:rPr>
+              <w:t>CORREGIDO / huella</w:t>
+            </w:r>
+          </w:p>
+        </w:tc>
+      </w:tr>
+      <w:tr>
+        <w:tc>
+          <w:tcPr>
+            <w:tcW w:type="dxa" w:w="1728"/>
+          </w:tcPr>
+          <w:p>
+            <w:r>
+              <w:rPr>
+                <w:sz w:val="18"/>
+              </w:rPr>
+              <w:t>2.1.2</w:t>
+            </w:r>
+          </w:p>
+        </w:tc>
+        <w:tc>
+          <w:tcPr>
+            <w:tcW w:type="dxa" w:w="1728"/>
+          </w:tcPr>
+          <w:p>
+            <w:r>
+              <w:rPr>
+                <w:sz w:val="18"/>
+              </w:rPr>
+              <w:t>Relleno sub-base B-400</w:t>
+            </w:r>
+          </w:p>
+        </w:tc>
+        <w:tc>
+          <w:tcPr>
+            <w:tcW w:type="dxa" w:w="1728"/>
+          </w:tcPr>
+          <w:p>
+            <w:r>
+              <w:rPr>
+                <w:sz w:val="18"/>
+              </w:rPr>
+              <w:t>M3</w:t>
+            </w:r>
+          </w:p>
+        </w:tc>
+        <w:tc>
+          <w:tcPr>
+            <w:tcW w:type="dxa" w:w="1728"/>
+          </w:tcPr>
+          <w:p>
+            <w:r>
+              <w:rPr>
+                <w:sz w:val="18"/>
+              </w:rPr>
+              <w:t>64.86</w:t>
+            </w:r>
+          </w:p>
+        </w:tc>
+        <w:tc>
+          <w:tcPr>
+            <w:tcW w:type="dxa" w:w="1728"/>
+          </w:tcPr>
+          <w:p>
+            <w:r>
+              <w:rPr>
+                <w:sz w:val="18"/>
+              </w:rPr>
+              <w:t>CORREGIDO / huella</w:t>
+            </w:r>
+          </w:p>
+        </w:tc>
+      </w:tr>
+      <w:tr>
+        <w:tc>
+          <w:tcPr>
+            <w:tcW w:type="dxa" w:w="1728"/>
+          </w:tcPr>
+          <w:p>
+            <w:r>
+              <w:rPr>
+                <w:sz w:val="18"/>
+              </w:rPr>
+              <w:t>2.1.3</w:t>
+            </w:r>
+          </w:p>
+        </w:tc>
+        <w:tc>
+          <w:tcPr>
+            <w:tcW w:type="dxa" w:w="1728"/>
+          </w:tcPr>
+          <w:p>
+            <w:r>
+              <w:rPr>
+                <w:sz w:val="18"/>
+              </w:rPr>
+              <w:t>Excavación manual (zanjas + zapatas)</w:t>
+            </w:r>
+          </w:p>
+        </w:tc>
+        <w:tc>
+          <w:tcPr>
+            <w:tcW w:type="dxa" w:w="1728"/>
+          </w:tcPr>
+          <w:p>
+            <w:r>
+              <w:rPr>
+                <w:sz w:val="18"/>
+              </w:rPr>
+              <w:t>M3</w:t>
+            </w:r>
+          </w:p>
+        </w:tc>
+        <w:tc>
+          <w:tcPr>
+            <w:tcW w:type="dxa" w:w="1728"/>
+          </w:tcPr>
+          <w:p>
+            <w:r>
+              <w:rPr>
+                <w:sz w:val="18"/>
+              </w:rPr>
+              <w:t>49.38</w:t>
+            </w:r>
+          </w:p>
+        </w:tc>
+        <w:tc>
+          <w:tcPr>
+            <w:tcW w:type="dxa" w:w="1728"/>
+          </w:tcPr>
+          <w:p>
+            <w:r>
+              <w:rPr>
+                <w:sz w:val="18"/>
+              </w:rPr>
+              <w:t>CORREGIDO</w:t>
+            </w:r>
+          </w:p>
+        </w:tc>
+      </w:tr>
+      <w:tr>
+        <w:tc>
+          <w:tcPr>
+            <w:tcW w:type="dxa" w:w="1728"/>
+          </w:tcPr>
+          <w:p>
+            <w:r>
+              <w:rPr>
+                <w:sz w:val="18"/>
+              </w:rPr>
+              <w:t>2.1.4</w:t>
+            </w:r>
+          </w:p>
+        </w:tc>
+        <w:tc>
+          <w:tcPr>
+            <w:tcW w:type="dxa" w:w="1728"/>
+          </w:tcPr>
+          <w:p>
+            <w:r>
+              <w:rPr>
+                <w:sz w:val="18"/>
+              </w:rPr>
+              <w:t>Relleno común (recebo)</w:t>
+            </w:r>
+          </w:p>
+        </w:tc>
+        <w:tc>
+          <w:tcPr>
+            <w:tcW w:type="dxa" w:w="1728"/>
+          </w:tcPr>
+          <w:p>
+            <w:r>
+              <w:rPr>
+                <w:sz w:val="18"/>
+              </w:rPr>
+              <w:t>M3</w:t>
+            </w:r>
+          </w:p>
+        </w:tc>
+        <w:tc>
+          <w:tcPr>
+            <w:tcW w:type="dxa" w:w="1728"/>
+          </w:tcPr>
+          <w:p>
+            <w:r>
+              <w:rPr>
+                <w:sz w:val="18"/>
+              </w:rPr>
+              <w:t>43.24</w:t>
             </w:r>
           </w:p>
         </w:tc>
@@ -6225,7 +7235,7 @@
               <w:rPr>
                 <w:sz w:val="18"/>
               </w:rPr>
-              <w:t>2.1.2</w:t>
+              <w:t>2.1.6</w:t>
             </w:r>
           </w:p>
         </w:tc>
@@ -6238,7 +7248,74 @@
               <w:rPr>
                 <w:sz w:val="18"/>
               </w:rPr>
-              <w:t>Relleno sub-base B-400</w:t>
+              <w:t>Geotextil NT 1600</w:t>
+            </w:r>
+          </w:p>
+        </w:tc>
+        <w:tc>
+          <w:tcPr>
+            <w:tcW w:type="dxa" w:w="1728"/>
+          </w:tcPr>
+          <w:p>
+            <w:r>
+              <w:rPr>
+                <w:sz w:val="18"/>
+              </w:rPr>
+              <w:t>M2</w:t>
+            </w:r>
+          </w:p>
+        </w:tc>
+        <w:tc>
+          <w:tcPr>
+            <w:tcW w:type="dxa" w:w="1728"/>
+          </w:tcPr>
+          <w:p>
+            <w:r>
+              <w:rPr>
+                <w:sz w:val="18"/>
+              </w:rPr>
+              <w:t>216.21</w:t>
+            </w:r>
+          </w:p>
+        </w:tc>
+        <w:tc>
+          <w:tcPr>
+            <w:tcW w:type="dxa" w:w="1728"/>
+          </w:tcPr>
+          <w:p>
+            <w:r>
+              <w:rPr>
+                <w:sz w:val="18"/>
+              </w:rPr>
+              <w:t>por confirmar huella</w:t>
+            </w:r>
+          </w:p>
+        </w:tc>
+      </w:tr>
+      <w:tr>
+        <w:tc>
+          <w:tcPr>
+            <w:tcW w:type="dxa" w:w="1728"/>
+          </w:tcPr>
+          <w:p>
+            <w:r>
+              <w:rPr>
+                <w:sz w:val="18"/>
+              </w:rPr>
+              <w:t>2.2.1</w:t>
+            </w:r>
+          </w:p>
+        </w:tc>
+        <w:tc>
+          <w:tcPr>
+            <w:tcW w:type="dxa" w:w="1728"/>
+          </w:tcPr>
+          <w:p>
+            <w:r>
+              <w:rPr>
+                <w:sz w:val="18"/>
+              </w:rPr>
+              <w:t>Vigas de cimentación 3000 psi</w:t>
             </w:r>
           </w:p>
         </w:tc>
@@ -6264,7 +7341,7 @@
               <w:rPr>
                 <w:sz w:val="18"/>
               </w:rPr>
-              <w:t>32.44</w:t>
+              <w:t>13.70</w:t>
             </w:r>
           </w:p>
         </w:tc>
@@ -6277,7 +7354,7 @@
               <w:rPr>
                 <w:sz w:val="18"/>
               </w:rPr>
-              <w:t>por confirmar huella</w:t>
+              <w:t>verificado</w:t>
             </w:r>
           </w:p>
         </w:tc>
@@ -6292,7 +7369,7 @@
               <w:rPr>
                 <w:sz w:val="18"/>
               </w:rPr>
-              <w:t>2.1.3</w:t>
+              <w:t>2.2.2</w:t>
             </w:r>
           </w:p>
         </w:tc>
@@ -6305,7 +7382,74 @@
               <w:rPr>
                 <w:sz w:val="18"/>
               </w:rPr>
-              <w:t>Excavación manual</w:t>
+              <w:t>Solado 1500 psi e=0.05</w:t>
+            </w:r>
+          </w:p>
+        </w:tc>
+        <w:tc>
+          <w:tcPr>
+            <w:tcW w:type="dxa" w:w="1728"/>
+          </w:tcPr>
+          <w:p>
+            <w:r>
+              <w:rPr>
+                <w:sz w:val="18"/>
+              </w:rPr>
+              <w:t>M2</w:t>
+            </w:r>
+          </w:p>
+        </w:tc>
+        <w:tc>
+          <w:tcPr>
+            <w:tcW w:type="dxa" w:w="1728"/>
+          </w:tcPr>
+          <w:p>
+            <w:r>
+              <w:rPr>
+                <w:sz w:val="18"/>
+              </w:rPr>
+              <w:t>77.70</w:t>
+            </w:r>
+          </w:p>
+        </w:tc>
+        <w:tc>
+          <w:tcPr>
+            <w:tcW w:type="dxa" w:w="1728"/>
+          </w:tcPr>
+          <w:p>
+            <w:r>
+              <w:rPr>
+                <w:sz w:val="18"/>
+              </w:rPr>
+              <w:t>CORREGIDO (+ zapatas)</w:t>
+            </w:r>
+          </w:p>
+        </w:tc>
+      </w:tr>
+      <w:tr>
+        <w:tc>
+          <w:tcPr>
+            <w:tcW w:type="dxa" w:w="1728"/>
+          </w:tcPr>
+          <w:p>
+            <w:r>
+              <w:rPr>
+                <w:sz w:val="18"/>
+              </w:rPr>
+              <w:t>2.2.3</w:t>
+            </w:r>
+          </w:p>
+        </w:tc>
+        <w:tc>
+          <w:tcPr>
+            <w:tcW w:type="dxa" w:w="1728"/>
+          </w:tcPr>
+          <w:p>
+            <w:r>
+              <w:rPr>
+                <w:sz w:val="18"/>
+              </w:rPr>
+              <w:t>Zapatas concreto 3000 psi</w:t>
             </w:r>
           </w:p>
         </w:tc>
@@ -6331,7 +7475,7 @@
               <w:rPr>
                 <w:sz w:val="18"/>
               </w:rPr>
-              <w:t>12.18</w:t>
+              <w:t>15.86</w:t>
             </w:r>
           </w:p>
         </w:tc>
@@ -6344,275 +7488,7 @@
               <w:rPr>
                 <w:sz w:val="18"/>
               </w:rPr>
-              <w:t>verificado</w:t>
-            </w:r>
-          </w:p>
-        </w:tc>
-      </w:tr>
-      <w:tr>
-        <w:tc>
-          <w:tcPr>
-            <w:tcW w:type="dxa" w:w="1728"/>
-          </w:tcPr>
-          <w:p>
-            <w:r>
-              <w:rPr>
-                <w:sz w:val="18"/>
-              </w:rPr>
-              <w:t>2.1.4</w:t>
-            </w:r>
-          </w:p>
-        </w:tc>
-        <w:tc>
-          <w:tcPr>
-            <w:tcW w:type="dxa" w:w="1728"/>
-          </w:tcPr>
-          <w:p>
-            <w:r>
-              <w:rPr>
-                <w:sz w:val="18"/>
-              </w:rPr>
-              <w:t>Relleno común (recebo)</w:t>
-            </w:r>
-          </w:p>
-        </w:tc>
-        <w:tc>
-          <w:tcPr>
-            <w:tcW w:type="dxa" w:w="1728"/>
-          </w:tcPr>
-          <w:p>
-            <w:r>
-              <w:rPr>
-                <w:sz w:val="18"/>
-              </w:rPr>
-              <w:t>M3</w:t>
-            </w:r>
-          </w:p>
-        </w:tc>
-        <w:tc>
-          <w:tcPr>
-            <w:tcW w:type="dxa" w:w="1728"/>
-          </w:tcPr>
-          <w:p>
-            <w:r>
-              <w:rPr>
-                <w:sz w:val="18"/>
-              </w:rPr>
-              <w:t>43.24</w:t>
-            </w:r>
-          </w:p>
-        </w:tc>
-        <w:tc>
-          <w:tcPr>
-            <w:tcW w:type="dxa" w:w="1728"/>
-          </w:tcPr>
-          <w:p>
-            <w:r>
-              <w:rPr>
-                <w:sz w:val="18"/>
-              </w:rPr>
-              <w:t>por confirmar huella</w:t>
-            </w:r>
-          </w:p>
-        </w:tc>
-      </w:tr>
-      <w:tr>
-        <w:tc>
-          <w:tcPr>
-            <w:tcW w:type="dxa" w:w="1728"/>
-          </w:tcPr>
-          <w:p>
-            <w:r>
-              <w:rPr>
-                <w:sz w:val="18"/>
-              </w:rPr>
-              <w:t>2.1.6</w:t>
-            </w:r>
-          </w:p>
-        </w:tc>
-        <w:tc>
-          <w:tcPr>
-            <w:tcW w:type="dxa" w:w="1728"/>
-          </w:tcPr>
-          <w:p>
-            <w:r>
-              <w:rPr>
-                <w:sz w:val="18"/>
-              </w:rPr>
-              <w:t>Geotextil NT 1600</w:t>
-            </w:r>
-          </w:p>
-        </w:tc>
-        <w:tc>
-          <w:tcPr>
-            <w:tcW w:type="dxa" w:w="1728"/>
-          </w:tcPr>
-          <w:p>
-            <w:r>
-              <w:rPr>
-                <w:sz w:val="18"/>
-              </w:rPr>
-              <w:t>M2</w:t>
-            </w:r>
-          </w:p>
-        </w:tc>
-        <w:tc>
-          <w:tcPr>
-            <w:tcW w:type="dxa" w:w="1728"/>
-          </w:tcPr>
-          <w:p>
-            <w:r>
-              <w:rPr>
-                <w:sz w:val="18"/>
-              </w:rPr>
-              <w:t>216.21</w:t>
-            </w:r>
-          </w:p>
-        </w:tc>
-        <w:tc>
-          <w:tcPr>
-            <w:tcW w:type="dxa" w:w="1728"/>
-          </w:tcPr>
-          <w:p>
-            <w:r>
-              <w:rPr>
-                <w:sz w:val="18"/>
-              </w:rPr>
-              <w:t>por confirmar huella</w:t>
-            </w:r>
-          </w:p>
-        </w:tc>
-      </w:tr>
-      <w:tr>
-        <w:tc>
-          <w:tcPr>
-            <w:tcW w:type="dxa" w:w="1728"/>
-          </w:tcPr>
-          <w:p>
-            <w:r>
-              <w:rPr>
-                <w:sz w:val="18"/>
-              </w:rPr>
-              <w:t>2.2.1</w:t>
-            </w:r>
-          </w:p>
-        </w:tc>
-        <w:tc>
-          <w:tcPr>
-            <w:tcW w:type="dxa" w:w="1728"/>
-          </w:tcPr>
-          <w:p>
-            <w:r>
-              <w:rPr>
-                <w:sz w:val="18"/>
-              </w:rPr>
-              <w:t>Vigas de cimentación 3000 psi</w:t>
-            </w:r>
-          </w:p>
-        </w:tc>
-        <w:tc>
-          <w:tcPr>
-            <w:tcW w:type="dxa" w:w="1728"/>
-          </w:tcPr>
-          <w:p>
-            <w:r>
-              <w:rPr>
-                <w:sz w:val="18"/>
-              </w:rPr>
-              <w:t>M3</w:t>
-            </w:r>
-          </w:p>
-        </w:tc>
-        <w:tc>
-          <w:tcPr>
-            <w:tcW w:type="dxa" w:w="1728"/>
-          </w:tcPr>
-          <w:p>
-            <w:r>
-              <w:rPr>
-                <w:sz w:val="18"/>
-              </w:rPr>
-              <w:t>13.70</w:t>
-            </w:r>
-          </w:p>
-        </w:tc>
-        <w:tc>
-          <w:tcPr>
-            <w:tcW w:type="dxa" w:w="1728"/>
-          </w:tcPr>
-          <w:p>
-            <w:r>
-              <w:rPr>
-                <w:sz w:val="18"/>
-              </w:rPr>
-              <w:t>verificado</w:t>
-            </w:r>
-          </w:p>
-        </w:tc>
-      </w:tr>
-      <w:tr>
-        <w:tc>
-          <w:tcPr>
-            <w:tcW w:type="dxa" w:w="1728"/>
-          </w:tcPr>
-          <w:p>
-            <w:r>
-              <w:rPr>
-                <w:sz w:val="18"/>
-              </w:rPr>
-              <w:t>2.2.2</w:t>
-            </w:r>
-          </w:p>
-        </w:tc>
-        <w:tc>
-          <w:tcPr>
-            <w:tcW w:type="dxa" w:w="1728"/>
-          </w:tcPr>
-          <w:p>
-            <w:r>
-              <w:rPr>
-                <w:sz w:val="18"/>
-              </w:rPr>
-              <w:t>Solado 1500 psi e=0.05</w:t>
-            </w:r>
-          </w:p>
-        </w:tc>
-        <w:tc>
-          <w:tcPr>
-            <w:tcW w:type="dxa" w:w="1728"/>
-          </w:tcPr>
-          <w:p>
-            <w:r>
-              <w:rPr>
-                <w:sz w:val="18"/>
-              </w:rPr>
-              <w:t>M2</w:t>
-            </w:r>
-          </w:p>
-        </w:tc>
-        <w:tc>
-          <w:tcPr>
-            <w:tcW w:type="dxa" w:w="1728"/>
-          </w:tcPr>
-          <w:p>
-            <w:r>
-              <w:rPr>
-                <w:sz w:val="18"/>
-              </w:rPr>
-              <w:t>38.05</w:t>
-            </w:r>
-          </w:p>
-        </w:tc>
-        <w:tc>
-          <w:tcPr>
-            <w:tcW w:type="dxa" w:w="1728"/>
-          </w:tcPr>
-          <w:p>
-            <w:r>
-              <w:rPr>
-                <w:sz w:val="18"/>
-              </w:rPr>
-              <w:t>verificado</w:t>
+              <w:t>AGREGADO</w:t>
             </w:r>
           </w:p>
         </w:tc>
@@ -6680,6 +7556,73 @@
                 <w:sz w:val="18"/>
               </w:rPr>
               <w:t>cartilla</w:t>
+            </w:r>
+          </w:p>
+        </w:tc>
+      </w:tr>
+      <w:tr>
+        <w:tc>
+          <w:tcPr>
+            <w:tcW w:type="dxa" w:w="1728"/>
+          </w:tcPr>
+          <w:p>
+            <w:r>
+              <w:rPr>
+                <w:sz w:val="18"/>
+              </w:rPr>
+              <w:t>2.3.2</w:t>
+            </w:r>
+          </w:p>
+        </w:tc>
+        <w:tc>
+          <w:tcPr>
+            <w:tcW w:type="dxa" w:w="1728"/>
+          </w:tcPr>
+          <w:p>
+            <w:r>
+              <w:rPr>
+                <w:sz w:val="18"/>
+              </w:rPr>
+              <w:t>Acero zapatas</w:t>
+            </w:r>
+          </w:p>
+        </w:tc>
+        <w:tc>
+          <w:tcPr>
+            <w:tcW w:type="dxa" w:w="1728"/>
+          </w:tcPr>
+          <w:p>
+            <w:r>
+              <w:rPr>
+                <w:sz w:val="18"/>
+              </w:rPr>
+              <w:t>KG</w:t>
+            </w:r>
+          </w:p>
+        </w:tc>
+        <w:tc>
+          <w:tcPr>
+            <w:tcW w:type="dxa" w:w="1728"/>
+          </w:tcPr>
+          <w:p>
+            <w:r>
+              <w:rPr>
+                <w:sz w:val="18"/>
+              </w:rPr>
+              <w:t>≈668.6</w:t>
+            </w:r>
+          </w:p>
+        </w:tc>
+        <w:tc>
+          <w:tcPr>
+            <w:tcW w:type="dxa" w:w="1728"/>
+          </w:tcPr>
+          <w:p>
+            <w:r>
+              <w:rPr>
+                <w:sz w:val="18"/>
+              </w:rPr>
+              <w:t>AGREGADO / cartilla</w:t>
             </w:r>
           </w:p>
         </w:tc>

</xml_diff>

<commit_message>
fix(columnas): alturas 4.75/4.95 (de -0.05 a +4.70/+4.90), volumen 7.99 m3
</commit_message>
<xml_diff>
--- a/Proyectos/Fundamentos-de-Construccion/EXPLICACION - Memoria de Calculo - Cantidades de Obra.docx
+++ b/Proyectos/Fundamentos-de-Construccion/EXPLICACION - Memoria de Calculo - Cantidades de Obra.docx
@@ -1421,7 +1421,7 @@
               <w:rPr>
                 <w:sz w:val="19"/>
               </w:rPr>
-              <w:t>8 col en 2 tipos: 4×(0.40×0.40, h=4.70) + 4×(0.50×0.50, h=4.90)</w:t>
+              <w:t>8 col en 2 tipos: 4×(0.40×0.40, h=4.75) + 4×(0.50×0.50, h=4.95)</w:t>
             </w:r>
           </w:p>
         </w:tc>
@@ -4338,7 +4338,7 @@
               <w:rPr>
                 <w:sz w:val="20"/>
               </w:rPr>
-              <w:t>Tipo 1: 0.40×0.40, h=4.70, 4 und</w:t>
+              <w:t>Tipo 1: 0.40×0.40, h=4.75, 4 und</w:t>
             </w:r>
           </w:p>
         </w:tc>
@@ -4351,7 +4351,7 @@
               <w:rPr>
                 <w:sz w:val="20"/>
               </w:rPr>
-              <w:t>Ejes 1A, 1B, 3'B, 4A (despiece del plano).</w:t>
+              <w:t>Ejes 1A, 1B, 3'B, 4A. Altura de −0.05 a +4.70 = 4.75 m (niveles del despiece).</w:t>
             </w:r>
           </w:p>
         </w:tc>
@@ -4366,7 +4366,7 @@
               <w:rPr>
                 <w:sz w:val="20"/>
               </w:rPr>
-              <w:t>Tipo 2: 0.50×0.50, h=4.90, 4 und</w:t>
+              <w:t>Tipo 2: 0.50×0.50, h=4.95, 4 und</w:t>
             </w:r>
           </w:p>
         </w:tc>
@@ -4379,7 +4379,7 @@
               <w:rPr>
                 <w:sz w:val="20"/>
               </w:rPr>
-              <w:t>Ejes 2A, 2B, 3A, 3B (despiece del plano).</w:t>
+              <w:t>Ejes 2A, 2B, 3A, 3B. Altura de −0.05 a +4.90 = 4.95 m.</w:t>
             </w:r>
           </w:p>
         </w:tc>
@@ -4407,7 +4407,7 @@
               <w:rPr>
                 <w:sz w:val="20"/>
               </w:rPr>
-              <w:t>Contadas y verificadas en el despiece (NO son 10).</w:t>
+              <w:t>Contadas y verificadas en el despiece ('Son 4' + 'Son 4'). NO son 10.</w:t>
             </w:r>
           </w:p>
         </w:tc>
@@ -4445,7 +4445,7 @@
           <w:color w:val="1F3B73"/>
           <w:sz w:val="23"/>
         </w:rPr>
-        <w:t>V = (0.40×0.40×4.70×4) + (0.50×0.50×4.90×4) = 3.01 + 4.90</w:t>
+        <w:t>V = (0.40×0.40×4.75×4) + (0.50×0.50×4.95×4) = 3.04 + 4.95</w:t>
       </w:r>
     </w:p>
     <w:p>
@@ -4455,7 +4455,7 @@
           <w:color w:val="006600"/>
           <w:sz w:val="23"/>
         </w:rPr>
-        <w:t>➜ Resultado: 7.91 m³</w:t>
+        <w:t>➜ Resultado: 7.99 m³</w:t>
       </w:r>
     </w:p>
     <w:p>
@@ -4469,7 +4469,7 @@
           <w:color w:val="B06000"/>
           <w:sz w:val="20"/>
         </w:rPr>
-        <w:t>Observación: CORREGIDO: antes se había puesto 10 columnas iguales de 0.40×0.40. El plano muestra 8 columnas en dos tipos.</w:t>
+        <w:t>Observación: CORREGIDO: antes 10 columnas iguales de 0.40×0.40 h=4.90. El plano muestra 8 columnas en dos tipos y las alturas se leen de −0.05 a +4.70/+4.90.</w:t>
       </w:r>
     </w:p>
     <w:p>
@@ -7676,7 +7676,7 @@
               <w:rPr>
                 <w:sz w:val="18"/>
               </w:rPr>
-              <w:t>7.91</w:t>
+              <w:t>7.99</w:t>
             </w:r>
           </w:p>
         </w:tc>

</xml_diff>

<commit_message>
fix(2.1.1): excavacion masiva = 0.40 m (sub-base+placa); el recebo va aparte, no se suma
</commit_message>
<xml_diff>
--- a/Proyectos/Fundamentos-de-Construccion/EXPLICACION - Memoria de Calculo - Cantidades de Obra.docx
+++ b/Proyectos/Fundamentos-de-Construccion/EXPLICACION - Memoria de Calculo - Cantidades de Obra.docx
@@ -1175,7 +1175,7 @@
               <w:rPr>
                 <w:sz w:val="19"/>
               </w:rPr>
-              <w:t>0.60 m (recebo 0.20 + sub-base 0.30 + placa 0.10)</w:t>
+              <w:t>0.40 m (sub-base 0.30 + placa 0.10; el recebo va aparte)</w:t>
             </w:r>
           </w:p>
         </w:tc>
@@ -2088,7 +2088,7 @@
               <w:rPr>
                 <w:sz w:val="20"/>
               </w:rPr>
-              <w:t>Alto = 0.60 m</w:t>
+              <w:t>Alto = 0.40 m</w:t>
             </w:r>
           </w:p>
         </w:tc>
@@ -2101,7 +2101,7 @@
               <w:rPr>
                 <w:sz w:val="20"/>
               </w:rPr>
-              <w:t>Profundidad de la excavación masiva = recebo 0.20 + sub-base 0.30 + placa 0.10 (paquete de reemplazo bajo la placa, hasta −0.65).</w:t>
+              <w:t>= sub-base 0.30 + placa 0.10 (el paquete de piso que muestra el detalle de la losa). El recebo NO se suma aquí: es un relleno que va en otra parte (backfill sobre las vigas).</w:t>
             </w:r>
           </w:p>
         </w:tc>
@@ -2139,7 +2139,7 @@
           <w:color w:val="1F3B73"/>
           <w:sz w:val="23"/>
         </w:rPr>
-        <w:t>V = 9.85 × 0.60 × 21.95 × 1</w:t>
+        <w:t>V = 9.85 × 0.40 × 21.95 × 1</w:t>
       </w:r>
     </w:p>
     <w:p>
@@ -2149,7 +2149,7 @@
           <w:color w:val="006600"/>
           <w:sz w:val="23"/>
         </w:rPr>
-        <w:t>➜ Resultado: 129.72 m³</w:t>
+        <w:t>➜ Resultado: 86.48 m³</w:t>
       </w:r>
     </w:p>
     <w:p>
@@ -2163,61 +2163,7 @@
           <w:color w:val="B06000"/>
           <w:sz w:val="20"/>
         </w:rPr>
-        <w:t>Observación: CORREGIDO: 0.55 → 0.60 m (el 0.55 no cuadraba). Huella 9.85×21.95 aún por confirmar en DWG.</w:t>
-      </w:r>
-    </w:p>
-    <w:p>
-      <w:pPr>
-        <w:jc w:val="center"/>
-      </w:pPr>
-      <w:r>
-        <w:drawing>
-          <wp:inline xmlns:a="http://schemas.openxmlformats.org/drawingml/2006/main" xmlns:pic="http://schemas.openxmlformats.org/drawingml/2006/picture">
-            <wp:extent cx="5400000" cy="2787097"/>
-            <wp:docPr id="10" name="Picture 10"/>
-            <wp:cNvGraphicFramePr>
-              <a:graphicFrameLocks noChangeAspect="1"/>
-            </wp:cNvGraphicFramePr>
-            <a:graphic>
-              <a:graphicData uri="http://schemas.openxmlformats.org/drawingml/2006/picture">
-                <pic:pic>
-                  <pic:nvPicPr>
-                    <pic:cNvPr id="0" name="esq_capas_placa.png"/>
-                    <pic:cNvPicPr/>
-                  </pic:nvPicPr>
-                  <pic:blipFill>
-                    <a:blip r:embed="rId18"/>
-                    <a:stretch>
-                      <a:fillRect/>
-                    </a:stretch>
-                  </pic:blipFill>
-                  <pic:spPr>
-                    <a:xfrm>
-                      <a:off x="0" y="0"/>
-                      <a:ext cx="5400000" cy="2787097"/>
-                    </a:xfrm>
-                    <a:prstGeom prst="rect"/>
-                  </pic:spPr>
-                </pic:pic>
-              </a:graphicData>
-            </a:graphic>
-          </wp:inline>
-        </w:drawing>
-      </w:r>
-    </w:p>
-    <w:p>
-      <w:pPr>
-        <w:spacing w:after="200"/>
-        <w:jc w:val="center"/>
-      </w:pPr>
-      <w:r>
-        <w:rPr>
-          <w:b w:val="0"/>
-          <w:i/>
-          <w:color w:val="404040"/>
-          <w:sz w:val="18"/>
-        </w:rPr>
-        <w:t>Esquema 1. Corte del sistema de piso.</w:t>
+        <w:t>Observación: CORREGIDO: 0.60 → 0.40 m. El detalle de la losa solo muestra sub-base 0.30 + placa 0.10. El recebo (2.1.4) es relleno aparte, no capa bajo la placa.</w:t>
       </w:r>
     </w:p>
     <w:p>
@@ -2231,7 +2177,7 @@
           <w:color w:val="404040"/>
           <w:sz w:val="20"/>
         </w:rPr>
-        <w:t>Foto de referencia para el formato: Figura 3.1 + corte lógico.</w:t>
+        <w:t>Foto de referencia para el formato: Figura 3.1 + detalle de losa de contrapiso.</w:t>
       </w:r>
     </w:p>
     <w:p>
@@ -3270,7 +3216,7 @@
         <w:drawing>
           <wp:inline xmlns:a="http://schemas.openxmlformats.org/drawingml/2006/main" xmlns:pic="http://schemas.openxmlformats.org/drawingml/2006/picture">
             <wp:extent cx="5400000" cy="6079787"/>
-            <wp:docPr id="11" name="Picture 11"/>
+            <wp:docPr id="10" name="Picture 10"/>
             <wp:cNvGraphicFramePr>
               <a:graphicFrameLocks noChangeAspect="1"/>
             </wp:cNvGraphicFramePr>
@@ -3282,7 +3228,7 @@
                     <pic:cNvPicPr/>
                   </pic:nvPicPr>
                   <pic:blipFill>
-                    <a:blip r:embed="rId19"/>
+                    <a:blip r:embed="rId18"/>
                     <a:stretch>
                       <a:fillRect/>
                     </a:stretch>
@@ -4480,7 +4426,7 @@
         <w:drawing>
           <wp:inline xmlns:a="http://schemas.openxmlformats.org/drawingml/2006/main" xmlns:pic="http://schemas.openxmlformats.org/drawingml/2006/picture">
             <wp:extent cx="5400000" cy="3657200"/>
-            <wp:docPr id="12" name="Picture 12"/>
+            <wp:docPr id="11" name="Picture 11"/>
             <wp:cNvGraphicFramePr>
               <a:graphicFrameLocks noChangeAspect="1"/>
             </wp:cNvGraphicFramePr>
@@ -4492,7 +4438,7 @@
                     <pic:cNvPicPr/>
                   </pic:nvPicPr>
                   <pic:blipFill>
-                    <a:blip r:embed="rId20"/>
+                    <a:blip r:embed="rId19"/>
                     <a:stretch>
                       <a:fillRect/>
                     </a:stretch>
@@ -5204,7 +5150,7 @@
         <w:drawing>
           <wp:inline xmlns:a="http://schemas.openxmlformats.org/drawingml/2006/main" xmlns:pic="http://schemas.openxmlformats.org/drawingml/2006/picture">
             <wp:extent cx="5400000" cy="2950574"/>
-            <wp:docPr id="13" name="Picture 13"/>
+            <wp:docPr id="12" name="Picture 12"/>
             <wp:cNvGraphicFramePr>
               <a:graphicFrameLocks noChangeAspect="1"/>
             </wp:cNvGraphicFramePr>
@@ -5216,7 +5162,7 @@
                     <pic:cNvPicPr/>
                   </pic:nvPicPr>
                   <pic:blipFill>
-                    <a:blip r:embed="rId21"/>
+                    <a:blip r:embed="rId20"/>
                     <a:stretch>
                       <a:fillRect/>
                     </a:stretch>
@@ -5958,7 +5904,7 @@
         <w:drawing>
           <wp:inline xmlns:a="http://schemas.openxmlformats.org/drawingml/2006/main" xmlns:pic="http://schemas.openxmlformats.org/drawingml/2006/picture">
             <wp:extent cx="5400000" cy="2691554"/>
-            <wp:docPr id="14" name="Picture 14"/>
+            <wp:docPr id="13" name="Picture 13"/>
             <wp:cNvGraphicFramePr>
               <a:graphicFrameLocks noChangeAspect="1"/>
             </wp:cNvGraphicFramePr>
@@ -5970,7 +5916,7 @@
                     <pic:cNvPicPr/>
                   </pic:nvPicPr>
                   <pic:blipFill>
-                    <a:blip r:embed="rId22"/>
+                    <a:blip r:embed="rId21"/>
                     <a:stretch>
                       <a:fillRect/>
                     </a:stretch>
@@ -7006,7 +6952,7 @@
               <w:rPr>
                 <w:sz w:val="18"/>
               </w:rPr>
-              <w:t>129.72</w:t>
+              <w:t>86.48</w:t>
             </w:r>
           </w:p>
         </w:tc>

</xml_diff>

<commit_message>
Recalcular acero por peso con tabla de masas de varilla
- Metodo: L(m) por calibre x masa (kg/m) + 10%, barras de los despieces
- 4.7.1 columnas: 1367.6 kg (6#6 T1; 4#6+4#7 T2; estribos+grapas #3)
- 2.3.1 vigas cim: 1401.9 kg (VC-1..4,3',A,B; estribos #3 L=1.58)
- 4.8.1 vigas cubierta: 1593.8 kg (VG-1..4 + VG-6/7; estribos #3 L=1.68)
- 2.3.2 zapatas: 652.8 kg (#5@0.20 dos sentidos)
- 5.2.1 mamposteria: 374.6 kg (columneta 2#4+est#3; cinta 2#3+gancho#2)
- Word: seccion de metodo de acero + tabla de masas + items actualizados
</commit_message>
<xml_diff>
--- a/Proyectos/Fundamentos-de-Construccion/EXPLICACION - Memoria de Calculo - Cantidades de Obra.docx
+++ b/Proyectos/Fundamentos-de-Construccion/EXPLICACION - Memoria de Calculo - Cantidades de Obra.docx
@@ -445,7 +445,7 @@
     </w:p>
     <w:p>
       <w:pPr>
-        <w:spacing w:after="80"/>
+        <w:spacing w:after="160"/>
       </w:pPr>
       <w:r>
         <w:rPr>
@@ -454,6 +454,507 @@
           <w:sz w:val="22"/>
         </w:rPr>
         <w:t>Las dimensiones se leen de los planos; por eso el formato pide la «IMAGEN/REFERENCIA» (el pantallazo del plano donde se ve la cota usada).</w:t>
+      </w:r>
+    </w:p>
+    <w:p>
+      <w:pPr>
+        <w:spacing w:after="40"/>
+      </w:pPr>
+      <w:r>
+        <w:rPr>
+          <w:b/>
+          <w:i w:val="0"/>
+          <w:color w:val="1F3B73"/>
+          <w:sz w:val="22"/>
+        </w:rPr>
+        <w:t>2.1  Cómo se calcula el ACERO (por peso)</w:t>
+      </w:r>
+    </w:p>
+    <w:p>
+      <w:pPr>
+        <w:spacing w:after="80"/>
+      </w:pPr>
+      <w:r>
+        <w:rPr>
+          <w:b w:val="0"/>
+          <w:i w:val="0"/>
+          <w:sz w:val="22"/>
+        </w:rPr>
+        <w:t>El acero se paga por kilogramos. El método es: para cada elemento se leen del DESPIECE el número, el calibre y la longitud de cada barra; se suma la longitud total de cada calibre y se multiplica por su masa lineal (kg/m). Al final se añade 10 % por desperdicio y traslapos:</w:t>
+      </w:r>
+    </w:p>
+    <w:p>
+      <w:pPr>
+        <w:jc w:val="center"/>
+      </w:pPr>
+      <w:r>
+        <w:rPr>
+          <w:b/>
+          <w:color w:val="1F3B73"/>
+          <w:sz w:val="25"/>
+        </w:rPr>
+        <w:t>kg = Σ [ Longitud total de cada calibre (m) × masa (kg/m) ] × 1.10</w:t>
+      </w:r>
+    </w:p>
+    <w:p>
+      <w:pPr>
+        <w:spacing w:after="80"/>
+      </w:pPr>
+      <w:r>
+        <w:rPr>
+          <w:b w:val="0"/>
+          <w:i w:val="0"/>
+          <w:sz w:val="22"/>
+        </w:rPr>
+        <w:t>Masa lineal de la varilla (tabla de cantidad de varillas por tonelada):</w:t>
+      </w:r>
+    </w:p>
+    <w:tbl>
+      <w:tblPr>
+        <w:tblStyle w:val="LightGrid-Accent1"/>
+        <w:tblW w:type="auto" w:w="0"/>
+        <w:jc w:val="center"/>
+        <w:tblLook w:firstColumn="1" w:firstRow="1" w:lastColumn="0" w:lastRow="0" w:noHBand="0" w:noVBand="1" w:val="04A0"/>
+      </w:tblPr>
+      <w:tblGrid>
+        <w:gridCol w:w="2160"/>
+        <w:gridCol w:w="2160"/>
+        <w:gridCol w:w="2160"/>
+        <w:gridCol w:w="2160"/>
+      </w:tblGrid>
+      <w:tr>
+        <w:tc>
+          <w:tcPr>
+            <w:tcW w:type="dxa" w:w="2160"/>
+          </w:tcPr>
+          <w:p>
+            <w:r>
+              <w:t>Barra</w:t>
+            </w:r>
+          </w:p>
+        </w:tc>
+        <w:tc>
+          <w:tcPr>
+            <w:tcW w:type="dxa" w:w="2160"/>
+          </w:tcPr>
+          <w:p>
+            <w:r>
+              <w:t>Pulg.</w:t>
+            </w:r>
+          </w:p>
+        </w:tc>
+        <w:tc>
+          <w:tcPr>
+            <w:tcW w:type="dxa" w:w="2160"/>
+          </w:tcPr>
+          <w:p>
+            <w:r>
+              <w:t>mm</w:t>
+            </w:r>
+          </w:p>
+        </w:tc>
+        <w:tc>
+          <w:tcPr>
+            <w:tcW w:type="dxa" w:w="2160"/>
+          </w:tcPr>
+          <w:p>
+            <w:r>
+              <w:t>Masa (kg/m)</w:t>
+            </w:r>
+          </w:p>
+        </w:tc>
+      </w:tr>
+      <w:tr>
+        <w:tc>
+          <w:tcPr>
+            <w:tcW w:type="dxa" w:w="2160"/>
+          </w:tcPr>
+          <w:p>
+            <w:r>
+              <w:rPr>
+                <w:sz w:val="19"/>
+              </w:rPr>
+              <w:t>N°2</w:t>
+            </w:r>
+          </w:p>
+        </w:tc>
+        <w:tc>
+          <w:tcPr>
+            <w:tcW w:type="dxa" w:w="2160"/>
+          </w:tcPr>
+          <w:p>
+            <w:r>
+              <w:rPr>
+                <w:sz w:val="19"/>
+              </w:rPr>
+              <w:t>1/4"</w:t>
+            </w:r>
+          </w:p>
+        </w:tc>
+        <w:tc>
+          <w:tcPr>
+            <w:tcW w:type="dxa" w:w="2160"/>
+          </w:tcPr>
+          <w:p>
+            <w:r>
+              <w:rPr>
+                <w:sz w:val="19"/>
+              </w:rPr>
+              <w:t>6.4</w:t>
+            </w:r>
+          </w:p>
+        </w:tc>
+        <w:tc>
+          <w:tcPr>
+            <w:tcW w:type="dxa" w:w="2160"/>
+          </w:tcPr>
+          <w:p>
+            <w:r>
+              <w:rPr>
+                <w:sz w:val="19"/>
+              </w:rPr>
+              <w:t>0.250</w:t>
+            </w:r>
+          </w:p>
+        </w:tc>
+      </w:tr>
+      <w:tr>
+        <w:tc>
+          <w:tcPr>
+            <w:tcW w:type="dxa" w:w="2160"/>
+          </w:tcPr>
+          <w:p>
+            <w:r>
+              <w:rPr>
+                <w:sz w:val="19"/>
+              </w:rPr>
+              <w:t>N°3</w:t>
+            </w:r>
+          </w:p>
+        </w:tc>
+        <w:tc>
+          <w:tcPr>
+            <w:tcW w:type="dxa" w:w="2160"/>
+          </w:tcPr>
+          <w:p>
+            <w:r>
+              <w:rPr>
+                <w:sz w:val="19"/>
+              </w:rPr>
+              <w:t>3/8"</w:t>
+            </w:r>
+          </w:p>
+        </w:tc>
+        <w:tc>
+          <w:tcPr>
+            <w:tcW w:type="dxa" w:w="2160"/>
+          </w:tcPr>
+          <w:p>
+            <w:r>
+              <w:rPr>
+                <w:sz w:val="19"/>
+              </w:rPr>
+              <w:t>9.5</w:t>
+            </w:r>
+          </w:p>
+        </w:tc>
+        <w:tc>
+          <w:tcPr>
+            <w:tcW w:type="dxa" w:w="2160"/>
+          </w:tcPr>
+          <w:p>
+            <w:r>
+              <w:rPr>
+                <w:sz w:val="19"/>
+              </w:rPr>
+              <w:t>0.560</w:t>
+            </w:r>
+          </w:p>
+        </w:tc>
+      </w:tr>
+      <w:tr>
+        <w:tc>
+          <w:tcPr>
+            <w:tcW w:type="dxa" w:w="2160"/>
+          </w:tcPr>
+          <w:p>
+            <w:r>
+              <w:rPr>
+                <w:sz w:val="19"/>
+              </w:rPr>
+              <w:t>N°4</w:t>
+            </w:r>
+          </w:p>
+        </w:tc>
+        <w:tc>
+          <w:tcPr>
+            <w:tcW w:type="dxa" w:w="2160"/>
+          </w:tcPr>
+          <w:p>
+            <w:r>
+              <w:rPr>
+                <w:sz w:val="19"/>
+              </w:rPr>
+              <w:t>1/2"</w:t>
+            </w:r>
+          </w:p>
+        </w:tc>
+        <w:tc>
+          <w:tcPr>
+            <w:tcW w:type="dxa" w:w="2160"/>
+          </w:tcPr>
+          <w:p>
+            <w:r>
+              <w:rPr>
+                <w:sz w:val="19"/>
+              </w:rPr>
+              <w:t>12.7</w:t>
+            </w:r>
+          </w:p>
+        </w:tc>
+        <w:tc>
+          <w:tcPr>
+            <w:tcW w:type="dxa" w:w="2160"/>
+          </w:tcPr>
+          <w:p>
+            <w:r>
+              <w:rPr>
+                <w:sz w:val="19"/>
+              </w:rPr>
+              <w:t>0.994</w:t>
+            </w:r>
+          </w:p>
+        </w:tc>
+      </w:tr>
+      <w:tr>
+        <w:tc>
+          <w:tcPr>
+            <w:tcW w:type="dxa" w:w="2160"/>
+          </w:tcPr>
+          <w:p>
+            <w:r>
+              <w:rPr>
+                <w:sz w:val="19"/>
+              </w:rPr>
+              <w:t>N°5</w:t>
+            </w:r>
+          </w:p>
+        </w:tc>
+        <w:tc>
+          <w:tcPr>
+            <w:tcW w:type="dxa" w:w="2160"/>
+          </w:tcPr>
+          <w:p>
+            <w:r>
+              <w:rPr>
+                <w:sz w:val="19"/>
+              </w:rPr>
+              <w:t>5/8"</w:t>
+            </w:r>
+          </w:p>
+        </w:tc>
+        <w:tc>
+          <w:tcPr>
+            <w:tcW w:type="dxa" w:w="2160"/>
+          </w:tcPr>
+          <w:p>
+            <w:r>
+              <w:rPr>
+                <w:sz w:val="19"/>
+              </w:rPr>
+              <w:t>15.9</w:t>
+            </w:r>
+          </w:p>
+        </w:tc>
+        <w:tc>
+          <w:tcPr>
+            <w:tcW w:type="dxa" w:w="2160"/>
+          </w:tcPr>
+          <w:p>
+            <w:r>
+              <w:rPr>
+                <w:sz w:val="19"/>
+              </w:rPr>
+              <w:t>1.552</w:t>
+            </w:r>
+          </w:p>
+        </w:tc>
+      </w:tr>
+      <w:tr>
+        <w:tc>
+          <w:tcPr>
+            <w:tcW w:type="dxa" w:w="2160"/>
+          </w:tcPr>
+          <w:p>
+            <w:r>
+              <w:rPr>
+                <w:sz w:val="19"/>
+              </w:rPr>
+              <w:t>N°6</w:t>
+            </w:r>
+          </w:p>
+        </w:tc>
+        <w:tc>
+          <w:tcPr>
+            <w:tcW w:type="dxa" w:w="2160"/>
+          </w:tcPr>
+          <w:p>
+            <w:r>
+              <w:rPr>
+                <w:sz w:val="19"/>
+              </w:rPr>
+              <w:t>3/4"</w:t>
+            </w:r>
+          </w:p>
+        </w:tc>
+        <w:tc>
+          <w:tcPr>
+            <w:tcW w:type="dxa" w:w="2160"/>
+          </w:tcPr>
+          <w:p>
+            <w:r>
+              <w:rPr>
+                <w:sz w:val="19"/>
+              </w:rPr>
+              <w:t>19.1</w:t>
+            </w:r>
+          </w:p>
+        </w:tc>
+        <w:tc>
+          <w:tcPr>
+            <w:tcW w:type="dxa" w:w="2160"/>
+          </w:tcPr>
+          <w:p>
+            <w:r>
+              <w:rPr>
+                <w:sz w:val="19"/>
+              </w:rPr>
+              <w:t>2.235</w:t>
+            </w:r>
+          </w:p>
+        </w:tc>
+      </w:tr>
+      <w:tr>
+        <w:tc>
+          <w:tcPr>
+            <w:tcW w:type="dxa" w:w="2160"/>
+          </w:tcPr>
+          <w:p>
+            <w:r>
+              <w:rPr>
+                <w:sz w:val="19"/>
+              </w:rPr>
+              <w:t>N°7</w:t>
+            </w:r>
+          </w:p>
+        </w:tc>
+        <w:tc>
+          <w:tcPr>
+            <w:tcW w:type="dxa" w:w="2160"/>
+          </w:tcPr>
+          <w:p>
+            <w:r>
+              <w:rPr>
+                <w:sz w:val="19"/>
+              </w:rPr>
+              <w:t>7/8"</w:t>
+            </w:r>
+          </w:p>
+        </w:tc>
+        <w:tc>
+          <w:tcPr>
+            <w:tcW w:type="dxa" w:w="2160"/>
+          </w:tcPr>
+          <w:p>
+            <w:r>
+              <w:rPr>
+                <w:sz w:val="19"/>
+              </w:rPr>
+              <w:t>22.2</w:t>
+            </w:r>
+          </w:p>
+        </w:tc>
+        <w:tc>
+          <w:tcPr>
+            <w:tcW w:type="dxa" w:w="2160"/>
+          </w:tcPr>
+          <w:p>
+            <w:r>
+              <w:rPr>
+                <w:sz w:val="19"/>
+              </w:rPr>
+              <w:t>3.042</w:t>
+            </w:r>
+          </w:p>
+        </w:tc>
+      </w:tr>
+      <w:tr>
+        <w:tc>
+          <w:tcPr>
+            <w:tcW w:type="dxa" w:w="2160"/>
+          </w:tcPr>
+          <w:p>
+            <w:r>
+              <w:rPr>
+                <w:sz w:val="19"/>
+              </w:rPr>
+              <w:t>N°8</w:t>
+            </w:r>
+          </w:p>
+        </w:tc>
+        <w:tc>
+          <w:tcPr>
+            <w:tcW w:type="dxa" w:w="2160"/>
+          </w:tcPr>
+          <w:p>
+            <w:r>
+              <w:rPr>
+                <w:sz w:val="19"/>
+              </w:rPr>
+              <w:t>1"</w:t>
+            </w:r>
+          </w:p>
+        </w:tc>
+        <w:tc>
+          <w:tcPr>
+            <w:tcW w:type="dxa" w:w="2160"/>
+          </w:tcPr>
+          <w:p>
+            <w:r>
+              <w:rPr>
+                <w:sz w:val="19"/>
+              </w:rPr>
+              <w:t>25.4</w:t>
+            </w:r>
+          </w:p>
+        </w:tc>
+        <w:tc>
+          <w:tcPr>
+            <w:tcW w:type="dxa" w:w="2160"/>
+          </w:tcPr>
+          <w:p>
+            <w:r>
+              <w:rPr>
+                <w:sz w:val="19"/>
+              </w:rPr>
+              <w:t>3.973</w:t>
+            </w:r>
+          </w:p>
+        </w:tc>
+      </w:tr>
+    </w:tbl>
+    <w:p>
+      <w:pPr>
+        <w:spacing w:after="120"/>
+      </w:pPr>
+      <w:r>
+        <w:rPr>
+          <w:b w:val="0"/>
+          <w:i/>
+          <w:color w:val="404040"/>
+          <w:sz w:val="20"/>
+        </w:rPr>
+        <w:t>Ejemplo (columnas Tipo 1): 4 columnas × 6 barras N°6 × 5.85 m = 140.4 m de N°6; 140.4 × 2.235 kg/m = 313.8 kg solo en el longitudinal de ese tipo.</w:t>
       </w:r>
     </w:p>
     <w:p>
@@ -3812,7 +4313,7 @@
               <w:rPr>
                 <w:sz w:val="20"/>
               </w:rPr>
-              <w:t>3#6 + 3#5 longitudinal</w:t>
+              <w:t>Longitudinal #6 = 236.7 m</w:t>
             </w:r>
           </w:p>
         </w:tc>
@@ -3825,7 +4326,7 @@
               <w:rPr>
                 <w:sz w:val="20"/>
               </w:rPr>
-              <w:t>Despiece de las vigas de cimentación.</w:t>
+              <w:t>3#6 por viga (VC-1..4, 3') + VC-A/B: 3#6 L=7.60 y 7.40; L de cada barra del despiece.</w:t>
             </w:r>
           </w:p>
         </w:tc>
@@ -3840,7 +4341,7 @@
               <w:rPr>
                 <w:sz w:val="20"/>
               </w:rPr>
-              <w:t>Estribos #3 c/0.20</w:t>
+              <w:t>Longitudinal #5 = 276.2 m</w:t>
             </w:r>
           </w:p>
         </w:tc>
@@ -3853,7 +4354,7 @@
               <w:rPr>
                 <w:sz w:val="20"/>
               </w:rPr>
-              <w:t>Del plano.</w:t>
+              <w:t>3#5 por viga transversal + VC-A/B: 3#5, 2#5, 1#5 (bastones); L del despiece.</w:t>
             </w:r>
           </w:p>
         </w:tc>
@@ -3868,7 +4369,7 @@
               <w:rPr>
                 <w:sz w:val="20"/>
               </w:rPr>
-              <w:t>Peso lineal</w:t>
+              <w:t>Estribos #3 = 565.6 m</w:t>
             </w:r>
           </w:p>
         </w:tc>
@@ -3881,7 +4382,35 @@
               <w:rPr>
                 <w:sz w:val="20"/>
               </w:rPr>
-              <w:t>#6=2.235 ; #5=1.552 ; #3=0.559 kg/m.</w:t>
+              <w:t>Transversales: 5×36 estribos L=1.58; longitudinales: 2×89 estribos L=1.58.</w:t>
+            </w:r>
+          </w:p>
+        </w:tc>
+      </w:tr>
+      <w:tr>
+        <w:tc>
+          <w:tcPr>
+            <w:tcW w:type="dxa" w:w="4320"/>
+          </w:tcPr>
+          <w:p>
+            <w:r>
+              <w:rPr>
+                <w:sz w:val="20"/>
+              </w:rPr>
+              <w:t>Peso lineal (kg/m)</w:t>
+            </w:r>
+          </w:p>
+        </w:tc>
+        <w:tc>
+          <w:tcPr>
+            <w:tcW w:type="dxa" w:w="4320"/>
+          </w:tcPr>
+          <w:p>
+            <w:r>
+              <w:rPr>
+                <w:sz w:val="20"/>
+              </w:rPr>
+              <w:t>#6=2.235 ; #5=1.552 ; #3=0.560 (tabla de masas de varilla).</w:t>
             </w:r>
           </w:p>
         </w:tc>
@@ -3947,7 +4476,7 @@
           <w:color w:val="1F3B73"/>
           <w:sz w:val="23"/>
         </w:rPr>
-        <w:t>864.6 kg (long.) + 319.6 kg (estribos) = 1 184.2 kg × 1.10</w:t>
+        <w:t>Long: 236.7×2.235 + 276.2×1.552 = 957.7 kg ; Estribos: 565.6×0.560 = 316.8 kg ; (957.7+316.8) × 1.10</w:t>
       </w:r>
     </w:p>
     <w:p>
@@ -3957,7 +4486,7 @@
           <w:color w:val="006600"/>
           <w:sz w:val="23"/>
         </w:rPr>
-        <w:t>➜ Resultado: 1 302.6 kg</w:t>
+        <w:t>➜ Resultado: 1 401.9 kg</w:t>
       </w:r>
     </w:p>
     <w:p>
@@ -3971,7 +4500,7 @@
           <w:color w:val="B06000"/>
           <w:sz w:val="20"/>
         </w:rPr>
-        <w:t>Observación: El valor exacto debe salir de la cartilla de hierros (DLNET).</w:t>
+        <w:t>Observación: RECALCULADO por peso con la tabla de masas (L de cada calibre × kg/m + 10%). VC-3 se asume igual a VC-2.</w:t>
       </w:r>
     </w:p>
     <w:p>
@@ -3985,7 +4514,7 @@
           <w:color w:val="404040"/>
           <w:sz w:val="20"/>
         </w:rPr>
-        <w:t>Foto de referencia para el formato: Figura 3.1 (despiece de vigas).</w:t>
+        <w:t>Foto de referencia para el formato: Figura 3.1 (despiece de vigas VC-1..4, 3', A, B).</w:t>
       </w:r>
     </w:p>
     <w:p>
@@ -4068,7 +4597,7 @@
               <w:rPr>
                 <w:sz w:val="20"/>
               </w:rPr>
-              <w:t>Z-1 (×4) y Z-2 (×4)</w:t>
+              <w:t>Z-1 (×4) 2.30×2.30</w:t>
             </w:r>
           </w:p>
         </w:tc>
@@ -4081,7 +4610,63 @@
               <w:rPr>
                 <w:sz w:val="20"/>
               </w:rPr>
-              <w:t>Parrilla #5 @0.20 en ambas direcciones (del cuadro de zapatas).</w:t>
+              <w:t>Parrilla #5 @0.20 en 2 sentidos. n=lado/0.20+1=12 barras/sentido; L=lado−0.15=2.15 m.</w:t>
+            </w:r>
+          </w:p>
+        </w:tc>
+      </w:tr>
+      <w:tr>
+        <w:tc>
+          <w:tcPr>
+            <w:tcW w:type="dxa" w:w="4320"/>
+          </w:tcPr>
+          <w:p>
+            <w:r>
+              <w:rPr>
+                <w:sz w:val="20"/>
+              </w:rPr>
+              <w:t>Z-2 (×4) 2.15×2.15</w:t>
+            </w:r>
+          </w:p>
+        </w:tc>
+        <w:tc>
+          <w:tcPr>
+            <w:tcW w:type="dxa" w:w="4320"/>
+          </w:tcPr>
+          <w:p>
+            <w:r>
+              <w:rPr>
+                <w:sz w:val="20"/>
+              </w:rPr>
+              <w:t>Parrilla #5 @0.20 en 2 sentidos. n=11 barras/sentido; L=2.00 m.</w:t>
+            </w:r>
+          </w:p>
+        </w:tc>
+      </w:tr>
+      <w:tr>
+        <w:tc>
+          <w:tcPr>
+            <w:tcW w:type="dxa" w:w="4320"/>
+          </w:tcPr>
+          <w:p>
+            <w:r>
+              <w:rPr>
+                <w:sz w:val="20"/>
+              </w:rPr>
+              <w:t>Peso lineal #5 = 1.552 kg/m</w:t>
+            </w:r>
+          </w:p>
+        </w:tc>
+        <w:tc>
+          <w:tcPr>
+            <w:tcW w:type="dxa" w:w="4320"/>
+          </w:tcPr>
+          <w:p>
+            <w:r>
+              <w:rPr>
+                <w:sz w:val="20"/>
+              </w:rPr>
+              <w:t>Tabla de masas de varilla.</w:t>
             </w:r>
           </w:p>
         </w:tc>
@@ -4147,7 +4732,7 @@
           <w:color w:val="1F3B73"/>
           <w:sz w:val="23"/>
         </w:rPr>
-        <w:t>≈ 327.8 kg (Z-1) + 280.0 kg (Z-2) = 607.8 kg × 1.10</w:t>
+        <w:t>382.4 m de #5 × 1.552 = 593.5 kg × 1.10</w:t>
       </w:r>
     </w:p>
     <w:p>
@@ -4157,7 +4742,7 @@
           <w:color w:val="006600"/>
           <w:sz w:val="23"/>
         </w:rPr>
-        <w:t>➜ Resultado: ≈ 668.6 kg (estimación)</w:t>
+        <w:t>➜ Resultado: 652.8 kg</w:t>
       </w:r>
     </w:p>
     <w:p>
@@ -4171,7 +4756,7 @@
           <w:color w:val="B06000"/>
           <w:sz w:val="20"/>
         </w:rPr>
-        <w:t>Observación: AGREGADO (estimación): el peso exacto sale de la cartilla de hierros. Falta la línea 2.3.2 en el presupuesto.</w:t>
+        <w:t>Observación: RECALCULADO por peso con la tabla de masas. Confirmar lados exactos de zapata en el DWG. Falta la línea 2.3.2 en el presupuesto.</w:t>
       </w:r>
     </w:p>
     <w:p>
@@ -5290,7 +5875,7 @@
               <w:rPr>
                 <w:sz w:val="20"/>
               </w:rPr>
-              <w:t>Tipo 1: 4 col × 6#6, L=5.85</w:t>
+              <w:t>Tipo 1 (×4): 6#6 L=5.85</w:t>
             </w:r>
           </w:p>
         </w:tc>
@@ -5303,7 +5888,7 @@
               <w:rPr>
                 <w:sz w:val="20"/>
               </w:rPr>
-              <w:t>Refuerzo longitudinal columnas 0.40×0.40.</w:t>
+              <w:t>Longitudinal 0.40×0.40 → 4×6×5.85 = 140.4 m de #6.</w:t>
             </w:r>
           </w:p>
         </w:tc>
@@ -5318,7 +5903,7 @@
               <w:rPr>
                 <w:sz w:val="20"/>
               </w:rPr>
-              <w:t>Tipo 2: 4 col × (4#6+4#7), L=5.95</w:t>
+              <w:t>Tipo 2 (×4): 4#6+4#7 L=5.95</w:t>
             </w:r>
           </w:p>
         </w:tc>
@@ -5331,7 +5916,7 @@
               <w:rPr>
                 <w:sz w:val="20"/>
               </w:rPr>
-              <w:t>Refuerzo longitudinal columnas 0.50×0.50.</w:t>
+              <w:t>Longitudinal 0.50×0.50 → 95.2 m de #6 y 95.2 m de #7.</w:t>
             </w:r>
           </w:p>
         </w:tc>
@@ -5346,7 +5931,7 @@
               <w:rPr>
                 <w:sz w:val="20"/>
               </w:rPr>
-              <w:t>Estribos + 10 %</w:t>
+              <w:t>Estribos #3 = 762.7 m</w:t>
             </w:r>
           </w:p>
         </w:tc>
@@ -5359,7 +5944,63 @@
               <w:rPr>
                 <w:sz w:val="20"/>
               </w:rPr>
-              <w:t>Confinamiento y desperdicio.</w:t>
+              <w:t>T1: 42 est. L=1.48 + 42 grapas L=0.54; T2: 42 est. L=1.88 + 42 grapas L=0.64; ×4 c/tipo.</w:t>
+            </w:r>
+          </w:p>
+        </w:tc>
+      </w:tr>
+      <w:tr>
+        <w:tc>
+          <w:tcPr>
+            <w:tcW w:type="dxa" w:w="4320"/>
+          </w:tcPr>
+          <w:p>
+            <w:r>
+              <w:rPr>
+                <w:sz w:val="20"/>
+              </w:rPr>
+              <w:t>Peso lineal (kg/m)</w:t>
+            </w:r>
+          </w:p>
+        </w:tc>
+        <w:tc>
+          <w:tcPr>
+            <w:tcW w:type="dxa" w:w="4320"/>
+          </w:tcPr>
+          <w:p>
+            <w:r>
+              <w:rPr>
+                <w:sz w:val="20"/>
+              </w:rPr>
+              <w:t>#6=2.235 ; #7=3.042 ; #3=0.560 (tabla de masas).</w:t>
+            </w:r>
+          </w:p>
+        </w:tc>
+      </w:tr>
+      <w:tr>
+        <w:tc>
+          <w:tcPr>
+            <w:tcW w:type="dxa" w:w="4320"/>
+          </w:tcPr>
+          <w:p>
+            <w:r>
+              <w:rPr>
+                <w:sz w:val="20"/>
+              </w:rPr>
+              <w:t>+10 %</w:t>
+            </w:r>
+          </w:p>
+        </w:tc>
+        <w:tc>
+          <w:tcPr>
+            <w:tcW w:type="dxa" w:w="4320"/>
+          </w:tcPr>
+          <w:p>
+            <w:r>
+              <w:rPr>
+                <w:sz w:val="20"/>
+              </w:rPr>
+              <w:t>Desperdicio y traslapos.</w:t>
             </w:r>
           </w:p>
         </w:tc>
@@ -5397,7 +6038,7 @@
           <w:color w:val="1F3B73"/>
           <w:sz w:val="23"/>
         </w:rPr>
-        <w:t>Estimación con +10 % (ver cartilla de hierros)</w:t>
+        <w:t>Long: 235.6×2.235 + 95.2×3.042 = 816.2 kg ; Estribos: 762.7×0.560 = 427.1 kg ; (816.2+427.1) × 1.10</w:t>
       </w:r>
     </w:p>
     <w:p>
@@ -5407,7 +6048,7 @@
           <w:color w:val="006600"/>
           <w:sz w:val="23"/>
         </w:rPr>
-        <w:t>➜ Resultado: ≈ 791.8 kg (recalcular en cartilla)</w:t>
+        <w:t>➜ Resultado: 1 367.6 kg</w:t>
       </w:r>
     </w:p>
     <w:p>
@@ -5421,7 +6062,7 @@
           <w:color w:val="B06000"/>
           <w:sz w:val="20"/>
         </w:rPr>
-        <w:t>Observación: CORREGIDO en descripción: el refuerzo difiere por tipo (Tipo1 6#6; Tipo2 4#6+4#7) y son 8 columnas. El kg exacto sale de la cartilla de hierros (DLNET).</w:t>
+        <w:t>Observación: RECALCULADO por peso con la tabla de masas. Antes era una estimación (≈791.8 kg); ahora se cuenta cada barra del despiece (6#6 en T1; 4#6+4#7 en T2) más estribos y grapas.</w:t>
       </w:r>
     </w:p>
     <w:p>
@@ -5435,7 +6076,7 @@
           <w:color w:val="404040"/>
           <w:sz w:val="20"/>
         </w:rPr>
-        <w:t>Foto de referencia para el formato: Figura 3.2 y recortes del despiece.</w:t>
+        <w:t>Foto de referencia para el formato: Figura 3.2 y recortes del despiece (crop_col_det1 y det2).</w:t>
       </w:r>
     </w:p>
     <w:p>
@@ -5518,7 +6159,7 @@
               <w:rPr>
                 <w:sz w:val="20"/>
               </w:rPr>
-              <w:t>2#6 + 2#7 + 2#6 longitudinal</w:t>
+              <w:t>Longitudinal #5 = 252.8 m</w:t>
             </w:r>
           </w:p>
         </w:tc>
@@ -5531,7 +6172,7 @@
               <w:rPr>
                 <w:sz w:val="20"/>
               </w:rPr>
-              <w:t>Despiece de las vigas de cubierta.</w:t>
+              <w:t>Bastones y corridos #5 de VG-1..4 (2#5) y VG-6/7 (3#5); L del despiece.</w:t>
             </w:r>
           </w:p>
         </w:tc>
@@ -5546,7 +6187,7 @@
               <w:rPr>
                 <w:sz w:val="20"/>
               </w:rPr>
-              <w:t>Estribos #3 c/0.15</w:t>
+              <w:t>Longitudinal #6 = 196.6 m</w:t>
             </w:r>
           </w:p>
         </w:tc>
@@ -5559,7 +6200,63 @@
               <w:rPr>
                 <w:sz w:val="20"/>
               </w:rPr>
-              <w:t>Del plano.</w:t>
+              <w:t>2#6 en VG-1..4 y 3#6 en VG-6/7; L del despiece.</w:t>
+            </w:r>
+          </w:p>
+        </w:tc>
+      </w:tr>
+      <w:tr>
+        <w:tc>
+          <w:tcPr>
+            <w:tcW w:type="dxa" w:w="4320"/>
+          </w:tcPr>
+          <w:p>
+            <w:r>
+              <w:rPr>
+                <w:sz w:val="20"/>
+              </w:rPr>
+              <w:t>Estribos #3 = 1 102.1 m</w:t>
+            </w:r>
+          </w:p>
+        </w:tc>
+        <w:tc>
+          <w:tcPr>
+            <w:tcW w:type="dxa" w:w="4320"/>
+          </w:tcPr>
+          <w:p>
+            <w:r>
+              <w:rPr>
+                <w:sz w:val="20"/>
+              </w:rPr>
+              <w:t>Transversales: 4×73 est. L=1.68; longitudinales: 2×182 est. L=1.68.</w:t>
+            </w:r>
+          </w:p>
+        </w:tc>
+      </w:tr>
+      <w:tr>
+        <w:tc>
+          <w:tcPr>
+            <w:tcW w:type="dxa" w:w="4320"/>
+          </w:tcPr>
+          <w:p>
+            <w:r>
+              <w:rPr>
+                <w:sz w:val="20"/>
+              </w:rPr>
+              <w:t>Peso lineal (kg/m)</w:t>
+            </w:r>
+          </w:p>
+        </w:tc>
+        <w:tc>
+          <w:tcPr>
+            <w:tcW w:type="dxa" w:w="4320"/>
+          </w:tcPr>
+          <w:p>
+            <w:r>
+              <w:rPr>
+                <w:sz w:val="20"/>
+              </w:rPr>
+              <w:t>#5=1.552 ; #6=2.235 ; #3=0.560 (tabla de masas).</w:t>
             </w:r>
           </w:p>
         </w:tc>
@@ -5625,7 +6322,7 @@
           <w:color w:val="1F3B73"/>
           <w:sz w:val="23"/>
         </w:rPr>
-        <w:t>1 143.3 kg (long.) + 454.6 kg (estribos) = 1 597.9 kg × 1.10</w:t>
+        <w:t>Long: 252.8×1.552 + 196.6×2.235 = 831.7 kg ; Estribos: 1102.1×0.560 = 617.2 kg ; (831.7+617.2) × 1.10</w:t>
       </w:r>
     </w:p>
     <w:p>
@@ -5635,7 +6332,7 @@
           <w:color w:val="006600"/>
           <w:sz w:val="23"/>
         </w:rPr>
-        <w:t>➜ Resultado: 1 757.7 kg</w:t>
+        <w:t>➜ Resultado: 1 593.8 kg</w:t>
       </w:r>
     </w:p>
     <w:p>
@@ -5649,7 +6346,7 @@
           <w:color w:val="B06000"/>
           <w:sz w:val="20"/>
         </w:rPr>
-        <w:t>Observación: Valor exacto desde la cartilla de hierros.</w:t>
+        <w:t>Observación: RECALCULADO por peso con la tabla de masas. NO incluye las viguetas de la placa aligerada (6 uds 0.20×0.40 con #4 y estribos #3 ≈ 1 689 kg): esas se contabilizan con la placa de cubierta si el APU lo pide.</w:t>
       </w:r>
     </w:p>
     <w:p>
@@ -5663,7 +6360,7 @@
           <w:color w:val="404040"/>
           <w:sz w:val="20"/>
         </w:rPr>
-        <w:t>Foto de referencia para el formato: Figura 3.3 (despiece de vigas).</w:t>
+        <w:t>Foto de referencia para el formato: Figura 3.3 (despiece VG-1..4 y VG-6/VG-7).</w:t>
       </w:r>
     </w:p>
     <w:p>
@@ -6458,7 +7155,7 @@
               <w:rPr>
                 <w:sz w:val="20"/>
               </w:rPr>
-              <w:t>4#3 longitudinal</w:t>
+              <w:t>Columnetas 2#4 (0.20×0.15)</w:t>
             </w:r>
           </w:p>
         </w:tc>
@@ -6471,7 +7168,7 @@
               <w:rPr>
                 <w:sz w:val="20"/>
               </w:rPr>
-              <w:t>Columnetas y vigas de confinamiento.</w:t>
+              <w:t>Del detalle de columneta: 2 N°4 verticales + estribo N°3 c/0.20. Estimado 24 uds h=2.70.</w:t>
             </w:r>
           </w:p>
         </w:tc>
@@ -6486,7 +7183,7 @@
               <w:rPr>
                 <w:sz w:val="20"/>
               </w:rPr>
-              <w:t>Estribos #2 c/0.20</w:t>
+              <w:t>Cinta V2: 2#3 + gancho N°2 (1/4") c/0.30</w:t>
             </w:r>
           </w:p>
         </w:tc>
@@ -6499,7 +7196,35 @@
               <w:rPr>
                 <w:sz w:val="20"/>
               </w:rPr>
-              <w:t>Del detalle.</w:t>
+              <w:t>Del detalle de viga cinta. Estimado 70 m de cinta.</w:t>
+            </w:r>
+          </w:p>
+        </w:tc>
+      </w:tr>
+      <w:tr>
+        <w:tc>
+          <w:tcPr>
+            <w:tcW w:type="dxa" w:w="4320"/>
+          </w:tcPr>
+          <w:p>
+            <w:r>
+              <w:rPr>
+                <w:sz w:val="20"/>
+              </w:rPr>
+              <w:t>Peso lineal (kg/m)</w:t>
+            </w:r>
+          </w:p>
+        </w:tc>
+        <w:tc>
+          <w:tcPr>
+            <w:tcW w:type="dxa" w:w="4320"/>
+          </w:tcPr>
+          <w:p>
+            <w:r>
+              <w:rPr>
+                <w:sz w:val="20"/>
+              </w:rPr>
+              <w:t>#4=0.994 ; #3=0.560 ; #2=0.250 (tabla de masas).</w:t>
             </w:r>
           </w:p>
         </w:tc>
@@ -6565,7 +7290,7 @@
           <w:color w:val="1F3B73"/>
           <w:sz w:val="23"/>
         </w:rPr>
-        <w:t>376.8 kg (long.) + 105.1 kg (estribos) = 481.9 kg × 1.10</w:t>
+        <w:t>Long: 207.2 kg ; Estribos+ganchos: 133.3 kg ; (207.2+133.3) × 1.10</w:t>
       </w:r>
     </w:p>
     <w:p>
@@ -6575,7 +7300,7 @@
           <w:color w:val="006600"/>
           <w:sz w:val="23"/>
         </w:rPr>
-        <w:t>➜ Resultado: 530.1 kg</w:t>
+        <w:t>➜ Resultado: 374.6 kg (estimación)</w:t>
       </w:r>
     </w:p>
     <w:p>
@@ -6589,7 +7314,7 @@
           <w:color w:val="B06000"/>
           <w:sz w:val="20"/>
         </w:rPr>
-        <w:t>Observación: Valor exacto desde la cartilla de hierros.</w:t>
+        <w:t>Observación: ESTIMACIÓN por peso con la tabla de masas usando el detalle real (columneta 2#4+est.#3; cinta 2#3+gancho#2). Las cantidades (n° de columnetas y metros de cinta) deben confirmarse en el plano de mampostería FC3.</w:t>
       </w:r>
     </w:p>
     <w:p>
@@ -6603,7 +7328,7 @@
           <w:color w:val="404040"/>
           <w:sz w:val="20"/>
         </w:rPr>
-        <w:t>Foto de referencia para el formato: Figura 3.4 (despiece de confinamiento).</w:t>
+        <w:t>Foto de referencia para el formato: Figura 3.4 (detalle de columneta y viga cinta V2).</w:t>
       </w:r>
     </w:p>
     <w:p>
@@ -7488,7 +8213,7 @@
               <w:rPr>
                 <w:sz w:val="18"/>
               </w:rPr>
-              <w:t>1 302.6</w:t>
+              <w:t>1 401.9</w:t>
             </w:r>
           </w:p>
         </w:tc>
@@ -7501,7 +8226,7 @@
               <w:rPr>
                 <w:sz w:val="18"/>
               </w:rPr>
-              <w:t>cartilla</w:t>
+              <w:t>RECALCULADO (tabla masas)</w:t>
             </w:r>
           </w:p>
         </w:tc>
@@ -7555,7 +8280,7 @@
               <w:rPr>
                 <w:sz w:val="18"/>
               </w:rPr>
-              <w:t>≈668.6</w:t>
+              <w:t>652.8</w:t>
             </w:r>
           </w:p>
         </w:tc>
@@ -7568,7 +8293,7 @@
               <w:rPr>
                 <w:sz w:val="18"/>
               </w:rPr>
-              <w:t>AGREGADO / cartilla</w:t>
+              <w:t>AGREGADO / RECALCULADO</w:t>
             </w:r>
           </w:p>
         </w:tc>
@@ -7890,7 +8615,7 @@
               <w:rPr>
                 <w:sz w:val="18"/>
               </w:rPr>
-              <w:t>≈791.8</w:t>
+              <w:t>1 367.6</w:t>
             </w:r>
           </w:p>
         </w:tc>
@@ -7903,7 +8628,7 @@
               <w:rPr>
                 <w:sz w:val="18"/>
               </w:rPr>
-              <w:t>cartilla / CORREGIDO</w:t>
+              <w:t>RECALCULADO (tabla masas)</w:t>
             </w:r>
           </w:p>
         </w:tc>
@@ -7957,7 +8682,7 @@
               <w:rPr>
                 <w:sz w:val="18"/>
               </w:rPr>
-              <w:t>1 757.7</w:t>
+              <w:t>1 593.8</w:t>
             </w:r>
           </w:p>
         </w:tc>
@@ -7970,7 +8695,7 @@
               <w:rPr>
                 <w:sz w:val="18"/>
               </w:rPr>
-              <w:t>cartilla</w:t>
+              <w:t>RECALCULADO (tabla masas)</w:t>
             </w:r>
           </w:p>
         </w:tc>
@@ -8225,7 +8950,7 @@
               <w:rPr>
                 <w:sz w:val="18"/>
               </w:rPr>
-              <w:t>530.1</w:t>
+              <w:t>374.6</w:t>
             </w:r>
           </w:p>
         </w:tc>
@@ -8238,7 +8963,7 @@
               <w:rPr>
                 <w:sz w:val="18"/>
               </w:rPr>
-              <w:t>cartilla</w:t>
+              <w:t>RECALCULADO (estimación)</w:t>
             </w:r>
           </w:p>
         </w:tc>

</xml_diff>